<commit_message>
pdf export for questionnaire / removed comments
</commit_message>
<xml_diff>
--- a/data/questionnaires/Fragebogen_final.docx
+++ b/data/questionnaires/Fragebogen_final.docx
@@ -1,6 +1,6 @@
 
 <file path=word/document.xml><?xml version="1.0" encoding="utf-8"?>
-<w:document xmlns:wpc="http://schemas.microsoft.com/office/word/2010/wordprocessingCanvas" xmlns:cx="http://schemas.microsoft.com/office/drawing/2014/chartex" xmlns:cx1="http://schemas.microsoft.com/office/drawing/2015/9/8/chartex" xmlns:cx2="http://schemas.microsoft.com/office/drawing/2015/10/21/chartex" xmlns:cx3="http://schemas.microsoft.com/office/drawing/2016/5/9/chartex" xmlns:cx4="http://schemas.microsoft.com/office/drawing/2016/5/10/chartex" xmlns:cx5="http://schemas.microsoft.com/office/drawing/2016/5/11/chartex" xmlns:cx6="http://schemas.microsoft.com/office/drawing/2016/5/12/chartex" xmlns:cx7="http://schemas.microsoft.com/office/drawing/2016/5/13/chartex" xmlns:cx8="http://schemas.microsoft.com/office/drawing/2016/5/14/chartex" xmlns:mc="http://schemas.openxmlformats.org/markup-compatibility/2006" xmlns:aink="http://schemas.microsoft.com/office/drawing/2016/ink" xmlns:am3d="http://schemas.microsoft.com/office/drawing/2017/model3d" xmlns:o="urn:schemas-microsoft-com:office:office" xmlns:r="http://schemas.openxmlformats.org/officeDocument/2006/relationships" xmlns:m="http://schemas.openxmlformats.org/officeDocument/2006/math" xmlns:v="urn:schemas-microsoft-com:vml" xmlns:wp14="http://schemas.microsoft.com/office/word/2010/wordprocessingDrawing" xmlns:wp="http://schemas.openxmlformats.org/drawingml/2006/wordprocessingDrawing" xmlns:w10="urn:schemas-microsoft-com:office:word" xmlns:w="http://schemas.openxmlformats.org/wordprocessingml/2006/main" xmlns:w14="http://schemas.microsoft.com/office/word/2010/wordml" xmlns:w15="http://schemas.microsoft.com/office/word/2012/wordml" xmlns:w16cex="http://schemas.microsoft.com/office/word/2018/wordml/cex" xmlns:w16cid="http://schemas.microsoft.com/office/word/2016/wordml/cid" xmlns:w16="http://schemas.microsoft.com/office/word/2018/wordml" xmlns:w16se="http://schemas.microsoft.com/office/word/2015/wordml/symex" xmlns:wpg="http://schemas.microsoft.com/office/word/2010/wordprocessingGroup" xmlns:wpi="http://schemas.microsoft.com/office/word/2010/wordprocessingInk" xmlns:wne="http://schemas.microsoft.com/office/word/2006/wordml" xmlns:wps="http://schemas.microsoft.com/office/word/2010/wordprocessingShape" mc:Ignorable="w14 w15 w16se w16cid w16 w16cex wp14">
+<w:document xmlns:wpc="http://schemas.microsoft.com/office/word/2010/wordprocessingCanvas" xmlns:cx="http://schemas.microsoft.com/office/drawing/2014/chartex" xmlns:cx1="http://schemas.microsoft.com/office/drawing/2015/9/8/chartex" xmlns:cx2="http://schemas.microsoft.com/office/drawing/2015/10/21/chartex" xmlns:cx3="http://schemas.microsoft.com/office/drawing/2016/5/9/chartex" xmlns:cx4="http://schemas.microsoft.com/office/drawing/2016/5/10/chartex" xmlns:cx5="http://schemas.microsoft.com/office/drawing/2016/5/11/chartex" xmlns:cx6="http://schemas.microsoft.com/office/drawing/2016/5/12/chartex" xmlns:cx7="http://schemas.microsoft.com/office/drawing/2016/5/13/chartex" xmlns:cx8="http://schemas.microsoft.com/office/drawing/2016/5/14/chartex" xmlns:mc="http://schemas.openxmlformats.org/markup-compatibility/2006" xmlns:aink="http://schemas.microsoft.com/office/drawing/2016/ink" xmlns:am3d="http://schemas.microsoft.com/office/drawing/2017/model3d" xmlns:o="urn:schemas-microsoft-com:office:office" xmlns:oel="http://schemas.microsoft.com/office/2019/extlst" xmlns:r="http://schemas.openxmlformats.org/officeDocument/2006/relationships" xmlns:m="http://schemas.openxmlformats.org/officeDocument/2006/math" xmlns:v="urn:schemas-microsoft-com:vml" xmlns:wp14="http://schemas.microsoft.com/office/word/2010/wordprocessingDrawing" xmlns:wp="http://schemas.openxmlformats.org/drawingml/2006/wordprocessingDrawing" xmlns:w10="urn:schemas-microsoft-com:office:word" xmlns:w="http://schemas.openxmlformats.org/wordprocessingml/2006/main" xmlns:w14="http://schemas.microsoft.com/office/word/2010/wordml" xmlns:w15="http://schemas.microsoft.com/office/word/2012/wordml" xmlns:w16cex="http://schemas.microsoft.com/office/word/2018/wordml/cex" xmlns:w16cid="http://schemas.microsoft.com/office/word/2016/wordml/cid" xmlns:w16="http://schemas.microsoft.com/office/word/2018/wordml" xmlns:w16du="http://schemas.microsoft.com/office/word/2023/wordml/word16du" xmlns:w16sdtdh="http://schemas.microsoft.com/office/word/2020/wordml/sdtdatahash" xmlns:w16sdtfl="http://schemas.microsoft.com/office/word/2024/wordml/sdtformatlock" xmlns:w16se="http://schemas.microsoft.com/office/word/2015/wordml/symex" xmlns:wpg="http://schemas.microsoft.com/office/word/2010/wordprocessingGroup" xmlns:wpi="http://schemas.microsoft.com/office/word/2010/wordprocessingInk" xmlns:wne="http://schemas.microsoft.com/office/word/2006/wordml" xmlns:wps="http://schemas.microsoft.com/office/word/2010/wordprocessingShape" mc:Ignorable="w14 w15 w16se w16cid w16 w16cex w16sdtdh w16sdtfl w16du wp14">
   <w:body>
     <w:p>
       <w:pPr>
@@ -96,7 +96,6 @@
       </w:r>
     </w:p>
     <w:p>
-      <w:commentRangeStart w:id="0"/>
       <w:r>
         <w:t>Ziel der Evalu</w:t>
       </w:r>
@@ -116,13 +115,6 @@
       <w:proofErr w:type="gramEnd"/>
       <w:r>
         <w:t xml:space="preserve"> durch den Nutzer gesteuert werden kann, welche ergonomischen Aspekte dabei zu beachten sind und wie die allgemeine User Experience bei der Interaktion mit dem System bewertet wird.</w:t>
-      </w:r>
-      <w:commentRangeEnd w:id="0"/>
-      <w:r>
-        <w:rPr>
-          <w:rStyle w:val="Kommentarzeichen"/>
-        </w:rPr>
-        <w:commentReference w:id="0"/>
       </w:r>
     </w:p>
     <w:p>
@@ -822,12 +814,12 @@
     <w:p>
       <w:pPr>
         <w:sectPr>
-          <w:headerReference w:type="even" r:id="rId11"/>
-          <w:headerReference w:type="default" r:id="rId12"/>
-          <w:footerReference w:type="even" r:id="rId13"/>
-          <w:footerReference w:type="default" r:id="rId14"/>
-          <w:headerReference w:type="first" r:id="rId15"/>
-          <w:footerReference w:type="first" r:id="rId16"/>
+          <w:headerReference w:type="even" r:id="rId7"/>
+          <w:headerReference w:type="default" r:id="rId8"/>
+          <w:footerReference w:type="even" r:id="rId9"/>
+          <w:footerReference w:type="default" r:id="rId10"/>
+          <w:headerReference w:type="first" r:id="rId11"/>
+          <w:footerReference w:type="first" r:id="rId12"/>
           <w:pgSz w:w="11906" w:h="16838"/>
           <w:pgMar w:top="1417" w:right="1417" w:bottom="1134" w:left="1417" w:header="708" w:footer="708" w:gutter="0"/>
           <w:cols w:space="708"/>
@@ -1098,8 +1090,6 @@
       </w:r>
       <w:r>
         <w:tab/>
-      </w:r>
-      <w:r>
         <w:t>__________________</w:t>
       </w:r>
     </w:p>
@@ -1209,13 +1199,13 @@
                           </pic:cNvPicPr>
                         </pic:nvPicPr>
                         <pic:blipFill>
-                          <a:blip r:embed="rId17" cstate="print">
+                          <a:blip r:embed="rId13" cstate="print">
                             <a:extLst>
                               <a:ext uri="{28A0092B-C50C-407E-A947-70E740481C1C}">
                                 <a14:useLocalDpi xmlns:a14="http://schemas.microsoft.com/office/drawing/2010/main" val="0"/>
                               </a:ext>
                               <a:ext uri="{837473B0-CC2E-450A-ABE3-18F120FF3D39}">
-                                <a1611:picAttrSrcUrl xmlns:a1611="http://schemas.microsoft.com/office/drawing/2016/11/main" r:id="rId18"/>
+                                <a1611:picAttrSrcUrl xmlns:a1611="http://schemas.microsoft.com/office/drawing/2016/11/main" r:id="rId14"/>
                               </a:ext>
                             </a:extLst>
                           </a:blip>
@@ -1275,13 +1265,13 @@
                           </pic:cNvPicPr>
                         </pic:nvPicPr>
                         <pic:blipFill>
-                          <a:blip r:embed="rId17" cstate="print">
+                          <a:blip r:embed="rId13" cstate="print">
                             <a:extLst>
                               <a:ext uri="{28A0092B-C50C-407E-A947-70E740481C1C}">
                                 <a14:useLocalDpi xmlns:a14="http://schemas.microsoft.com/office/drawing/2010/main" val="0"/>
                               </a:ext>
                               <a:ext uri="{837473B0-CC2E-450A-ABE3-18F120FF3D39}">
-                                <a1611:picAttrSrcUrl xmlns:a1611="http://schemas.microsoft.com/office/drawing/2016/11/main" r:id="rId18"/>
+                                <a1611:picAttrSrcUrl xmlns:a1611="http://schemas.microsoft.com/office/drawing/2016/11/main" r:id="rId14"/>
                               </a:ext>
                             </a:extLst>
                           </a:blip>
@@ -1341,13 +1331,13 @@
                           </pic:cNvPicPr>
                         </pic:nvPicPr>
                         <pic:blipFill>
-                          <a:blip r:embed="rId17" cstate="print">
+                          <a:blip r:embed="rId13" cstate="print">
                             <a:extLst>
                               <a:ext uri="{28A0092B-C50C-407E-A947-70E740481C1C}">
                                 <a14:useLocalDpi xmlns:a14="http://schemas.microsoft.com/office/drawing/2010/main" val="0"/>
                               </a:ext>
                               <a:ext uri="{837473B0-CC2E-450A-ABE3-18F120FF3D39}">
-                                <a1611:picAttrSrcUrl xmlns:a1611="http://schemas.microsoft.com/office/drawing/2016/11/main" r:id="rId18"/>
+                                <a1611:picAttrSrcUrl xmlns:a1611="http://schemas.microsoft.com/office/drawing/2016/11/main" r:id="rId14"/>
                               </a:ext>
                             </a:extLst>
                           </a:blip>
@@ -1407,13 +1397,13 @@
                           </pic:cNvPicPr>
                         </pic:nvPicPr>
                         <pic:blipFill>
-                          <a:blip r:embed="rId17" cstate="print">
+                          <a:blip r:embed="rId13" cstate="print">
                             <a:extLst>
                               <a:ext uri="{28A0092B-C50C-407E-A947-70E740481C1C}">
                                 <a14:useLocalDpi xmlns:a14="http://schemas.microsoft.com/office/drawing/2010/main" val="0"/>
                               </a:ext>
                               <a:ext uri="{837473B0-CC2E-450A-ABE3-18F120FF3D39}">
-                                <a1611:picAttrSrcUrl xmlns:a1611="http://schemas.microsoft.com/office/drawing/2016/11/main" r:id="rId18"/>
+                                <a1611:picAttrSrcUrl xmlns:a1611="http://schemas.microsoft.com/office/drawing/2016/11/main" r:id="rId14"/>
                               </a:ext>
                             </a:extLst>
                           </a:blip>
@@ -1473,13 +1463,13 @@
                           </pic:cNvPicPr>
                         </pic:nvPicPr>
                         <pic:blipFill>
-                          <a:blip r:embed="rId17" cstate="print">
+                          <a:blip r:embed="rId13" cstate="print">
                             <a:extLst>
                               <a:ext uri="{28A0092B-C50C-407E-A947-70E740481C1C}">
                                 <a14:useLocalDpi xmlns:a14="http://schemas.microsoft.com/office/drawing/2010/main" val="0"/>
                               </a:ext>
                               <a:ext uri="{837473B0-CC2E-450A-ABE3-18F120FF3D39}">
-                                <a1611:picAttrSrcUrl xmlns:a1611="http://schemas.microsoft.com/office/drawing/2016/11/main" r:id="rId18"/>
+                                <a1611:picAttrSrcUrl xmlns:a1611="http://schemas.microsoft.com/office/drawing/2016/11/main" r:id="rId14"/>
                               </a:ext>
                             </a:extLst>
                           </a:blip>
@@ -1539,13 +1529,13 @@
                           </pic:cNvPicPr>
                         </pic:nvPicPr>
                         <pic:blipFill>
-                          <a:blip r:embed="rId17" cstate="print">
+                          <a:blip r:embed="rId13" cstate="print">
                             <a:extLst>
                               <a:ext uri="{28A0092B-C50C-407E-A947-70E740481C1C}">
                                 <a14:useLocalDpi xmlns:a14="http://schemas.microsoft.com/office/drawing/2010/main" val="0"/>
                               </a:ext>
                               <a:ext uri="{837473B0-CC2E-450A-ABE3-18F120FF3D39}">
-                                <a1611:picAttrSrcUrl xmlns:a1611="http://schemas.microsoft.com/office/drawing/2016/11/main" r:id="rId18"/>
+                                <a1611:picAttrSrcUrl xmlns:a1611="http://schemas.microsoft.com/office/drawing/2016/11/main" r:id="rId14"/>
                               </a:ext>
                             </a:extLst>
                           </a:blip>
@@ -1605,13 +1595,13 @@
                           </pic:cNvPicPr>
                         </pic:nvPicPr>
                         <pic:blipFill>
-                          <a:blip r:embed="rId17" cstate="print">
+                          <a:blip r:embed="rId13" cstate="print">
                             <a:extLst>
                               <a:ext uri="{28A0092B-C50C-407E-A947-70E740481C1C}">
                                 <a14:useLocalDpi xmlns:a14="http://schemas.microsoft.com/office/drawing/2010/main" val="0"/>
                               </a:ext>
                               <a:ext uri="{837473B0-CC2E-450A-ABE3-18F120FF3D39}">
-                                <a1611:picAttrSrcUrl xmlns:a1611="http://schemas.microsoft.com/office/drawing/2016/11/main" r:id="rId18"/>
+                                <a1611:picAttrSrcUrl xmlns:a1611="http://schemas.microsoft.com/office/drawing/2016/11/main" r:id="rId14"/>
                               </a:ext>
                             </a:extLst>
                           </a:blip>
@@ -1679,19 +1669,9 @@
           <w:numId w:val="1"/>
         </w:numPr>
       </w:pPr>
-      <w:commentRangeStart w:id="1"/>
       <w:r>
         <w:lastRenderedPageBreak/>
         <w:t>Usability – Bewertung</w:t>
-      </w:r>
-      <w:commentRangeEnd w:id="1"/>
-      <w:r>
-        <w:rPr>
-          <w:rStyle w:val="Kommentarzeichen"/>
-          <w:rFonts w:asciiTheme="minorHAnsi" w:eastAsiaTheme="minorHAnsi" w:hAnsiTheme="minorHAnsi" w:cstheme="minorBidi"/>
-          <w:color w:val="auto"/>
-        </w:rPr>
-        <w:commentReference w:id="1"/>
       </w:r>
       <w:r>
         <w:t xml:space="preserve"> (Block 1)</w:t>
@@ -11588,13 +11568,7 @@
       </w:pPr>
       <w:r>
         <w:lastRenderedPageBreak/>
-        <w:t xml:space="preserve">Usability – Bewertung (Block </w:t>
-      </w:r>
-      <w:r>
-        <w:t>3</w:t>
-      </w:r>
-      <w:r>
-        <w:t>)</w:t>
+        <w:t>Usability – Bewertung (Block 3)</w:t>
       </w:r>
     </w:p>
     <w:p/>
@@ -16531,34 +16505,13 @@
           <w:numId w:val="1"/>
         </w:numPr>
       </w:pPr>
-      <w:commentRangeStart w:id="2"/>
-      <w:commentRangeStart w:id="3"/>
       <w:r>
         <w:lastRenderedPageBreak/>
         <w:t>User Experience Bewertung</w:t>
       </w:r>
-      <w:commentRangeEnd w:id="2"/>
-      <w:r>
-        <w:rPr>
-          <w:rStyle w:val="Kommentarzeichen"/>
-          <w:rFonts w:asciiTheme="minorHAnsi" w:eastAsiaTheme="minorHAnsi" w:hAnsiTheme="minorHAnsi" w:cstheme="minorBidi"/>
-          <w:color w:val="auto"/>
-        </w:rPr>
-        <w:commentReference w:id="2"/>
-      </w:r>
-      <w:commentRangeEnd w:id="3"/>
-      <w:r>
-        <w:rPr>
-          <w:rStyle w:val="Kommentarzeichen"/>
-          <w:rFonts w:asciiTheme="minorHAnsi" w:eastAsiaTheme="minorHAnsi" w:hAnsiTheme="minorHAnsi" w:cstheme="minorBidi"/>
-          <w:color w:val="auto"/>
-        </w:rPr>
-        <w:commentReference w:id="3"/>
-      </w:r>
     </w:p>
     <w:p/>
     <w:p>
-      <w:commentRangeStart w:id="4"/>
       <w:r>
         <w:t>Im Folgenden finden Sie Wortpaare, die Ihnen bei der Beurteilung de</w:t>
       </w:r>
@@ -16603,13 +16556,6 @@
       </w:r>
       <w:r>
         <w:t xml:space="preserve"> möglich sind.</w:t>
-      </w:r>
-      <w:commentRangeEnd w:id="4"/>
-      <w:r>
-        <w:rPr>
-          <w:rStyle w:val="Kommentarzeichen"/>
-        </w:rPr>
-        <w:commentReference w:id="4"/>
       </w:r>
     </w:p>
     <w:p>
@@ -16805,13 +16751,13 @@
                           </pic:cNvPicPr>
                         </pic:nvPicPr>
                         <pic:blipFill>
-                          <a:blip r:embed="rId17" cstate="print">
+                          <a:blip r:embed="rId13" cstate="print">
                             <a:extLst>
                               <a:ext uri="{28A0092B-C50C-407E-A947-70E740481C1C}">
                                 <a14:useLocalDpi xmlns:a14="http://schemas.microsoft.com/office/drawing/2010/main" val="0"/>
                               </a:ext>
                               <a:ext uri="{837473B0-CC2E-450A-ABE3-18F120FF3D39}">
-                                <a1611:picAttrSrcUrl xmlns:a1611="http://schemas.microsoft.com/office/drawing/2016/11/main" r:id="rId18"/>
+                                <a1611:picAttrSrcUrl xmlns:a1611="http://schemas.microsoft.com/office/drawing/2016/11/main" r:id="rId14"/>
                               </a:ext>
                             </a:extLst>
                           </a:blip>
@@ -16871,13 +16817,13 @@
                           </pic:cNvPicPr>
                         </pic:nvPicPr>
                         <pic:blipFill>
-                          <a:blip r:embed="rId17" cstate="print">
+                          <a:blip r:embed="rId13" cstate="print">
                             <a:extLst>
                               <a:ext uri="{28A0092B-C50C-407E-A947-70E740481C1C}">
                                 <a14:useLocalDpi xmlns:a14="http://schemas.microsoft.com/office/drawing/2010/main" val="0"/>
                               </a:ext>
                               <a:ext uri="{837473B0-CC2E-450A-ABE3-18F120FF3D39}">
-                                <a1611:picAttrSrcUrl xmlns:a1611="http://schemas.microsoft.com/office/drawing/2016/11/main" r:id="rId18"/>
+                                <a1611:picAttrSrcUrl xmlns:a1611="http://schemas.microsoft.com/office/drawing/2016/11/main" r:id="rId14"/>
                               </a:ext>
                             </a:extLst>
                           </a:blip>
@@ -16937,13 +16883,13 @@
                           </pic:cNvPicPr>
                         </pic:nvPicPr>
                         <pic:blipFill>
-                          <a:blip r:embed="rId17" cstate="print">
+                          <a:blip r:embed="rId13" cstate="print">
                             <a:extLst>
                               <a:ext uri="{28A0092B-C50C-407E-A947-70E740481C1C}">
                                 <a14:useLocalDpi xmlns:a14="http://schemas.microsoft.com/office/drawing/2010/main" val="0"/>
                               </a:ext>
                               <a:ext uri="{837473B0-CC2E-450A-ABE3-18F120FF3D39}">
-                                <a1611:picAttrSrcUrl xmlns:a1611="http://schemas.microsoft.com/office/drawing/2016/11/main" r:id="rId18"/>
+                                <a1611:picAttrSrcUrl xmlns:a1611="http://schemas.microsoft.com/office/drawing/2016/11/main" r:id="rId14"/>
                               </a:ext>
                             </a:extLst>
                           </a:blip>
@@ -17003,13 +16949,13 @@
                           </pic:cNvPicPr>
                         </pic:nvPicPr>
                         <pic:blipFill>
-                          <a:blip r:embed="rId17" cstate="print">
+                          <a:blip r:embed="rId13" cstate="print">
                             <a:extLst>
                               <a:ext uri="{28A0092B-C50C-407E-A947-70E740481C1C}">
                                 <a14:useLocalDpi xmlns:a14="http://schemas.microsoft.com/office/drawing/2010/main" val="0"/>
                               </a:ext>
                               <a:ext uri="{837473B0-CC2E-450A-ABE3-18F120FF3D39}">
-                                <a1611:picAttrSrcUrl xmlns:a1611="http://schemas.microsoft.com/office/drawing/2016/11/main" r:id="rId18"/>
+                                <a1611:picAttrSrcUrl xmlns:a1611="http://schemas.microsoft.com/office/drawing/2016/11/main" r:id="rId14"/>
                               </a:ext>
                             </a:extLst>
                           </a:blip>
@@ -17069,13 +17015,13 @@
                           </pic:cNvPicPr>
                         </pic:nvPicPr>
                         <pic:blipFill>
-                          <a:blip r:embed="rId17" cstate="print">
+                          <a:blip r:embed="rId13" cstate="print">
                             <a:extLst>
                               <a:ext uri="{28A0092B-C50C-407E-A947-70E740481C1C}">
                                 <a14:useLocalDpi xmlns:a14="http://schemas.microsoft.com/office/drawing/2010/main" val="0"/>
                               </a:ext>
                               <a:ext uri="{837473B0-CC2E-450A-ABE3-18F120FF3D39}">
-                                <a1611:picAttrSrcUrl xmlns:a1611="http://schemas.microsoft.com/office/drawing/2016/11/main" r:id="rId18"/>
+                                <a1611:picAttrSrcUrl xmlns:a1611="http://schemas.microsoft.com/office/drawing/2016/11/main" r:id="rId14"/>
                               </a:ext>
                             </a:extLst>
                           </a:blip>
@@ -17135,13 +17081,13 @@
                           </pic:cNvPicPr>
                         </pic:nvPicPr>
                         <pic:blipFill>
-                          <a:blip r:embed="rId17" cstate="print">
+                          <a:blip r:embed="rId13" cstate="print">
                             <a:extLst>
                               <a:ext uri="{28A0092B-C50C-407E-A947-70E740481C1C}">
                                 <a14:useLocalDpi xmlns:a14="http://schemas.microsoft.com/office/drawing/2010/main" val="0"/>
                               </a:ext>
                               <a:ext uri="{837473B0-CC2E-450A-ABE3-18F120FF3D39}">
-                                <a1611:picAttrSrcUrl xmlns:a1611="http://schemas.microsoft.com/office/drawing/2016/11/main" r:id="rId18"/>
+                                <a1611:picAttrSrcUrl xmlns:a1611="http://schemas.microsoft.com/office/drawing/2016/11/main" r:id="rId14"/>
                               </a:ext>
                             </a:extLst>
                           </a:blip>
@@ -17201,13 +17147,13 @@
                           </pic:cNvPicPr>
                         </pic:nvPicPr>
                         <pic:blipFill>
-                          <a:blip r:embed="rId17" cstate="print">
+                          <a:blip r:embed="rId13" cstate="print">
                             <a:extLst>
                               <a:ext uri="{28A0092B-C50C-407E-A947-70E740481C1C}">
                                 <a14:useLocalDpi xmlns:a14="http://schemas.microsoft.com/office/drawing/2010/main" val="0"/>
                               </a:ext>
                               <a:ext uri="{837473B0-CC2E-450A-ABE3-18F120FF3D39}">
-                                <a1611:picAttrSrcUrl xmlns:a1611="http://schemas.microsoft.com/office/drawing/2016/11/main" r:id="rId18"/>
+                                <a1611:picAttrSrcUrl xmlns:a1611="http://schemas.microsoft.com/office/drawing/2016/11/main" r:id="rId14"/>
                               </a:ext>
                             </a:extLst>
                           </a:blip>
@@ -17254,7 +17200,6 @@
     </w:tbl>
     <w:p/>
     <w:p>
-      <w:commentRangeStart w:id="5"/>
       <w:r>
         <w:t xml:space="preserve">Das obige Bewertungsbeispiel legt nahe, dass das Produkt hauptsächlich nach Ihren Wünschen ist, aber auch ein paar Verbesserungen vertragen könnte. </w:t>
       </w:r>
@@ -17267,13 +17212,6 @@
     <w:p>
       <w:r>
         <w:t>Vielleicht sind einige der Bewertungsbegriffe nicht ganz für die Anwendung geeignet. Bitte kreuzen Sie trotzdem immer ein Kästchen in der Skala an. Bitte beachten Sie, dass es keine "richtigen" oder "falschen" Antworten gibt – nur Ihre persönliche Meinung zählt!</w:t>
-      </w:r>
-      <w:commentRangeEnd w:id="5"/>
-      <w:r>
-        <w:rPr>
-          <w:rStyle w:val="Kommentarzeichen"/>
-        </w:rPr>
-        <w:commentReference w:id="5"/>
       </w:r>
     </w:p>
     <w:p>
@@ -17304,14 +17242,6 @@
       <w:r>
         <w:t>in jeder Zeile angeboten</w:t>
       </w:r>
-      <w:commentRangeStart w:id="6"/>
-      <w:commentRangeEnd w:id="6"/>
-      <w:r>
-        <w:rPr>
-          <w:rStyle w:val="Kommentarzeichen"/>
-        </w:rPr>
-        <w:commentReference w:id="6"/>
-      </w:r>
       <w:r>
         <w:t>en Begriffe setzen.</w:t>
       </w:r>
@@ -17596,13 +17526,13 @@
                           </pic:cNvPicPr>
                         </pic:nvPicPr>
                         <pic:blipFill>
-                          <a:blip r:embed="rId17" cstate="print">
+                          <a:blip r:embed="rId13" cstate="print">
                             <a:extLst>
                               <a:ext uri="{28A0092B-C50C-407E-A947-70E740481C1C}">
                                 <a14:useLocalDpi xmlns:a14="http://schemas.microsoft.com/office/drawing/2010/main" val="0"/>
                               </a:ext>
                               <a:ext uri="{837473B0-CC2E-450A-ABE3-18F120FF3D39}">
-                                <a1611:picAttrSrcUrl xmlns:a1611="http://schemas.microsoft.com/office/drawing/2016/11/main" r:id="rId18"/>
+                                <a1611:picAttrSrcUrl xmlns:a1611="http://schemas.microsoft.com/office/drawing/2016/11/main" r:id="rId14"/>
                               </a:ext>
                             </a:extLst>
                           </a:blip>
@@ -17662,13 +17592,13 @@
                           </pic:cNvPicPr>
                         </pic:nvPicPr>
                         <pic:blipFill>
-                          <a:blip r:embed="rId17" cstate="print">
+                          <a:blip r:embed="rId13" cstate="print">
                             <a:extLst>
                               <a:ext uri="{28A0092B-C50C-407E-A947-70E740481C1C}">
                                 <a14:useLocalDpi xmlns:a14="http://schemas.microsoft.com/office/drawing/2010/main" val="0"/>
                               </a:ext>
                               <a:ext uri="{837473B0-CC2E-450A-ABE3-18F120FF3D39}">
-                                <a1611:picAttrSrcUrl xmlns:a1611="http://schemas.microsoft.com/office/drawing/2016/11/main" r:id="rId18"/>
+                                <a1611:picAttrSrcUrl xmlns:a1611="http://schemas.microsoft.com/office/drawing/2016/11/main" r:id="rId14"/>
                               </a:ext>
                             </a:extLst>
                           </a:blip>
@@ -17728,13 +17658,13 @@
                           </pic:cNvPicPr>
                         </pic:nvPicPr>
                         <pic:blipFill>
-                          <a:blip r:embed="rId17" cstate="print">
+                          <a:blip r:embed="rId13" cstate="print">
                             <a:extLst>
                               <a:ext uri="{28A0092B-C50C-407E-A947-70E740481C1C}">
                                 <a14:useLocalDpi xmlns:a14="http://schemas.microsoft.com/office/drawing/2010/main" val="0"/>
                               </a:ext>
                               <a:ext uri="{837473B0-CC2E-450A-ABE3-18F120FF3D39}">
-                                <a1611:picAttrSrcUrl xmlns:a1611="http://schemas.microsoft.com/office/drawing/2016/11/main" r:id="rId18"/>
+                                <a1611:picAttrSrcUrl xmlns:a1611="http://schemas.microsoft.com/office/drawing/2016/11/main" r:id="rId14"/>
                               </a:ext>
                             </a:extLst>
                           </a:blip>
@@ -17794,13 +17724,13 @@
                           </pic:cNvPicPr>
                         </pic:nvPicPr>
                         <pic:blipFill>
-                          <a:blip r:embed="rId17" cstate="print">
+                          <a:blip r:embed="rId13" cstate="print">
                             <a:extLst>
                               <a:ext uri="{28A0092B-C50C-407E-A947-70E740481C1C}">
                                 <a14:useLocalDpi xmlns:a14="http://schemas.microsoft.com/office/drawing/2010/main" val="0"/>
                               </a:ext>
                               <a:ext uri="{837473B0-CC2E-450A-ABE3-18F120FF3D39}">
-                                <a1611:picAttrSrcUrl xmlns:a1611="http://schemas.microsoft.com/office/drawing/2016/11/main" r:id="rId18"/>
+                                <a1611:picAttrSrcUrl xmlns:a1611="http://schemas.microsoft.com/office/drawing/2016/11/main" r:id="rId14"/>
                               </a:ext>
                             </a:extLst>
                           </a:blip>
@@ -17860,13 +17790,13 @@
                           </pic:cNvPicPr>
                         </pic:nvPicPr>
                         <pic:blipFill>
-                          <a:blip r:embed="rId17" cstate="print">
+                          <a:blip r:embed="rId13" cstate="print">
                             <a:extLst>
                               <a:ext uri="{28A0092B-C50C-407E-A947-70E740481C1C}">
                                 <a14:useLocalDpi xmlns:a14="http://schemas.microsoft.com/office/drawing/2010/main" val="0"/>
                               </a:ext>
                               <a:ext uri="{837473B0-CC2E-450A-ABE3-18F120FF3D39}">
-                                <a1611:picAttrSrcUrl xmlns:a1611="http://schemas.microsoft.com/office/drawing/2016/11/main" r:id="rId18"/>
+                                <a1611:picAttrSrcUrl xmlns:a1611="http://schemas.microsoft.com/office/drawing/2016/11/main" r:id="rId14"/>
                               </a:ext>
                             </a:extLst>
                           </a:blip>
@@ -17926,13 +17856,13 @@
                           </pic:cNvPicPr>
                         </pic:nvPicPr>
                         <pic:blipFill>
-                          <a:blip r:embed="rId17" cstate="print">
+                          <a:blip r:embed="rId13" cstate="print">
                             <a:extLst>
                               <a:ext uri="{28A0092B-C50C-407E-A947-70E740481C1C}">
                                 <a14:useLocalDpi xmlns:a14="http://schemas.microsoft.com/office/drawing/2010/main" val="0"/>
                               </a:ext>
                               <a:ext uri="{837473B0-CC2E-450A-ABE3-18F120FF3D39}">
-                                <a1611:picAttrSrcUrl xmlns:a1611="http://schemas.microsoft.com/office/drawing/2016/11/main" r:id="rId18"/>
+                                <a1611:picAttrSrcUrl xmlns:a1611="http://schemas.microsoft.com/office/drawing/2016/11/main" r:id="rId14"/>
                               </a:ext>
                             </a:extLst>
                           </a:blip>
@@ -17992,13 +17922,13 @@
                           </pic:cNvPicPr>
                         </pic:nvPicPr>
                         <pic:blipFill>
-                          <a:blip r:embed="rId17" cstate="print">
+                          <a:blip r:embed="rId13" cstate="print">
                             <a:extLst>
                               <a:ext uri="{28A0092B-C50C-407E-A947-70E740481C1C}">
                                 <a14:useLocalDpi xmlns:a14="http://schemas.microsoft.com/office/drawing/2010/main" val="0"/>
                               </a:ext>
                               <a:ext uri="{837473B0-CC2E-450A-ABE3-18F120FF3D39}">
-                                <a1611:picAttrSrcUrl xmlns:a1611="http://schemas.microsoft.com/office/drawing/2016/11/main" r:id="rId18"/>
+                                <a1611:picAttrSrcUrl xmlns:a1611="http://schemas.microsoft.com/office/drawing/2016/11/main" r:id="rId14"/>
                               </a:ext>
                             </a:extLst>
                           </a:blip>
@@ -18098,13 +18028,13 @@
                           </pic:cNvPicPr>
                         </pic:nvPicPr>
                         <pic:blipFill>
-                          <a:blip r:embed="rId17" cstate="print">
+                          <a:blip r:embed="rId13" cstate="print">
                             <a:extLst>
                               <a:ext uri="{28A0092B-C50C-407E-A947-70E740481C1C}">
                                 <a14:useLocalDpi xmlns:a14="http://schemas.microsoft.com/office/drawing/2010/main" val="0"/>
                               </a:ext>
                               <a:ext uri="{837473B0-CC2E-450A-ABE3-18F120FF3D39}">
-                                <a1611:picAttrSrcUrl xmlns:a1611="http://schemas.microsoft.com/office/drawing/2016/11/main" r:id="rId18"/>
+                                <a1611:picAttrSrcUrl xmlns:a1611="http://schemas.microsoft.com/office/drawing/2016/11/main" r:id="rId14"/>
                               </a:ext>
                             </a:extLst>
                           </a:blip>
@@ -18161,13 +18091,13 @@
                           </pic:cNvPicPr>
                         </pic:nvPicPr>
                         <pic:blipFill>
-                          <a:blip r:embed="rId17" cstate="print">
+                          <a:blip r:embed="rId13" cstate="print">
                             <a:extLst>
                               <a:ext uri="{28A0092B-C50C-407E-A947-70E740481C1C}">
                                 <a14:useLocalDpi xmlns:a14="http://schemas.microsoft.com/office/drawing/2010/main" val="0"/>
                               </a:ext>
                               <a:ext uri="{837473B0-CC2E-450A-ABE3-18F120FF3D39}">
-                                <a1611:picAttrSrcUrl xmlns:a1611="http://schemas.microsoft.com/office/drawing/2016/11/main" r:id="rId18"/>
+                                <a1611:picAttrSrcUrl xmlns:a1611="http://schemas.microsoft.com/office/drawing/2016/11/main" r:id="rId14"/>
                               </a:ext>
                             </a:extLst>
                           </a:blip>
@@ -18224,13 +18154,13 @@
                           </pic:cNvPicPr>
                         </pic:nvPicPr>
                         <pic:blipFill>
-                          <a:blip r:embed="rId17" cstate="print">
+                          <a:blip r:embed="rId13" cstate="print">
                             <a:extLst>
                               <a:ext uri="{28A0092B-C50C-407E-A947-70E740481C1C}">
                                 <a14:useLocalDpi xmlns:a14="http://schemas.microsoft.com/office/drawing/2010/main" val="0"/>
                               </a:ext>
                               <a:ext uri="{837473B0-CC2E-450A-ABE3-18F120FF3D39}">
-                                <a1611:picAttrSrcUrl xmlns:a1611="http://schemas.microsoft.com/office/drawing/2016/11/main" r:id="rId18"/>
+                                <a1611:picAttrSrcUrl xmlns:a1611="http://schemas.microsoft.com/office/drawing/2016/11/main" r:id="rId14"/>
                               </a:ext>
                             </a:extLst>
                           </a:blip>
@@ -18287,13 +18217,13 @@
                           </pic:cNvPicPr>
                         </pic:nvPicPr>
                         <pic:blipFill>
-                          <a:blip r:embed="rId17" cstate="print">
+                          <a:blip r:embed="rId13" cstate="print">
                             <a:extLst>
                               <a:ext uri="{28A0092B-C50C-407E-A947-70E740481C1C}">
                                 <a14:useLocalDpi xmlns:a14="http://schemas.microsoft.com/office/drawing/2010/main" val="0"/>
                               </a:ext>
                               <a:ext uri="{837473B0-CC2E-450A-ABE3-18F120FF3D39}">
-                                <a1611:picAttrSrcUrl xmlns:a1611="http://schemas.microsoft.com/office/drawing/2016/11/main" r:id="rId18"/>
+                                <a1611:picAttrSrcUrl xmlns:a1611="http://schemas.microsoft.com/office/drawing/2016/11/main" r:id="rId14"/>
                               </a:ext>
                             </a:extLst>
                           </a:blip>
@@ -18350,13 +18280,13 @@
                           </pic:cNvPicPr>
                         </pic:nvPicPr>
                         <pic:blipFill>
-                          <a:blip r:embed="rId17" cstate="print">
+                          <a:blip r:embed="rId13" cstate="print">
                             <a:extLst>
                               <a:ext uri="{28A0092B-C50C-407E-A947-70E740481C1C}">
                                 <a14:useLocalDpi xmlns:a14="http://schemas.microsoft.com/office/drawing/2010/main" val="0"/>
                               </a:ext>
                               <a:ext uri="{837473B0-CC2E-450A-ABE3-18F120FF3D39}">
-                                <a1611:picAttrSrcUrl xmlns:a1611="http://schemas.microsoft.com/office/drawing/2016/11/main" r:id="rId18"/>
+                                <a1611:picAttrSrcUrl xmlns:a1611="http://schemas.microsoft.com/office/drawing/2016/11/main" r:id="rId14"/>
                               </a:ext>
                             </a:extLst>
                           </a:blip>
@@ -18413,13 +18343,13 @@
                           </pic:cNvPicPr>
                         </pic:nvPicPr>
                         <pic:blipFill>
-                          <a:blip r:embed="rId17" cstate="print">
+                          <a:blip r:embed="rId13" cstate="print">
                             <a:extLst>
                               <a:ext uri="{28A0092B-C50C-407E-A947-70E740481C1C}">
                                 <a14:useLocalDpi xmlns:a14="http://schemas.microsoft.com/office/drawing/2010/main" val="0"/>
                               </a:ext>
                               <a:ext uri="{837473B0-CC2E-450A-ABE3-18F120FF3D39}">
-                                <a1611:picAttrSrcUrl xmlns:a1611="http://schemas.microsoft.com/office/drawing/2016/11/main" r:id="rId18"/>
+                                <a1611:picAttrSrcUrl xmlns:a1611="http://schemas.microsoft.com/office/drawing/2016/11/main" r:id="rId14"/>
                               </a:ext>
                             </a:extLst>
                           </a:blip>
@@ -18476,13 +18406,13 @@
                           </pic:cNvPicPr>
                         </pic:nvPicPr>
                         <pic:blipFill>
-                          <a:blip r:embed="rId17" cstate="print">
+                          <a:blip r:embed="rId13" cstate="print">
                             <a:extLst>
                               <a:ext uri="{28A0092B-C50C-407E-A947-70E740481C1C}">
                                 <a14:useLocalDpi xmlns:a14="http://schemas.microsoft.com/office/drawing/2010/main" val="0"/>
                               </a:ext>
                               <a:ext uri="{837473B0-CC2E-450A-ABE3-18F120FF3D39}">
-                                <a1611:picAttrSrcUrl xmlns:a1611="http://schemas.microsoft.com/office/drawing/2016/11/main" r:id="rId18"/>
+                                <a1611:picAttrSrcUrl xmlns:a1611="http://schemas.microsoft.com/office/drawing/2016/11/main" r:id="rId14"/>
                               </a:ext>
                             </a:extLst>
                           </a:blip>
@@ -18583,13 +18513,13 @@
                           </pic:cNvPicPr>
                         </pic:nvPicPr>
                         <pic:blipFill>
-                          <a:blip r:embed="rId17" cstate="print">
+                          <a:blip r:embed="rId13" cstate="print">
                             <a:extLst>
                               <a:ext uri="{28A0092B-C50C-407E-A947-70E740481C1C}">
                                 <a14:useLocalDpi xmlns:a14="http://schemas.microsoft.com/office/drawing/2010/main" val="0"/>
                               </a:ext>
                               <a:ext uri="{837473B0-CC2E-450A-ABE3-18F120FF3D39}">
-                                <a1611:picAttrSrcUrl xmlns:a1611="http://schemas.microsoft.com/office/drawing/2016/11/main" r:id="rId18"/>
+                                <a1611:picAttrSrcUrl xmlns:a1611="http://schemas.microsoft.com/office/drawing/2016/11/main" r:id="rId14"/>
                               </a:ext>
                             </a:extLst>
                           </a:blip>
@@ -18646,13 +18576,13 @@
                           </pic:cNvPicPr>
                         </pic:nvPicPr>
                         <pic:blipFill>
-                          <a:blip r:embed="rId17" cstate="print">
+                          <a:blip r:embed="rId13" cstate="print">
                             <a:extLst>
                               <a:ext uri="{28A0092B-C50C-407E-A947-70E740481C1C}">
                                 <a14:useLocalDpi xmlns:a14="http://schemas.microsoft.com/office/drawing/2010/main" val="0"/>
                               </a:ext>
                               <a:ext uri="{837473B0-CC2E-450A-ABE3-18F120FF3D39}">
-                                <a1611:picAttrSrcUrl xmlns:a1611="http://schemas.microsoft.com/office/drawing/2016/11/main" r:id="rId18"/>
+                                <a1611:picAttrSrcUrl xmlns:a1611="http://schemas.microsoft.com/office/drawing/2016/11/main" r:id="rId14"/>
                               </a:ext>
                             </a:extLst>
                           </a:blip>
@@ -18709,13 +18639,13 @@
                           </pic:cNvPicPr>
                         </pic:nvPicPr>
                         <pic:blipFill>
-                          <a:blip r:embed="rId17" cstate="print">
+                          <a:blip r:embed="rId13" cstate="print">
                             <a:extLst>
                               <a:ext uri="{28A0092B-C50C-407E-A947-70E740481C1C}">
                                 <a14:useLocalDpi xmlns:a14="http://schemas.microsoft.com/office/drawing/2010/main" val="0"/>
                               </a:ext>
                               <a:ext uri="{837473B0-CC2E-450A-ABE3-18F120FF3D39}">
-                                <a1611:picAttrSrcUrl xmlns:a1611="http://schemas.microsoft.com/office/drawing/2016/11/main" r:id="rId18"/>
+                                <a1611:picAttrSrcUrl xmlns:a1611="http://schemas.microsoft.com/office/drawing/2016/11/main" r:id="rId14"/>
                               </a:ext>
                             </a:extLst>
                           </a:blip>
@@ -18772,13 +18702,13 @@
                           </pic:cNvPicPr>
                         </pic:nvPicPr>
                         <pic:blipFill>
-                          <a:blip r:embed="rId17" cstate="print">
+                          <a:blip r:embed="rId13" cstate="print">
                             <a:extLst>
                               <a:ext uri="{28A0092B-C50C-407E-A947-70E740481C1C}">
                                 <a14:useLocalDpi xmlns:a14="http://schemas.microsoft.com/office/drawing/2010/main" val="0"/>
                               </a:ext>
                               <a:ext uri="{837473B0-CC2E-450A-ABE3-18F120FF3D39}">
-                                <a1611:picAttrSrcUrl xmlns:a1611="http://schemas.microsoft.com/office/drawing/2016/11/main" r:id="rId18"/>
+                                <a1611:picAttrSrcUrl xmlns:a1611="http://schemas.microsoft.com/office/drawing/2016/11/main" r:id="rId14"/>
                               </a:ext>
                             </a:extLst>
                           </a:blip>
@@ -18835,13 +18765,13 @@
                           </pic:cNvPicPr>
                         </pic:nvPicPr>
                         <pic:blipFill>
-                          <a:blip r:embed="rId17" cstate="print">
+                          <a:blip r:embed="rId13" cstate="print">
                             <a:extLst>
                               <a:ext uri="{28A0092B-C50C-407E-A947-70E740481C1C}">
                                 <a14:useLocalDpi xmlns:a14="http://schemas.microsoft.com/office/drawing/2010/main" val="0"/>
                               </a:ext>
                               <a:ext uri="{837473B0-CC2E-450A-ABE3-18F120FF3D39}">
-                                <a1611:picAttrSrcUrl xmlns:a1611="http://schemas.microsoft.com/office/drawing/2016/11/main" r:id="rId18"/>
+                                <a1611:picAttrSrcUrl xmlns:a1611="http://schemas.microsoft.com/office/drawing/2016/11/main" r:id="rId14"/>
                               </a:ext>
                             </a:extLst>
                           </a:blip>
@@ -18898,13 +18828,13 @@
                           </pic:cNvPicPr>
                         </pic:nvPicPr>
                         <pic:blipFill>
-                          <a:blip r:embed="rId17" cstate="print">
+                          <a:blip r:embed="rId13" cstate="print">
                             <a:extLst>
                               <a:ext uri="{28A0092B-C50C-407E-A947-70E740481C1C}">
                                 <a14:useLocalDpi xmlns:a14="http://schemas.microsoft.com/office/drawing/2010/main" val="0"/>
                               </a:ext>
                               <a:ext uri="{837473B0-CC2E-450A-ABE3-18F120FF3D39}">
-                                <a1611:picAttrSrcUrl xmlns:a1611="http://schemas.microsoft.com/office/drawing/2016/11/main" r:id="rId18"/>
+                                <a1611:picAttrSrcUrl xmlns:a1611="http://schemas.microsoft.com/office/drawing/2016/11/main" r:id="rId14"/>
                               </a:ext>
                             </a:extLst>
                           </a:blip>
@@ -18961,13 +18891,13 @@
                           </pic:cNvPicPr>
                         </pic:nvPicPr>
                         <pic:blipFill>
-                          <a:blip r:embed="rId17" cstate="print">
+                          <a:blip r:embed="rId13" cstate="print">
                             <a:extLst>
                               <a:ext uri="{28A0092B-C50C-407E-A947-70E740481C1C}">
                                 <a14:useLocalDpi xmlns:a14="http://schemas.microsoft.com/office/drawing/2010/main" val="0"/>
                               </a:ext>
                               <a:ext uri="{837473B0-CC2E-450A-ABE3-18F120FF3D39}">
-                                <a1611:picAttrSrcUrl xmlns:a1611="http://schemas.microsoft.com/office/drawing/2016/11/main" r:id="rId18"/>
+                                <a1611:picAttrSrcUrl xmlns:a1611="http://schemas.microsoft.com/office/drawing/2016/11/main" r:id="rId14"/>
                               </a:ext>
                             </a:extLst>
                           </a:blip>
@@ -19067,13 +18997,13 @@
                           </pic:cNvPicPr>
                         </pic:nvPicPr>
                         <pic:blipFill>
-                          <a:blip r:embed="rId17" cstate="print">
+                          <a:blip r:embed="rId13" cstate="print">
                             <a:extLst>
                               <a:ext uri="{28A0092B-C50C-407E-A947-70E740481C1C}">
                                 <a14:useLocalDpi xmlns:a14="http://schemas.microsoft.com/office/drawing/2010/main" val="0"/>
                               </a:ext>
                               <a:ext uri="{837473B0-CC2E-450A-ABE3-18F120FF3D39}">
-                                <a1611:picAttrSrcUrl xmlns:a1611="http://schemas.microsoft.com/office/drawing/2016/11/main" r:id="rId18"/>
+                                <a1611:picAttrSrcUrl xmlns:a1611="http://schemas.microsoft.com/office/drawing/2016/11/main" r:id="rId14"/>
                               </a:ext>
                             </a:extLst>
                           </a:blip>
@@ -19130,13 +19060,13 @@
                           </pic:cNvPicPr>
                         </pic:nvPicPr>
                         <pic:blipFill>
-                          <a:blip r:embed="rId17" cstate="print">
+                          <a:blip r:embed="rId13" cstate="print">
                             <a:extLst>
                               <a:ext uri="{28A0092B-C50C-407E-A947-70E740481C1C}">
                                 <a14:useLocalDpi xmlns:a14="http://schemas.microsoft.com/office/drawing/2010/main" val="0"/>
                               </a:ext>
                               <a:ext uri="{837473B0-CC2E-450A-ABE3-18F120FF3D39}">
-                                <a1611:picAttrSrcUrl xmlns:a1611="http://schemas.microsoft.com/office/drawing/2016/11/main" r:id="rId18"/>
+                                <a1611:picAttrSrcUrl xmlns:a1611="http://schemas.microsoft.com/office/drawing/2016/11/main" r:id="rId14"/>
                               </a:ext>
                             </a:extLst>
                           </a:blip>
@@ -19193,13 +19123,13 @@
                           </pic:cNvPicPr>
                         </pic:nvPicPr>
                         <pic:blipFill>
-                          <a:blip r:embed="rId17" cstate="print">
+                          <a:blip r:embed="rId13" cstate="print">
                             <a:extLst>
                               <a:ext uri="{28A0092B-C50C-407E-A947-70E740481C1C}">
                                 <a14:useLocalDpi xmlns:a14="http://schemas.microsoft.com/office/drawing/2010/main" val="0"/>
                               </a:ext>
                               <a:ext uri="{837473B0-CC2E-450A-ABE3-18F120FF3D39}">
-                                <a1611:picAttrSrcUrl xmlns:a1611="http://schemas.microsoft.com/office/drawing/2016/11/main" r:id="rId18"/>
+                                <a1611:picAttrSrcUrl xmlns:a1611="http://schemas.microsoft.com/office/drawing/2016/11/main" r:id="rId14"/>
                               </a:ext>
                             </a:extLst>
                           </a:blip>
@@ -19256,13 +19186,13 @@
                           </pic:cNvPicPr>
                         </pic:nvPicPr>
                         <pic:blipFill>
-                          <a:blip r:embed="rId17" cstate="print">
+                          <a:blip r:embed="rId13" cstate="print">
                             <a:extLst>
                               <a:ext uri="{28A0092B-C50C-407E-A947-70E740481C1C}">
                                 <a14:useLocalDpi xmlns:a14="http://schemas.microsoft.com/office/drawing/2010/main" val="0"/>
                               </a:ext>
                               <a:ext uri="{837473B0-CC2E-450A-ABE3-18F120FF3D39}">
-                                <a1611:picAttrSrcUrl xmlns:a1611="http://schemas.microsoft.com/office/drawing/2016/11/main" r:id="rId18"/>
+                                <a1611:picAttrSrcUrl xmlns:a1611="http://schemas.microsoft.com/office/drawing/2016/11/main" r:id="rId14"/>
                               </a:ext>
                             </a:extLst>
                           </a:blip>
@@ -19319,13 +19249,13 @@
                           </pic:cNvPicPr>
                         </pic:nvPicPr>
                         <pic:blipFill>
-                          <a:blip r:embed="rId17" cstate="print">
+                          <a:blip r:embed="rId13" cstate="print">
                             <a:extLst>
                               <a:ext uri="{28A0092B-C50C-407E-A947-70E740481C1C}">
                                 <a14:useLocalDpi xmlns:a14="http://schemas.microsoft.com/office/drawing/2010/main" val="0"/>
                               </a:ext>
                               <a:ext uri="{837473B0-CC2E-450A-ABE3-18F120FF3D39}">
-                                <a1611:picAttrSrcUrl xmlns:a1611="http://schemas.microsoft.com/office/drawing/2016/11/main" r:id="rId18"/>
+                                <a1611:picAttrSrcUrl xmlns:a1611="http://schemas.microsoft.com/office/drawing/2016/11/main" r:id="rId14"/>
                               </a:ext>
                             </a:extLst>
                           </a:blip>
@@ -19382,13 +19312,13 @@
                           </pic:cNvPicPr>
                         </pic:nvPicPr>
                         <pic:blipFill>
-                          <a:blip r:embed="rId17" cstate="print">
+                          <a:blip r:embed="rId13" cstate="print">
                             <a:extLst>
                               <a:ext uri="{28A0092B-C50C-407E-A947-70E740481C1C}">
                                 <a14:useLocalDpi xmlns:a14="http://schemas.microsoft.com/office/drawing/2010/main" val="0"/>
                               </a:ext>
                               <a:ext uri="{837473B0-CC2E-450A-ABE3-18F120FF3D39}">
-                                <a1611:picAttrSrcUrl xmlns:a1611="http://schemas.microsoft.com/office/drawing/2016/11/main" r:id="rId18"/>
+                                <a1611:picAttrSrcUrl xmlns:a1611="http://schemas.microsoft.com/office/drawing/2016/11/main" r:id="rId14"/>
                               </a:ext>
                             </a:extLst>
                           </a:blip>
@@ -19445,13 +19375,13 @@
                           </pic:cNvPicPr>
                         </pic:nvPicPr>
                         <pic:blipFill>
-                          <a:blip r:embed="rId17" cstate="print">
+                          <a:blip r:embed="rId13" cstate="print">
                             <a:extLst>
                               <a:ext uri="{28A0092B-C50C-407E-A947-70E740481C1C}">
                                 <a14:useLocalDpi xmlns:a14="http://schemas.microsoft.com/office/drawing/2010/main" val="0"/>
                               </a:ext>
                               <a:ext uri="{837473B0-CC2E-450A-ABE3-18F120FF3D39}">
-                                <a1611:picAttrSrcUrl xmlns:a1611="http://schemas.microsoft.com/office/drawing/2016/11/main" r:id="rId18"/>
+                                <a1611:picAttrSrcUrl xmlns:a1611="http://schemas.microsoft.com/office/drawing/2016/11/main" r:id="rId14"/>
                               </a:ext>
                             </a:extLst>
                           </a:blip>
@@ -19552,13 +19482,13 @@
                           </pic:cNvPicPr>
                         </pic:nvPicPr>
                         <pic:blipFill>
-                          <a:blip r:embed="rId17" cstate="print">
+                          <a:blip r:embed="rId13" cstate="print">
                             <a:extLst>
                               <a:ext uri="{28A0092B-C50C-407E-A947-70E740481C1C}">
                                 <a14:useLocalDpi xmlns:a14="http://schemas.microsoft.com/office/drawing/2010/main" val="0"/>
                               </a:ext>
                               <a:ext uri="{837473B0-CC2E-450A-ABE3-18F120FF3D39}">
-                                <a1611:picAttrSrcUrl xmlns:a1611="http://schemas.microsoft.com/office/drawing/2016/11/main" r:id="rId18"/>
+                                <a1611:picAttrSrcUrl xmlns:a1611="http://schemas.microsoft.com/office/drawing/2016/11/main" r:id="rId14"/>
                               </a:ext>
                             </a:extLst>
                           </a:blip>
@@ -19615,13 +19545,13 @@
                           </pic:cNvPicPr>
                         </pic:nvPicPr>
                         <pic:blipFill>
-                          <a:blip r:embed="rId17" cstate="print">
+                          <a:blip r:embed="rId13" cstate="print">
                             <a:extLst>
                               <a:ext uri="{28A0092B-C50C-407E-A947-70E740481C1C}">
                                 <a14:useLocalDpi xmlns:a14="http://schemas.microsoft.com/office/drawing/2010/main" val="0"/>
                               </a:ext>
                               <a:ext uri="{837473B0-CC2E-450A-ABE3-18F120FF3D39}">
-                                <a1611:picAttrSrcUrl xmlns:a1611="http://schemas.microsoft.com/office/drawing/2016/11/main" r:id="rId18"/>
+                                <a1611:picAttrSrcUrl xmlns:a1611="http://schemas.microsoft.com/office/drawing/2016/11/main" r:id="rId14"/>
                               </a:ext>
                             </a:extLst>
                           </a:blip>
@@ -19678,13 +19608,13 @@
                           </pic:cNvPicPr>
                         </pic:nvPicPr>
                         <pic:blipFill>
-                          <a:blip r:embed="rId17" cstate="print">
+                          <a:blip r:embed="rId13" cstate="print">
                             <a:extLst>
                               <a:ext uri="{28A0092B-C50C-407E-A947-70E740481C1C}">
                                 <a14:useLocalDpi xmlns:a14="http://schemas.microsoft.com/office/drawing/2010/main" val="0"/>
                               </a:ext>
                               <a:ext uri="{837473B0-CC2E-450A-ABE3-18F120FF3D39}">
-                                <a1611:picAttrSrcUrl xmlns:a1611="http://schemas.microsoft.com/office/drawing/2016/11/main" r:id="rId18"/>
+                                <a1611:picAttrSrcUrl xmlns:a1611="http://schemas.microsoft.com/office/drawing/2016/11/main" r:id="rId14"/>
                               </a:ext>
                             </a:extLst>
                           </a:blip>
@@ -19741,13 +19671,13 @@
                           </pic:cNvPicPr>
                         </pic:nvPicPr>
                         <pic:blipFill>
-                          <a:blip r:embed="rId17" cstate="print">
+                          <a:blip r:embed="rId13" cstate="print">
                             <a:extLst>
                               <a:ext uri="{28A0092B-C50C-407E-A947-70E740481C1C}">
                                 <a14:useLocalDpi xmlns:a14="http://schemas.microsoft.com/office/drawing/2010/main" val="0"/>
                               </a:ext>
                               <a:ext uri="{837473B0-CC2E-450A-ABE3-18F120FF3D39}">
-                                <a1611:picAttrSrcUrl xmlns:a1611="http://schemas.microsoft.com/office/drawing/2016/11/main" r:id="rId18"/>
+                                <a1611:picAttrSrcUrl xmlns:a1611="http://schemas.microsoft.com/office/drawing/2016/11/main" r:id="rId14"/>
                               </a:ext>
                             </a:extLst>
                           </a:blip>
@@ -19804,13 +19734,13 @@
                           </pic:cNvPicPr>
                         </pic:nvPicPr>
                         <pic:blipFill>
-                          <a:blip r:embed="rId17" cstate="print">
+                          <a:blip r:embed="rId13" cstate="print">
                             <a:extLst>
                               <a:ext uri="{28A0092B-C50C-407E-A947-70E740481C1C}">
                                 <a14:useLocalDpi xmlns:a14="http://schemas.microsoft.com/office/drawing/2010/main" val="0"/>
                               </a:ext>
                               <a:ext uri="{837473B0-CC2E-450A-ABE3-18F120FF3D39}">
-                                <a1611:picAttrSrcUrl xmlns:a1611="http://schemas.microsoft.com/office/drawing/2016/11/main" r:id="rId18"/>
+                                <a1611:picAttrSrcUrl xmlns:a1611="http://schemas.microsoft.com/office/drawing/2016/11/main" r:id="rId14"/>
                               </a:ext>
                             </a:extLst>
                           </a:blip>
@@ -19867,13 +19797,13 @@
                           </pic:cNvPicPr>
                         </pic:nvPicPr>
                         <pic:blipFill>
-                          <a:blip r:embed="rId17" cstate="print">
+                          <a:blip r:embed="rId13" cstate="print">
                             <a:extLst>
                               <a:ext uri="{28A0092B-C50C-407E-A947-70E740481C1C}">
                                 <a14:useLocalDpi xmlns:a14="http://schemas.microsoft.com/office/drawing/2010/main" val="0"/>
                               </a:ext>
                               <a:ext uri="{837473B0-CC2E-450A-ABE3-18F120FF3D39}">
-                                <a1611:picAttrSrcUrl xmlns:a1611="http://schemas.microsoft.com/office/drawing/2016/11/main" r:id="rId18"/>
+                                <a1611:picAttrSrcUrl xmlns:a1611="http://schemas.microsoft.com/office/drawing/2016/11/main" r:id="rId14"/>
                               </a:ext>
                             </a:extLst>
                           </a:blip>
@@ -19930,13 +19860,13 @@
                           </pic:cNvPicPr>
                         </pic:nvPicPr>
                         <pic:blipFill>
-                          <a:blip r:embed="rId17" cstate="print">
+                          <a:blip r:embed="rId13" cstate="print">
                             <a:extLst>
                               <a:ext uri="{28A0092B-C50C-407E-A947-70E740481C1C}">
                                 <a14:useLocalDpi xmlns:a14="http://schemas.microsoft.com/office/drawing/2010/main" val="0"/>
                               </a:ext>
                               <a:ext uri="{837473B0-CC2E-450A-ABE3-18F120FF3D39}">
-                                <a1611:picAttrSrcUrl xmlns:a1611="http://schemas.microsoft.com/office/drawing/2016/11/main" r:id="rId18"/>
+                                <a1611:picAttrSrcUrl xmlns:a1611="http://schemas.microsoft.com/office/drawing/2016/11/main" r:id="rId14"/>
                               </a:ext>
                             </a:extLst>
                           </a:blip>
@@ -20036,13 +19966,13 @@
                           </pic:cNvPicPr>
                         </pic:nvPicPr>
                         <pic:blipFill>
-                          <a:blip r:embed="rId17" cstate="print">
+                          <a:blip r:embed="rId13" cstate="print">
                             <a:extLst>
                               <a:ext uri="{28A0092B-C50C-407E-A947-70E740481C1C}">
                                 <a14:useLocalDpi xmlns:a14="http://schemas.microsoft.com/office/drawing/2010/main" val="0"/>
                               </a:ext>
                               <a:ext uri="{837473B0-CC2E-450A-ABE3-18F120FF3D39}">
-                                <a1611:picAttrSrcUrl xmlns:a1611="http://schemas.microsoft.com/office/drawing/2016/11/main" r:id="rId18"/>
+                                <a1611:picAttrSrcUrl xmlns:a1611="http://schemas.microsoft.com/office/drawing/2016/11/main" r:id="rId14"/>
                               </a:ext>
                             </a:extLst>
                           </a:blip>
@@ -20099,13 +20029,13 @@
                           </pic:cNvPicPr>
                         </pic:nvPicPr>
                         <pic:blipFill>
-                          <a:blip r:embed="rId17" cstate="print">
+                          <a:blip r:embed="rId13" cstate="print">
                             <a:extLst>
                               <a:ext uri="{28A0092B-C50C-407E-A947-70E740481C1C}">
                                 <a14:useLocalDpi xmlns:a14="http://schemas.microsoft.com/office/drawing/2010/main" val="0"/>
                               </a:ext>
                               <a:ext uri="{837473B0-CC2E-450A-ABE3-18F120FF3D39}">
-                                <a1611:picAttrSrcUrl xmlns:a1611="http://schemas.microsoft.com/office/drawing/2016/11/main" r:id="rId18"/>
+                                <a1611:picAttrSrcUrl xmlns:a1611="http://schemas.microsoft.com/office/drawing/2016/11/main" r:id="rId14"/>
                               </a:ext>
                             </a:extLst>
                           </a:blip>
@@ -20162,13 +20092,13 @@
                           </pic:cNvPicPr>
                         </pic:nvPicPr>
                         <pic:blipFill>
-                          <a:blip r:embed="rId17" cstate="print">
+                          <a:blip r:embed="rId13" cstate="print">
                             <a:extLst>
                               <a:ext uri="{28A0092B-C50C-407E-A947-70E740481C1C}">
                                 <a14:useLocalDpi xmlns:a14="http://schemas.microsoft.com/office/drawing/2010/main" val="0"/>
                               </a:ext>
                               <a:ext uri="{837473B0-CC2E-450A-ABE3-18F120FF3D39}">
-                                <a1611:picAttrSrcUrl xmlns:a1611="http://schemas.microsoft.com/office/drawing/2016/11/main" r:id="rId18"/>
+                                <a1611:picAttrSrcUrl xmlns:a1611="http://schemas.microsoft.com/office/drawing/2016/11/main" r:id="rId14"/>
                               </a:ext>
                             </a:extLst>
                           </a:blip>
@@ -20225,13 +20155,13 @@
                           </pic:cNvPicPr>
                         </pic:nvPicPr>
                         <pic:blipFill>
-                          <a:blip r:embed="rId17" cstate="print">
+                          <a:blip r:embed="rId13" cstate="print">
                             <a:extLst>
                               <a:ext uri="{28A0092B-C50C-407E-A947-70E740481C1C}">
                                 <a14:useLocalDpi xmlns:a14="http://schemas.microsoft.com/office/drawing/2010/main" val="0"/>
                               </a:ext>
                               <a:ext uri="{837473B0-CC2E-450A-ABE3-18F120FF3D39}">
-                                <a1611:picAttrSrcUrl xmlns:a1611="http://schemas.microsoft.com/office/drawing/2016/11/main" r:id="rId18"/>
+                                <a1611:picAttrSrcUrl xmlns:a1611="http://schemas.microsoft.com/office/drawing/2016/11/main" r:id="rId14"/>
                               </a:ext>
                             </a:extLst>
                           </a:blip>
@@ -20288,13 +20218,13 @@
                           </pic:cNvPicPr>
                         </pic:nvPicPr>
                         <pic:blipFill>
-                          <a:blip r:embed="rId17" cstate="print">
+                          <a:blip r:embed="rId13" cstate="print">
                             <a:extLst>
                               <a:ext uri="{28A0092B-C50C-407E-A947-70E740481C1C}">
                                 <a14:useLocalDpi xmlns:a14="http://schemas.microsoft.com/office/drawing/2010/main" val="0"/>
                               </a:ext>
                               <a:ext uri="{837473B0-CC2E-450A-ABE3-18F120FF3D39}">
-                                <a1611:picAttrSrcUrl xmlns:a1611="http://schemas.microsoft.com/office/drawing/2016/11/main" r:id="rId18"/>
+                                <a1611:picAttrSrcUrl xmlns:a1611="http://schemas.microsoft.com/office/drawing/2016/11/main" r:id="rId14"/>
                               </a:ext>
                             </a:extLst>
                           </a:blip>
@@ -20351,13 +20281,13 @@
                           </pic:cNvPicPr>
                         </pic:nvPicPr>
                         <pic:blipFill>
-                          <a:blip r:embed="rId17" cstate="print">
+                          <a:blip r:embed="rId13" cstate="print">
                             <a:extLst>
                               <a:ext uri="{28A0092B-C50C-407E-A947-70E740481C1C}">
                                 <a14:useLocalDpi xmlns:a14="http://schemas.microsoft.com/office/drawing/2010/main" val="0"/>
                               </a:ext>
                               <a:ext uri="{837473B0-CC2E-450A-ABE3-18F120FF3D39}">
-                                <a1611:picAttrSrcUrl xmlns:a1611="http://schemas.microsoft.com/office/drawing/2016/11/main" r:id="rId18"/>
+                                <a1611:picAttrSrcUrl xmlns:a1611="http://schemas.microsoft.com/office/drawing/2016/11/main" r:id="rId14"/>
                               </a:ext>
                             </a:extLst>
                           </a:blip>
@@ -20414,13 +20344,13 @@
                           </pic:cNvPicPr>
                         </pic:nvPicPr>
                         <pic:blipFill>
-                          <a:blip r:embed="rId17" cstate="print">
+                          <a:blip r:embed="rId13" cstate="print">
                             <a:extLst>
                               <a:ext uri="{28A0092B-C50C-407E-A947-70E740481C1C}">
                                 <a14:useLocalDpi xmlns:a14="http://schemas.microsoft.com/office/drawing/2010/main" val="0"/>
                               </a:ext>
                               <a:ext uri="{837473B0-CC2E-450A-ABE3-18F120FF3D39}">
-                                <a1611:picAttrSrcUrl xmlns:a1611="http://schemas.microsoft.com/office/drawing/2016/11/main" r:id="rId18"/>
+                                <a1611:picAttrSrcUrl xmlns:a1611="http://schemas.microsoft.com/office/drawing/2016/11/main" r:id="rId14"/>
                               </a:ext>
                             </a:extLst>
                           </a:blip>
@@ -20521,13 +20451,13 @@
                           </pic:cNvPicPr>
                         </pic:nvPicPr>
                         <pic:blipFill>
-                          <a:blip r:embed="rId17" cstate="print">
+                          <a:blip r:embed="rId13" cstate="print">
                             <a:extLst>
                               <a:ext uri="{28A0092B-C50C-407E-A947-70E740481C1C}">
                                 <a14:useLocalDpi xmlns:a14="http://schemas.microsoft.com/office/drawing/2010/main" val="0"/>
                               </a:ext>
                               <a:ext uri="{837473B0-CC2E-450A-ABE3-18F120FF3D39}">
-                                <a1611:picAttrSrcUrl xmlns:a1611="http://schemas.microsoft.com/office/drawing/2016/11/main" r:id="rId18"/>
+                                <a1611:picAttrSrcUrl xmlns:a1611="http://schemas.microsoft.com/office/drawing/2016/11/main" r:id="rId14"/>
                               </a:ext>
                             </a:extLst>
                           </a:blip>
@@ -20584,13 +20514,13 @@
                           </pic:cNvPicPr>
                         </pic:nvPicPr>
                         <pic:blipFill>
-                          <a:blip r:embed="rId17" cstate="print">
+                          <a:blip r:embed="rId13" cstate="print">
                             <a:extLst>
                               <a:ext uri="{28A0092B-C50C-407E-A947-70E740481C1C}">
                                 <a14:useLocalDpi xmlns:a14="http://schemas.microsoft.com/office/drawing/2010/main" val="0"/>
                               </a:ext>
                               <a:ext uri="{837473B0-CC2E-450A-ABE3-18F120FF3D39}">
-                                <a1611:picAttrSrcUrl xmlns:a1611="http://schemas.microsoft.com/office/drawing/2016/11/main" r:id="rId18"/>
+                                <a1611:picAttrSrcUrl xmlns:a1611="http://schemas.microsoft.com/office/drawing/2016/11/main" r:id="rId14"/>
                               </a:ext>
                             </a:extLst>
                           </a:blip>
@@ -20647,13 +20577,13 @@
                           </pic:cNvPicPr>
                         </pic:nvPicPr>
                         <pic:blipFill>
-                          <a:blip r:embed="rId17" cstate="print">
+                          <a:blip r:embed="rId13" cstate="print">
                             <a:extLst>
                               <a:ext uri="{28A0092B-C50C-407E-A947-70E740481C1C}">
                                 <a14:useLocalDpi xmlns:a14="http://schemas.microsoft.com/office/drawing/2010/main" val="0"/>
                               </a:ext>
                               <a:ext uri="{837473B0-CC2E-450A-ABE3-18F120FF3D39}">
-                                <a1611:picAttrSrcUrl xmlns:a1611="http://schemas.microsoft.com/office/drawing/2016/11/main" r:id="rId18"/>
+                                <a1611:picAttrSrcUrl xmlns:a1611="http://schemas.microsoft.com/office/drawing/2016/11/main" r:id="rId14"/>
                               </a:ext>
                             </a:extLst>
                           </a:blip>
@@ -20710,13 +20640,13 @@
                           </pic:cNvPicPr>
                         </pic:nvPicPr>
                         <pic:blipFill>
-                          <a:blip r:embed="rId17" cstate="print">
+                          <a:blip r:embed="rId13" cstate="print">
                             <a:extLst>
                               <a:ext uri="{28A0092B-C50C-407E-A947-70E740481C1C}">
                                 <a14:useLocalDpi xmlns:a14="http://schemas.microsoft.com/office/drawing/2010/main" val="0"/>
                               </a:ext>
                               <a:ext uri="{837473B0-CC2E-450A-ABE3-18F120FF3D39}">
-                                <a1611:picAttrSrcUrl xmlns:a1611="http://schemas.microsoft.com/office/drawing/2016/11/main" r:id="rId18"/>
+                                <a1611:picAttrSrcUrl xmlns:a1611="http://schemas.microsoft.com/office/drawing/2016/11/main" r:id="rId14"/>
                               </a:ext>
                             </a:extLst>
                           </a:blip>
@@ -20773,13 +20703,13 @@
                           </pic:cNvPicPr>
                         </pic:nvPicPr>
                         <pic:blipFill>
-                          <a:blip r:embed="rId17" cstate="print">
+                          <a:blip r:embed="rId13" cstate="print">
                             <a:extLst>
                               <a:ext uri="{28A0092B-C50C-407E-A947-70E740481C1C}">
                                 <a14:useLocalDpi xmlns:a14="http://schemas.microsoft.com/office/drawing/2010/main" val="0"/>
                               </a:ext>
                               <a:ext uri="{837473B0-CC2E-450A-ABE3-18F120FF3D39}">
-                                <a1611:picAttrSrcUrl xmlns:a1611="http://schemas.microsoft.com/office/drawing/2016/11/main" r:id="rId18"/>
+                                <a1611:picAttrSrcUrl xmlns:a1611="http://schemas.microsoft.com/office/drawing/2016/11/main" r:id="rId14"/>
                               </a:ext>
                             </a:extLst>
                           </a:blip>
@@ -20836,13 +20766,13 @@
                           </pic:cNvPicPr>
                         </pic:nvPicPr>
                         <pic:blipFill>
-                          <a:blip r:embed="rId17" cstate="print">
+                          <a:blip r:embed="rId13" cstate="print">
                             <a:extLst>
                               <a:ext uri="{28A0092B-C50C-407E-A947-70E740481C1C}">
                                 <a14:useLocalDpi xmlns:a14="http://schemas.microsoft.com/office/drawing/2010/main" val="0"/>
                               </a:ext>
                               <a:ext uri="{837473B0-CC2E-450A-ABE3-18F120FF3D39}">
-                                <a1611:picAttrSrcUrl xmlns:a1611="http://schemas.microsoft.com/office/drawing/2016/11/main" r:id="rId18"/>
+                                <a1611:picAttrSrcUrl xmlns:a1611="http://schemas.microsoft.com/office/drawing/2016/11/main" r:id="rId14"/>
                               </a:ext>
                             </a:extLst>
                           </a:blip>
@@ -20899,13 +20829,13 @@
                           </pic:cNvPicPr>
                         </pic:nvPicPr>
                         <pic:blipFill>
-                          <a:blip r:embed="rId17" cstate="print">
+                          <a:blip r:embed="rId13" cstate="print">
                             <a:extLst>
                               <a:ext uri="{28A0092B-C50C-407E-A947-70E740481C1C}">
                                 <a14:useLocalDpi xmlns:a14="http://schemas.microsoft.com/office/drawing/2010/main" val="0"/>
                               </a:ext>
                               <a:ext uri="{837473B0-CC2E-450A-ABE3-18F120FF3D39}">
-                                <a1611:picAttrSrcUrl xmlns:a1611="http://schemas.microsoft.com/office/drawing/2016/11/main" r:id="rId18"/>
+                                <a1611:picAttrSrcUrl xmlns:a1611="http://schemas.microsoft.com/office/drawing/2016/11/main" r:id="rId14"/>
                               </a:ext>
                             </a:extLst>
                           </a:blip>
@@ -21005,13 +20935,13 @@
                           </pic:cNvPicPr>
                         </pic:nvPicPr>
                         <pic:blipFill>
-                          <a:blip r:embed="rId17" cstate="print">
+                          <a:blip r:embed="rId13" cstate="print">
                             <a:extLst>
                               <a:ext uri="{28A0092B-C50C-407E-A947-70E740481C1C}">
                                 <a14:useLocalDpi xmlns:a14="http://schemas.microsoft.com/office/drawing/2010/main" val="0"/>
                               </a:ext>
                               <a:ext uri="{837473B0-CC2E-450A-ABE3-18F120FF3D39}">
-                                <a1611:picAttrSrcUrl xmlns:a1611="http://schemas.microsoft.com/office/drawing/2016/11/main" r:id="rId18"/>
+                                <a1611:picAttrSrcUrl xmlns:a1611="http://schemas.microsoft.com/office/drawing/2016/11/main" r:id="rId14"/>
                               </a:ext>
                             </a:extLst>
                           </a:blip>
@@ -21068,13 +20998,13 @@
                           </pic:cNvPicPr>
                         </pic:nvPicPr>
                         <pic:blipFill>
-                          <a:blip r:embed="rId17" cstate="print">
+                          <a:blip r:embed="rId13" cstate="print">
                             <a:extLst>
                               <a:ext uri="{28A0092B-C50C-407E-A947-70E740481C1C}">
                                 <a14:useLocalDpi xmlns:a14="http://schemas.microsoft.com/office/drawing/2010/main" val="0"/>
                               </a:ext>
                               <a:ext uri="{837473B0-CC2E-450A-ABE3-18F120FF3D39}">
-                                <a1611:picAttrSrcUrl xmlns:a1611="http://schemas.microsoft.com/office/drawing/2016/11/main" r:id="rId18"/>
+                                <a1611:picAttrSrcUrl xmlns:a1611="http://schemas.microsoft.com/office/drawing/2016/11/main" r:id="rId14"/>
                               </a:ext>
                             </a:extLst>
                           </a:blip>
@@ -21131,13 +21061,13 @@
                           </pic:cNvPicPr>
                         </pic:nvPicPr>
                         <pic:blipFill>
-                          <a:blip r:embed="rId17" cstate="print">
+                          <a:blip r:embed="rId13" cstate="print">
                             <a:extLst>
                               <a:ext uri="{28A0092B-C50C-407E-A947-70E740481C1C}">
                                 <a14:useLocalDpi xmlns:a14="http://schemas.microsoft.com/office/drawing/2010/main" val="0"/>
                               </a:ext>
                               <a:ext uri="{837473B0-CC2E-450A-ABE3-18F120FF3D39}">
-                                <a1611:picAttrSrcUrl xmlns:a1611="http://schemas.microsoft.com/office/drawing/2016/11/main" r:id="rId18"/>
+                                <a1611:picAttrSrcUrl xmlns:a1611="http://schemas.microsoft.com/office/drawing/2016/11/main" r:id="rId14"/>
                               </a:ext>
                             </a:extLst>
                           </a:blip>
@@ -21194,13 +21124,13 @@
                           </pic:cNvPicPr>
                         </pic:nvPicPr>
                         <pic:blipFill>
-                          <a:blip r:embed="rId17" cstate="print">
+                          <a:blip r:embed="rId13" cstate="print">
                             <a:extLst>
                               <a:ext uri="{28A0092B-C50C-407E-A947-70E740481C1C}">
                                 <a14:useLocalDpi xmlns:a14="http://schemas.microsoft.com/office/drawing/2010/main" val="0"/>
                               </a:ext>
                               <a:ext uri="{837473B0-CC2E-450A-ABE3-18F120FF3D39}">
-                                <a1611:picAttrSrcUrl xmlns:a1611="http://schemas.microsoft.com/office/drawing/2016/11/main" r:id="rId18"/>
+                                <a1611:picAttrSrcUrl xmlns:a1611="http://schemas.microsoft.com/office/drawing/2016/11/main" r:id="rId14"/>
                               </a:ext>
                             </a:extLst>
                           </a:blip>
@@ -21257,13 +21187,13 @@
                           </pic:cNvPicPr>
                         </pic:nvPicPr>
                         <pic:blipFill>
-                          <a:blip r:embed="rId17" cstate="print">
+                          <a:blip r:embed="rId13" cstate="print">
                             <a:extLst>
                               <a:ext uri="{28A0092B-C50C-407E-A947-70E740481C1C}">
                                 <a14:useLocalDpi xmlns:a14="http://schemas.microsoft.com/office/drawing/2010/main" val="0"/>
                               </a:ext>
                               <a:ext uri="{837473B0-CC2E-450A-ABE3-18F120FF3D39}">
-                                <a1611:picAttrSrcUrl xmlns:a1611="http://schemas.microsoft.com/office/drawing/2016/11/main" r:id="rId18"/>
+                                <a1611:picAttrSrcUrl xmlns:a1611="http://schemas.microsoft.com/office/drawing/2016/11/main" r:id="rId14"/>
                               </a:ext>
                             </a:extLst>
                           </a:blip>
@@ -21320,13 +21250,13 @@
                           </pic:cNvPicPr>
                         </pic:nvPicPr>
                         <pic:blipFill>
-                          <a:blip r:embed="rId17" cstate="print">
+                          <a:blip r:embed="rId13" cstate="print">
                             <a:extLst>
                               <a:ext uri="{28A0092B-C50C-407E-A947-70E740481C1C}">
                                 <a14:useLocalDpi xmlns:a14="http://schemas.microsoft.com/office/drawing/2010/main" val="0"/>
                               </a:ext>
                               <a:ext uri="{837473B0-CC2E-450A-ABE3-18F120FF3D39}">
-                                <a1611:picAttrSrcUrl xmlns:a1611="http://schemas.microsoft.com/office/drawing/2016/11/main" r:id="rId18"/>
+                                <a1611:picAttrSrcUrl xmlns:a1611="http://schemas.microsoft.com/office/drawing/2016/11/main" r:id="rId14"/>
                               </a:ext>
                             </a:extLst>
                           </a:blip>
@@ -21383,13 +21313,13 @@
                           </pic:cNvPicPr>
                         </pic:nvPicPr>
                         <pic:blipFill>
-                          <a:blip r:embed="rId17" cstate="print">
+                          <a:blip r:embed="rId13" cstate="print">
                             <a:extLst>
                               <a:ext uri="{28A0092B-C50C-407E-A947-70E740481C1C}">
                                 <a14:useLocalDpi xmlns:a14="http://schemas.microsoft.com/office/drawing/2010/main" val="0"/>
                               </a:ext>
                               <a:ext uri="{837473B0-CC2E-450A-ABE3-18F120FF3D39}">
-                                <a1611:picAttrSrcUrl xmlns:a1611="http://schemas.microsoft.com/office/drawing/2016/11/main" r:id="rId18"/>
+                                <a1611:picAttrSrcUrl xmlns:a1611="http://schemas.microsoft.com/office/drawing/2016/11/main" r:id="rId14"/>
                               </a:ext>
                             </a:extLst>
                           </a:blip>
@@ -21490,13 +21420,13 @@
                           </pic:cNvPicPr>
                         </pic:nvPicPr>
                         <pic:blipFill>
-                          <a:blip r:embed="rId17" cstate="print">
+                          <a:blip r:embed="rId13" cstate="print">
                             <a:extLst>
                               <a:ext uri="{28A0092B-C50C-407E-A947-70E740481C1C}">
                                 <a14:useLocalDpi xmlns:a14="http://schemas.microsoft.com/office/drawing/2010/main" val="0"/>
                               </a:ext>
                               <a:ext uri="{837473B0-CC2E-450A-ABE3-18F120FF3D39}">
-                                <a1611:picAttrSrcUrl xmlns:a1611="http://schemas.microsoft.com/office/drawing/2016/11/main" r:id="rId18"/>
+                                <a1611:picAttrSrcUrl xmlns:a1611="http://schemas.microsoft.com/office/drawing/2016/11/main" r:id="rId14"/>
                               </a:ext>
                             </a:extLst>
                           </a:blip>
@@ -21553,13 +21483,13 @@
                           </pic:cNvPicPr>
                         </pic:nvPicPr>
                         <pic:blipFill>
-                          <a:blip r:embed="rId17" cstate="print">
+                          <a:blip r:embed="rId13" cstate="print">
                             <a:extLst>
                               <a:ext uri="{28A0092B-C50C-407E-A947-70E740481C1C}">
                                 <a14:useLocalDpi xmlns:a14="http://schemas.microsoft.com/office/drawing/2010/main" val="0"/>
                               </a:ext>
                               <a:ext uri="{837473B0-CC2E-450A-ABE3-18F120FF3D39}">
-                                <a1611:picAttrSrcUrl xmlns:a1611="http://schemas.microsoft.com/office/drawing/2016/11/main" r:id="rId18"/>
+                                <a1611:picAttrSrcUrl xmlns:a1611="http://schemas.microsoft.com/office/drawing/2016/11/main" r:id="rId14"/>
                               </a:ext>
                             </a:extLst>
                           </a:blip>
@@ -21616,13 +21546,13 @@
                           </pic:cNvPicPr>
                         </pic:nvPicPr>
                         <pic:blipFill>
-                          <a:blip r:embed="rId17" cstate="print">
+                          <a:blip r:embed="rId13" cstate="print">
                             <a:extLst>
                               <a:ext uri="{28A0092B-C50C-407E-A947-70E740481C1C}">
                                 <a14:useLocalDpi xmlns:a14="http://schemas.microsoft.com/office/drawing/2010/main" val="0"/>
                               </a:ext>
                               <a:ext uri="{837473B0-CC2E-450A-ABE3-18F120FF3D39}">
-                                <a1611:picAttrSrcUrl xmlns:a1611="http://schemas.microsoft.com/office/drawing/2016/11/main" r:id="rId18"/>
+                                <a1611:picAttrSrcUrl xmlns:a1611="http://schemas.microsoft.com/office/drawing/2016/11/main" r:id="rId14"/>
                               </a:ext>
                             </a:extLst>
                           </a:blip>
@@ -21679,13 +21609,13 @@
                           </pic:cNvPicPr>
                         </pic:nvPicPr>
                         <pic:blipFill>
-                          <a:blip r:embed="rId17" cstate="print">
+                          <a:blip r:embed="rId13" cstate="print">
                             <a:extLst>
                               <a:ext uri="{28A0092B-C50C-407E-A947-70E740481C1C}">
                                 <a14:useLocalDpi xmlns:a14="http://schemas.microsoft.com/office/drawing/2010/main" val="0"/>
                               </a:ext>
                               <a:ext uri="{837473B0-CC2E-450A-ABE3-18F120FF3D39}">
-                                <a1611:picAttrSrcUrl xmlns:a1611="http://schemas.microsoft.com/office/drawing/2016/11/main" r:id="rId18"/>
+                                <a1611:picAttrSrcUrl xmlns:a1611="http://schemas.microsoft.com/office/drawing/2016/11/main" r:id="rId14"/>
                               </a:ext>
                             </a:extLst>
                           </a:blip>
@@ -21742,13 +21672,13 @@
                           </pic:cNvPicPr>
                         </pic:nvPicPr>
                         <pic:blipFill>
-                          <a:blip r:embed="rId17" cstate="print">
+                          <a:blip r:embed="rId13" cstate="print">
                             <a:extLst>
                               <a:ext uri="{28A0092B-C50C-407E-A947-70E740481C1C}">
                                 <a14:useLocalDpi xmlns:a14="http://schemas.microsoft.com/office/drawing/2010/main" val="0"/>
                               </a:ext>
                               <a:ext uri="{837473B0-CC2E-450A-ABE3-18F120FF3D39}">
-                                <a1611:picAttrSrcUrl xmlns:a1611="http://schemas.microsoft.com/office/drawing/2016/11/main" r:id="rId18"/>
+                                <a1611:picAttrSrcUrl xmlns:a1611="http://schemas.microsoft.com/office/drawing/2016/11/main" r:id="rId14"/>
                               </a:ext>
                             </a:extLst>
                           </a:blip>
@@ -21805,13 +21735,13 @@
                           </pic:cNvPicPr>
                         </pic:nvPicPr>
                         <pic:blipFill>
-                          <a:blip r:embed="rId17" cstate="print">
+                          <a:blip r:embed="rId13" cstate="print">
                             <a:extLst>
                               <a:ext uri="{28A0092B-C50C-407E-A947-70E740481C1C}">
                                 <a14:useLocalDpi xmlns:a14="http://schemas.microsoft.com/office/drawing/2010/main" val="0"/>
                               </a:ext>
                               <a:ext uri="{837473B0-CC2E-450A-ABE3-18F120FF3D39}">
-                                <a1611:picAttrSrcUrl xmlns:a1611="http://schemas.microsoft.com/office/drawing/2016/11/main" r:id="rId18"/>
+                                <a1611:picAttrSrcUrl xmlns:a1611="http://schemas.microsoft.com/office/drawing/2016/11/main" r:id="rId14"/>
                               </a:ext>
                             </a:extLst>
                           </a:blip>
@@ -21868,13 +21798,13 @@
                           </pic:cNvPicPr>
                         </pic:nvPicPr>
                         <pic:blipFill>
-                          <a:blip r:embed="rId17" cstate="print">
+                          <a:blip r:embed="rId13" cstate="print">
                             <a:extLst>
                               <a:ext uri="{28A0092B-C50C-407E-A947-70E740481C1C}">
                                 <a14:useLocalDpi xmlns:a14="http://schemas.microsoft.com/office/drawing/2010/main" val="0"/>
                               </a:ext>
                               <a:ext uri="{837473B0-CC2E-450A-ABE3-18F120FF3D39}">
-                                <a1611:picAttrSrcUrl xmlns:a1611="http://schemas.microsoft.com/office/drawing/2016/11/main" r:id="rId18"/>
+                                <a1611:picAttrSrcUrl xmlns:a1611="http://schemas.microsoft.com/office/drawing/2016/11/main" r:id="rId14"/>
                               </a:ext>
                             </a:extLst>
                           </a:blip>
@@ -21974,13 +21904,13 @@
                           </pic:cNvPicPr>
                         </pic:nvPicPr>
                         <pic:blipFill>
-                          <a:blip r:embed="rId17" cstate="print">
+                          <a:blip r:embed="rId13" cstate="print">
                             <a:extLst>
                               <a:ext uri="{28A0092B-C50C-407E-A947-70E740481C1C}">
                                 <a14:useLocalDpi xmlns:a14="http://schemas.microsoft.com/office/drawing/2010/main" val="0"/>
                               </a:ext>
                               <a:ext uri="{837473B0-CC2E-450A-ABE3-18F120FF3D39}">
-                                <a1611:picAttrSrcUrl xmlns:a1611="http://schemas.microsoft.com/office/drawing/2016/11/main" r:id="rId18"/>
+                                <a1611:picAttrSrcUrl xmlns:a1611="http://schemas.microsoft.com/office/drawing/2016/11/main" r:id="rId14"/>
                               </a:ext>
                             </a:extLst>
                           </a:blip>
@@ -22037,13 +21967,13 @@
                           </pic:cNvPicPr>
                         </pic:nvPicPr>
                         <pic:blipFill>
-                          <a:blip r:embed="rId17" cstate="print">
+                          <a:blip r:embed="rId13" cstate="print">
                             <a:extLst>
                               <a:ext uri="{28A0092B-C50C-407E-A947-70E740481C1C}">
                                 <a14:useLocalDpi xmlns:a14="http://schemas.microsoft.com/office/drawing/2010/main" val="0"/>
                               </a:ext>
                               <a:ext uri="{837473B0-CC2E-450A-ABE3-18F120FF3D39}">
-                                <a1611:picAttrSrcUrl xmlns:a1611="http://schemas.microsoft.com/office/drawing/2016/11/main" r:id="rId18"/>
+                                <a1611:picAttrSrcUrl xmlns:a1611="http://schemas.microsoft.com/office/drawing/2016/11/main" r:id="rId14"/>
                               </a:ext>
                             </a:extLst>
                           </a:blip>
@@ -22100,13 +22030,13 @@
                           </pic:cNvPicPr>
                         </pic:nvPicPr>
                         <pic:blipFill>
-                          <a:blip r:embed="rId17" cstate="print">
+                          <a:blip r:embed="rId13" cstate="print">
                             <a:extLst>
                               <a:ext uri="{28A0092B-C50C-407E-A947-70E740481C1C}">
                                 <a14:useLocalDpi xmlns:a14="http://schemas.microsoft.com/office/drawing/2010/main" val="0"/>
                               </a:ext>
                               <a:ext uri="{837473B0-CC2E-450A-ABE3-18F120FF3D39}">
-                                <a1611:picAttrSrcUrl xmlns:a1611="http://schemas.microsoft.com/office/drawing/2016/11/main" r:id="rId18"/>
+                                <a1611:picAttrSrcUrl xmlns:a1611="http://schemas.microsoft.com/office/drawing/2016/11/main" r:id="rId14"/>
                               </a:ext>
                             </a:extLst>
                           </a:blip>
@@ -22163,13 +22093,13 @@
                           </pic:cNvPicPr>
                         </pic:nvPicPr>
                         <pic:blipFill>
-                          <a:blip r:embed="rId17" cstate="print">
+                          <a:blip r:embed="rId13" cstate="print">
                             <a:extLst>
                               <a:ext uri="{28A0092B-C50C-407E-A947-70E740481C1C}">
                                 <a14:useLocalDpi xmlns:a14="http://schemas.microsoft.com/office/drawing/2010/main" val="0"/>
                               </a:ext>
                               <a:ext uri="{837473B0-CC2E-450A-ABE3-18F120FF3D39}">
-                                <a1611:picAttrSrcUrl xmlns:a1611="http://schemas.microsoft.com/office/drawing/2016/11/main" r:id="rId18"/>
+                                <a1611:picAttrSrcUrl xmlns:a1611="http://schemas.microsoft.com/office/drawing/2016/11/main" r:id="rId14"/>
                               </a:ext>
                             </a:extLst>
                           </a:blip>
@@ -22226,13 +22156,13 @@
                           </pic:cNvPicPr>
                         </pic:nvPicPr>
                         <pic:blipFill>
-                          <a:blip r:embed="rId17" cstate="print">
+                          <a:blip r:embed="rId13" cstate="print">
                             <a:extLst>
                               <a:ext uri="{28A0092B-C50C-407E-A947-70E740481C1C}">
                                 <a14:useLocalDpi xmlns:a14="http://schemas.microsoft.com/office/drawing/2010/main" val="0"/>
                               </a:ext>
                               <a:ext uri="{837473B0-CC2E-450A-ABE3-18F120FF3D39}">
-                                <a1611:picAttrSrcUrl xmlns:a1611="http://schemas.microsoft.com/office/drawing/2016/11/main" r:id="rId18"/>
+                                <a1611:picAttrSrcUrl xmlns:a1611="http://schemas.microsoft.com/office/drawing/2016/11/main" r:id="rId14"/>
                               </a:ext>
                             </a:extLst>
                           </a:blip>
@@ -22289,13 +22219,13 @@
                           </pic:cNvPicPr>
                         </pic:nvPicPr>
                         <pic:blipFill>
-                          <a:blip r:embed="rId17" cstate="print">
+                          <a:blip r:embed="rId13" cstate="print">
                             <a:extLst>
                               <a:ext uri="{28A0092B-C50C-407E-A947-70E740481C1C}">
                                 <a14:useLocalDpi xmlns:a14="http://schemas.microsoft.com/office/drawing/2010/main" val="0"/>
                               </a:ext>
                               <a:ext uri="{837473B0-CC2E-450A-ABE3-18F120FF3D39}">
-                                <a1611:picAttrSrcUrl xmlns:a1611="http://schemas.microsoft.com/office/drawing/2016/11/main" r:id="rId18"/>
+                                <a1611:picAttrSrcUrl xmlns:a1611="http://schemas.microsoft.com/office/drawing/2016/11/main" r:id="rId14"/>
                               </a:ext>
                             </a:extLst>
                           </a:blip>
@@ -22352,13 +22282,13 @@
                           </pic:cNvPicPr>
                         </pic:nvPicPr>
                         <pic:blipFill>
-                          <a:blip r:embed="rId17" cstate="print">
+                          <a:blip r:embed="rId13" cstate="print">
                             <a:extLst>
                               <a:ext uri="{28A0092B-C50C-407E-A947-70E740481C1C}">
                                 <a14:useLocalDpi xmlns:a14="http://schemas.microsoft.com/office/drawing/2010/main" val="0"/>
                               </a:ext>
                               <a:ext uri="{837473B0-CC2E-450A-ABE3-18F120FF3D39}">
-                                <a1611:picAttrSrcUrl xmlns:a1611="http://schemas.microsoft.com/office/drawing/2016/11/main" r:id="rId18"/>
+                                <a1611:picAttrSrcUrl xmlns:a1611="http://schemas.microsoft.com/office/drawing/2016/11/main" r:id="rId14"/>
                               </a:ext>
                             </a:extLst>
                           </a:blip>
@@ -22459,13 +22389,13 @@
                           </pic:cNvPicPr>
                         </pic:nvPicPr>
                         <pic:blipFill>
-                          <a:blip r:embed="rId17" cstate="print">
+                          <a:blip r:embed="rId13" cstate="print">
                             <a:extLst>
                               <a:ext uri="{28A0092B-C50C-407E-A947-70E740481C1C}">
                                 <a14:useLocalDpi xmlns:a14="http://schemas.microsoft.com/office/drawing/2010/main" val="0"/>
                               </a:ext>
                               <a:ext uri="{837473B0-CC2E-450A-ABE3-18F120FF3D39}">
-                                <a1611:picAttrSrcUrl xmlns:a1611="http://schemas.microsoft.com/office/drawing/2016/11/main" r:id="rId18"/>
+                                <a1611:picAttrSrcUrl xmlns:a1611="http://schemas.microsoft.com/office/drawing/2016/11/main" r:id="rId14"/>
                               </a:ext>
                             </a:extLst>
                           </a:blip>
@@ -22522,13 +22452,13 @@
                           </pic:cNvPicPr>
                         </pic:nvPicPr>
                         <pic:blipFill>
-                          <a:blip r:embed="rId17" cstate="print">
+                          <a:blip r:embed="rId13" cstate="print">
                             <a:extLst>
                               <a:ext uri="{28A0092B-C50C-407E-A947-70E740481C1C}">
                                 <a14:useLocalDpi xmlns:a14="http://schemas.microsoft.com/office/drawing/2010/main" val="0"/>
                               </a:ext>
                               <a:ext uri="{837473B0-CC2E-450A-ABE3-18F120FF3D39}">
-                                <a1611:picAttrSrcUrl xmlns:a1611="http://schemas.microsoft.com/office/drawing/2016/11/main" r:id="rId18"/>
+                                <a1611:picAttrSrcUrl xmlns:a1611="http://schemas.microsoft.com/office/drawing/2016/11/main" r:id="rId14"/>
                               </a:ext>
                             </a:extLst>
                           </a:blip>
@@ -22585,13 +22515,13 @@
                           </pic:cNvPicPr>
                         </pic:nvPicPr>
                         <pic:blipFill>
-                          <a:blip r:embed="rId17" cstate="print">
+                          <a:blip r:embed="rId13" cstate="print">
                             <a:extLst>
                               <a:ext uri="{28A0092B-C50C-407E-A947-70E740481C1C}">
                                 <a14:useLocalDpi xmlns:a14="http://schemas.microsoft.com/office/drawing/2010/main" val="0"/>
                               </a:ext>
                               <a:ext uri="{837473B0-CC2E-450A-ABE3-18F120FF3D39}">
-                                <a1611:picAttrSrcUrl xmlns:a1611="http://schemas.microsoft.com/office/drawing/2016/11/main" r:id="rId18"/>
+                                <a1611:picAttrSrcUrl xmlns:a1611="http://schemas.microsoft.com/office/drawing/2016/11/main" r:id="rId14"/>
                               </a:ext>
                             </a:extLst>
                           </a:blip>
@@ -22648,13 +22578,13 @@
                           </pic:cNvPicPr>
                         </pic:nvPicPr>
                         <pic:blipFill>
-                          <a:blip r:embed="rId17" cstate="print">
+                          <a:blip r:embed="rId13" cstate="print">
                             <a:extLst>
                               <a:ext uri="{28A0092B-C50C-407E-A947-70E740481C1C}">
                                 <a14:useLocalDpi xmlns:a14="http://schemas.microsoft.com/office/drawing/2010/main" val="0"/>
                               </a:ext>
                               <a:ext uri="{837473B0-CC2E-450A-ABE3-18F120FF3D39}">
-                                <a1611:picAttrSrcUrl xmlns:a1611="http://schemas.microsoft.com/office/drawing/2016/11/main" r:id="rId18"/>
+                                <a1611:picAttrSrcUrl xmlns:a1611="http://schemas.microsoft.com/office/drawing/2016/11/main" r:id="rId14"/>
                               </a:ext>
                             </a:extLst>
                           </a:blip>
@@ -22711,13 +22641,13 @@
                           </pic:cNvPicPr>
                         </pic:nvPicPr>
                         <pic:blipFill>
-                          <a:blip r:embed="rId17" cstate="print">
+                          <a:blip r:embed="rId13" cstate="print">
                             <a:extLst>
                               <a:ext uri="{28A0092B-C50C-407E-A947-70E740481C1C}">
                                 <a14:useLocalDpi xmlns:a14="http://schemas.microsoft.com/office/drawing/2010/main" val="0"/>
                               </a:ext>
                               <a:ext uri="{837473B0-CC2E-450A-ABE3-18F120FF3D39}">
-                                <a1611:picAttrSrcUrl xmlns:a1611="http://schemas.microsoft.com/office/drawing/2016/11/main" r:id="rId18"/>
+                                <a1611:picAttrSrcUrl xmlns:a1611="http://schemas.microsoft.com/office/drawing/2016/11/main" r:id="rId14"/>
                               </a:ext>
                             </a:extLst>
                           </a:blip>
@@ -22774,13 +22704,13 @@
                           </pic:cNvPicPr>
                         </pic:nvPicPr>
                         <pic:blipFill>
-                          <a:blip r:embed="rId17" cstate="print">
+                          <a:blip r:embed="rId13" cstate="print">
                             <a:extLst>
                               <a:ext uri="{28A0092B-C50C-407E-A947-70E740481C1C}">
                                 <a14:useLocalDpi xmlns:a14="http://schemas.microsoft.com/office/drawing/2010/main" val="0"/>
                               </a:ext>
                               <a:ext uri="{837473B0-CC2E-450A-ABE3-18F120FF3D39}">
-                                <a1611:picAttrSrcUrl xmlns:a1611="http://schemas.microsoft.com/office/drawing/2016/11/main" r:id="rId18"/>
+                                <a1611:picAttrSrcUrl xmlns:a1611="http://schemas.microsoft.com/office/drawing/2016/11/main" r:id="rId14"/>
                               </a:ext>
                             </a:extLst>
                           </a:blip>
@@ -22837,13 +22767,13 @@
                           </pic:cNvPicPr>
                         </pic:nvPicPr>
                         <pic:blipFill>
-                          <a:blip r:embed="rId17" cstate="print">
+                          <a:blip r:embed="rId13" cstate="print">
                             <a:extLst>
                               <a:ext uri="{28A0092B-C50C-407E-A947-70E740481C1C}">
                                 <a14:useLocalDpi xmlns:a14="http://schemas.microsoft.com/office/drawing/2010/main" val="0"/>
                               </a:ext>
                               <a:ext uri="{837473B0-CC2E-450A-ABE3-18F120FF3D39}">
-                                <a1611:picAttrSrcUrl xmlns:a1611="http://schemas.microsoft.com/office/drawing/2016/11/main" r:id="rId18"/>
+                                <a1611:picAttrSrcUrl xmlns:a1611="http://schemas.microsoft.com/office/drawing/2016/11/main" r:id="rId14"/>
                               </a:ext>
                             </a:extLst>
                           </a:blip>
@@ -22943,13 +22873,13 @@
                           </pic:cNvPicPr>
                         </pic:nvPicPr>
                         <pic:blipFill>
-                          <a:blip r:embed="rId17" cstate="print">
+                          <a:blip r:embed="rId13" cstate="print">
                             <a:extLst>
                               <a:ext uri="{28A0092B-C50C-407E-A947-70E740481C1C}">
                                 <a14:useLocalDpi xmlns:a14="http://schemas.microsoft.com/office/drawing/2010/main" val="0"/>
                               </a:ext>
                               <a:ext uri="{837473B0-CC2E-450A-ABE3-18F120FF3D39}">
-                                <a1611:picAttrSrcUrl xmlns:a1611="http://schemas.microsoft.com/office/drawing/2016/11/main" r:id="rId18"/>
+                                <a1611:picAttrSrcUrl xmlns:a1611="http://schemas.microsoft.com/office/drawing/2016/11/main" r:id="rId14"/>
                               </a:ext>
                             </a:extLst>
                           </a:blip>
@@ -23006,13 +22936,13 @@
                           </pic:cNvPicPr>
                         </pic:nvPicPr>
                         <pic:blipFill>
-                          <a:blip r:embed="rId17" cstate="print">
+                          <a:blip r:embed="rId13" cstate="print">
                             <a:extLst>
                               <a:ext uri="{28A0092B-C50C-407E-A947-70E740481C1C}">
                                 <a14:useLocalDpi xmlns:a14="http://schemas.microsoft.com/office/drawing/2010/main" val="0"/>
                               </a:ext>
                               <a:ext uri="{837473B0-CC2E-450A-ABE3-18F120FF3D39}">
-                                <a1611:picAttrSrcUrl xmlns:a1611="http://schemas.microsoft.com/office/drawing/2016/11/main" r:id="rId18"/>
+                                <a1611:picAttrSrcUrl xmlns:a1611="http://schemas.microsoft.com/office/drawing/2016/11/main" r:id="rId14"/>
                               </a:ext>
                             </a:extLst>
                           </a:blip>
@@ -23069,13 +22999,13 @@
                           </pic:cNvPicPr>
                         </pic:nvPicPr>
                         <pic:blipFill>
-                          <a:blip r:embed="rId17" cstate="print">
+                          <a:blip r:embed="rId13" cstate="print">
                             <a:extLst>
                               <a:ext uri="{28A0092B-C50C-407E-A947-70E740481C1C}">
                                 <a14:useLocalDpi xmlns:a14="http://schemas.microsoft.com/office/drawing/2010/main" val="0"/>
                               </a:ext>
                               <a:ext uri="{837473B0-CC2E-450A-ABE3-18F120FF3D39}">
-                                <a1611:picAttrSrcUrl xmlns:a1611="http://schemas.microsoft.com/office/drawing/2016/11/main" r:id="rId18"/>
+                                <a1611:picAttrSrcUrl xmlns:a1611="http://schemas.microsoft.com/office/drawing/2016/11/main" r:id="rId14"/>
                               </a:ext>
                             </a:extLst>
                           </a:blip>
@@ -23132,13 +23062,13 @@
                           </pic:cNvPicPr>
                         </pic:nvPicPr>
                         <pic:blipFill>
-                          <a:blip r:embed="rId17" cstate="print">
+                          <a:blip r:embed="rId13" cstate="print">
                             <a:extLst>
                               <a:ext uri="{28A0092B-C50C-407E-A947-70E740481C1C}">
                                 <a14:useLocalDpi xmlns:a14="http://schemas.microsoft.com/office/drawing/2010/main" val="0"/>
                               </a:ext>
                               <a:ext uri="{837473B0-CC2E-450A-ABE3-18F120FF3D39}">
-                                <a1611:picAttrSrcUrl xmlns:a1611="http://schemas.microsoft.com/office/drawing/2016/11/main" r:id="rId18"/>
+                                <a1611:picAttrSrcUrl xmlns:a1611="http://schemas.microsoft.com/office/drawing/2016/11/main" r:id="rId14"/>
                               </a:ext>
                             </a:extLst>
                           </a:blip>
@@ -23195,13 +23125,13 @@
                           </pic:cNvPicPr>
                         </pic:nvPicPr>
                         <pic:blipFill>
-                          <a:blip r:embed="rId17" cstate="print">
+                          <a:blip r:embed="rId13" cstate="print">
                             <a:extLst>
                               <a:ext uri="{28A0092B-C50C-407E-A947-70E740481C1C}">
                                 <a14:useLocalDpi xmlns:a14="http://schemas.microsoft.com/office/drawing/2010/main" val="0"/>
                               </a:ext>
                               <a:ext uri="{837473B0-CC2E-450A-ABE3-18F120FF3D39}">
-                                <a1611:picAttrSrcUrl xmlns:a1611="http://schemas.microsoft.com/office/drawing/2016/11/main" r:id="rId18"/>
+                                <a1611:picAttrSrcUrl xmlns:a1611="http://schemas.microsoft.com/office/drawing/2016/11/main" r:id="rId14"/>
                               </a:ext>
                             </a:extLst>
                           </a:blip>
@@ -23258,13 +23188,13 @@
                           </pic:cNvPicPr>
                         </pic:nvPicPr>
                         <pic:blipFill>
-                          <a:blip r:embed="rId17" cstate="print">
+                          <a:blip r:embed="rId13" cstate="print">
                             <a:extLst>
                               <a:ext uri="{28A0092B-C50C-407E-A947-70E740481C1C}">
                                 <a14:useLocalDpi xmlns:a14="http://schemas.microsoft.com/office/drawing/2010/main" val="0"/>
                               </a:ext>
                               <a:ext uri="{837473B0-CC2E-450A-ABE3-18F120FF3D39}">
-                                <a1611:picAttrSrcUrl xmlns:a1611="http://schemas.microsoft.com/office/drawing/2016/11/main" r:id="rId18"/>
+                                <a1611:picAttrSrcUrl xmlns:a1611="http://schemas.microsoft.com/office/drawing/2016/11/main" r:id="rId14"/>
                               </a:ext>
                             </a:extLst>
                           </a:blip>
@@ -23321,13 +23251,13 @@
                           </pic:cNvPicPr>
                         </pic:nvPicPr>
                         <pic:blipFill>
-                          <a:blip r:embed="rId17" cstate="print">
+                          <a:blip r:embed="rId13" cstate="print">
                             <a:extLst>
                               <a:ext uri="{28A0092B-C50C-407E-A947-70E740481C1C}">
                                 <a14:useLocalDpi xmlns:a14="http://schemas.microsoft.com/office/drawing/2010/main" val="0"/>
                               </a:ext>
                               <a:ext uri="{837473B0-CC2E-450A-ABE3-18F120FF3D39}">
-                                <a1611:picAttrSrcUrl xmlns:a1611="http://schemas.microsoft.com/office/drawing/2016/11/main" r:id="rId18"/>
+                                <a1611:picAttrSrcUrl xmlns:a1611="http://schemas.microsoft.com/office/drawing/2016/11/main" r:id="rId14"/>
                               </a:ext>
                             </a:extLst>
                           </a:blip>
@@ -23428,13 +23358,13 @@
                           </pic:cNvPicPr>
                         </pic:nvPicPr>
                         <pic:blipFill>
-                          <a:blip r:embed="rId17" cstate="print">
+                          <a:blip r:embed="rId13" cstate="print">
                             <a:extLst>
                               <a:ext uri="{28A0092B-C50C-407E-A947-70E740481C1C}">
                                 <a14:useLocalDpi xmlns:a14="http://schemas.microsoft.com/office/drawing/2010/main" val="0"/>
                               </a:ext>
                               <a:ext uri="{837473B0-CC2E-450A-ABE3-18F120FF3D39}">
-                                <a1611:picAttrSrcUrl xmlns:a1611="http://schemas.microsoft.com/office/drawing/2016/11/main" r:id="rId18"/>
+                                <a1611:picAttrSrcUrl xmlns:a1611="http://schemas.microsoft.com/office/drawing/2016/11/main" r:id="rId14"/>
                               </a:ext>
                             </a:extLst>
                           </a:blip>
@@ -23491,13 +23421,13 @@
                           </pic:cNvPicPr>
                         </pic:nvPicPr>
                         <pic:blipFill>
-                          <a:blip r:embed="rId17" cstate="print">
+                          <a:blip r:embed="rId13" cstate="print">
                             <a:extLst>
                               <a:ext uri="{28A0092B-C50C-407E-A947-70E740481C1C}">
                                 <a14:useLocalDpi xmlns:a14="http://schemas.microsoft.com/office/drawing/2010/main" val="0"/>
                               </a:ext>
                               <a:ext uri="{837473B0-CC2E-450A-ABE3-18F120FF3D39}">
-                                <a1611:picAttrSrcUrl xmlns:a1611="http://schemas.microsoft.com/office/drawing/2016/11/main" r:id="rId18"/>
+                                <a1611:picAttrSrcUrl xmlns:a1611="http://schemas.microsoft.com/office/drawing/2016/11/main" r:id="rId14"/>
                               </a:ext>
                             </a:extLst>
                           </a:blip>
@@ -23554,13 +23484,13 @@
                           </pic:cNvPicPr>
                         </pic:nvPicPr>
                         <pic:blipFill>
-                          <a:blip r:embed="rId17" cstate="print">
+                          <a:blip r:embed="rId13" cstate="print">
                             <a:extLst>
                               <a:ext uri="{28A0092B-C50C-407E-A947-70E740481C1C}">
                                 <a14:useLocalDpi xmlns:a14="http://schemas.microsoft.com/office/drawing/2010/main" val="0"/>
                               </a:ext>
                               <a:ext uri="{837473B0-CC2E-450A-ABE3-18F120FF3D39}">
-                                <a1611:picAttrSrcUrl xmlns:a1611="http://schemas.microsoft.com/office/drawing/2016/11/main" r:id="rId18"/>
+                                <a1611:picAttrSrcUrl xmlns:a1611="http://schemas.microsoft.com/office/drawing/2016/11/main" r:id="rId14"/>
                               </a:ext>
                             </a:extLst>
                           </a:blip>
@@ -23617,13 +23547,13 @@
                           </pic:cNvPicPr>
                         </pic:nvPicPr>
                         <pic:blipFill>
-                          <a:blip r:embed="rId17" cstate="print">
+                          <a:blip r:embed="rId13" cstate="print">
                             <a:extLst>
                               <a:ext uri="{28A0092B-C50C-407E-A947-70E740481C1C}">
                                 <a14:useLocalDpi xmlns:a14="http://schemas.microsoft.com/office/drawing/2010/main" val="0"/>
                               </a:ext>
                               <a:ext uri="{837473B0-CC2E-450A-ABE3-18F120FF3D39}">
-                                <a1611:picAttrSrcUrl xmlns:a1611="http://schemas.microsoft.com/office/drawing/2016/11/main" r:id="rId18"/>
+                                <a1611:picAttrSrcUrl xmlns:a1611="http://schemas.microsoft.com/office/drawing/2016/11/main" r:id="rId14"/>
                               </a:ext>
                             </a:extLst>
                           </a:blip>
@@ -23680,13 +23610,13 @@
                           </pic:cNvPicPr>
                         </pic:nvPicPr>
                         <pic:blipFill>
-                          <a:blip r:embed="rId17" cstate="print">
+                          <a:blip r:embed="rId13" cstate="print">
                             <a:extLst>
                               <a:ext uri="{28A0092B-C50C-407E-A947-70E740481C1C}">
                                 <a14:useLocalDpi xmlns:a14="http://schemas.microsoft.com/office/drawing/2010/main" val="0"/>
                               </a:ext>
                               <a:ext uri="{837473B0-CC2E-450A-ABE3-18F120FF3D39}">
-                                <a1611:picAttrSrcUrl xmlns:a1611="http://schemas.microsoft.com/office/drawing/2016/11/main" r:id="rId18"/>
+                                <a1611:picAttrSrcUrl xmlns:a1611="http://schemas.microsoft.com/office/drawing/2016/11/main" r:id="rId14"/>
                               </a:ext>
                             </a:extLst>
                           </a:blip>
@@ -23743,13 +23673,13 @@
                           </pic:cNvPicPr>
                         </pic:nvPicPr>
                         <pic:blipFill>
-                          <a:blip r:embed="rId17" cstate="print">
+                          <a:blip r:embed="rId13" cstate="print">
                             <a:extLst>
                               <a:ext uri="{28A0092B-C50C-407E-A947-70E740481C1C}">
                                 <a14:useLocalDpi xmlns:a14="http://schemas.microsoft.com/office/drawing/2010/main" val="0"/>
                               </a:ext>
                               <a:ext uri="{837473B0-CC2E-450A-ABE3-18F120FF3D39}">
-                                <a1611:picAttrSrcUrl xmlns:a1611="http://schemas.microsoft.com/office/drawing/2016/11/main" r:id="rId18"/>
+                                <a1611:picAttrSrcUrl xmlns:a1611="http://schemas.microsoft.com/office/drawing/2016/11/main" r:id="rId14"/>
                               </a:ext>
                             </a:extLst>
                           </a:blip>
@@ -23806,13 +23736,13 @@
                           </pic:cNvPicPr>
                         </pic:nvPicPr>
                         <pic:blipFill>
-                          <a:blip r:embed="rId17" cstate="print">
+                          <a:blip r:embed="rId13" cstate="print">
                             <a:extLst>
                               <a:ext uri="{28A0092B-C50C-407E-A947-70E740481C1C}">
                                 <a14:useLocalDpi xmlns:a14="http://schemas.microsoft.com/office/drawing/2010/main" val="0"/>
                               </a:ext>
                               <a:ext uri="{837473B0-CC2E-450A-ABE3-18F120FF3D39}">
-                                <a1611:picAttrSrcUrl xmlns:a1611="http://schemas.microsoft.com/office/drawing/2016/11/main" r:id="rId18"/>
+                                <a1611:picAttrSrcUrl xmlns:a1611="http://schemas.microsoft.com/office/drawing/2016/11/main" r:id="rId14"/>
                               </a:ext>
                             </a:extLst>
                           </a:blip>
@@ -23912,13 +23842,13 @@
                           </pic:cNvPicPr>
                         </pic:nvPicPr>
                         <pic:blipFill>
-                          <a:blip r:embed="rId17" cstate="print">
+                          <a:blip r:embed="rId13" cstate="print">
                             <a:extLst>
                               <a:ext uri="{28A0092B-C50C-407E-A947-70E740481C1C}">
                                 <a14:useLocalDpi xmlns:a14="http://schemas.microsoft.com/office/drawing/2010/main" val="0"/>
                               </a:ext>
                               <a:ext uri="{837473B0-CC2E-450A-ABE3-18F120FF3D39}">
-                                <a1611:picAttrSrcUrl xmlns:a1611="http://schemas.microsoft.com/office/drawing/2016/11/main" r:id="rId18"/>
+                                <a1611:picAttrSrcUrl xmlns:a1611="http://schemas.microsoft.com/office/drawing/2016/11/main" r:id="rId14"/>
                               </a:ext>
                             </a:extLst>
                           </a:blip>
@@ -23975,13 +23905,13 @@
                           </pic:cNvPicPr>
                         </pic:nvPicPr>
                         <pic:blipFill>
-                          <a:blip r:embed="rId17" cstate="print">
+                          <a:blip r:embed="rId13" cstate="print">
                             <a:extLst>
                               <a:ext uri="{28A0092B-C50C-407E-A947-70E740481C1C}">
                                 <a14:useLocalDpi xmlns:a14="http://schemas.microsoft.com/office/drawing/2010/main" val="0"/>
                               </a:ext>
                               <a:ext uri="{837473B0-CC2E-450A-ABE3-18F120FF3D39}">
-                                <a1611:picAttrSrcUrl xmlns:a1611="http://schemas.microsoft.com/office/drawing/2016/11/main" r:id="rId18"/>
+                                <a1611:picAttrSrcUrl xmlns:a1611="http://schemas.microsoft.com/office/drawing/2016/11/main" r:id="rId14"/>
                               </a:ext>
                             </a:extLst>
                           </a:blip>
@@ -24038,13 +23968,13 @@
                           </pic:cNvPicPr>
                         </pic:nvPicPr>
                         <pic:blipFill>
-                          <a:blip r:embed="rId17" cstate="print">
+                          <a:blip r:embed="rId13" cstate="print">
                             <a:extLst>
                               <a:ext uri="{28A0092B-C50C-407E-A947-70E740481C1C}">
                                 <a14:useLocalDpi xmlns:a14="http://schemas.microsoft.com/office/drawing/2010/main" val="0"/>
                               </a:ext>
                               <a:ext uri="{837473B0-CC2E-450A-ABE3-18F120FF3D39}">
-                                <a1611:picAttrSrcUrl xmlns:a1611="http://schemas.microsoft.com/office/drawing/2016/11/main" r:id="rId18"/>
+                                <a1611:picAttrSrcUrl xmlns:a1611="http://schemas.microsoft.com/office/drawing/2016/11/main" r:id="rId14"/>
                               </a:ext>
                             </a:extLst>
                           </a:blip>
@@ -24101,13 +24031,13 @@
                           </pic:cNvPicPr>
                         </pic:nvPicPr>
                         <pic:blipFill>
-                          <a:blip r:embed="rId17" cstate="print">
+                          <a:blip r:embed="rId13" cstate="print">
                             <a:extLst>
                               <a:ext uri="{28A0092B-C50C-407E-A947-70E740481C1C}">
                                 <a14:useLocalDpi xmlns:a14="http://schemas.microsoft.com/office/drawing/2010/main" val="0"/>
                               </a:ext>
                               <a:ext uri="{837473B0-CC2E-450A-ABE3-18F120FF3D39}">
-                                <a1611:picAttrSrcUrl xmlns:a1611="http://schemas.microsoft.com/office/drawing/2016/11/main" r:id="rId18"/>
+                                <a1611:picAttrSrcUrl xmlns:a1611="http://schemas.microsoft.com/office/drawing/2016/11/main" r:id="rId14"/>
                               </a:ext>
                             </a:extLst>
                           </a:blip>
@@ -24164,13 +24094,13 @@
                           </pic:cNvPicPr>
                         </pic:nvPicPr>
                         <pic:blipFill>
-                          <a:blip r:embed="rId17" cstate="print">
+                          <a:blip r:embed="rId13" cstate="print">
                             <a:extLst>
                               <a:ext uri="{28A0092B-C50C-407E-A947-70E740481C1C}">
                                 <a14:useLocalDpi xmlns:a14="http://schemas.microsoft.com/office/drawing/2010/main" val="0"/>
                               </a:ext>
                               <a:ext uri="{837473B0-CC2E-450A-ABE3-18F120FF3D39}">
-                                <a1611:picAttrSrcUrl xmlns:a1611="http://schemas.microsoft.com/office/drawing/2016/11/main" r:id="rId18"/>
+                                <a1611:picAttrSrcUrl xmlns:a1611="http://schemas.microsoft.com/office/drawing/2016/11/main" r:id="rId14"/>
                               </a:ext>
                             </a:extLst>
                           </a:blip>
@@ -24227,13 +24157,13 @@
                           </pic:cNvPicPr>
                         </pic:nvPicPr>
                         <pic:blipFill>
-                          <a:blip r:embed="rId17" cstate="print">
+                          <a:blip r:embed="rId13" cstate="print">
                             <a:extLst>
                               <a:ext uri="{28A0092B-C50C-407E-A947-70E740481C1C}">
                                 <a14:useLocalDpi xmlns:a14="http://schemas.microsoft.com/office/drawing/2010/main" val="0"/>
                               </a:ext>
                               <a:ext uri="{837473B0-CC2E-450A-ABE3-18F120FF3D39}">
-                                <a1611:picAttrSrcUrl xmlns:a1611="http://schemas.microsoft.com/office/drawing/2016/11/main" r:id="rId18"/>
+                                <a1611:picAttrSrcUrl xmlns:a1611="http://schemas.microsoft.com/office/drawing/2016/11/main" r:id="rId14"/>
                               </a:ext>
                             </a:extLst>
                           </a:blip>
@@ -24290,13 +24220,13 @@
                           </pic:cNvPicPr>
                         </pic:nvPicPr>
                         <pic:blipFill>
-                          <a:blip r:embed="rId17" cstate="print">
+                          <a:blip r:embed="rId13" cstate="print">
                             <a:extLst>
                               <a:ext uri="{28A0092B-C50C-407E-A947-70E740481C1C}">
                                 <a14:useLocalDpi xmlns:a14="http://schemas.microsoft.com/office/drawing/2010/main" val="0"/>
                               </a:ext>
                               <a:ext uri="{837473B0-CC2E-450A-ABE3-18F120FF3D39}">
-                                <a1611:picAttrSrcUrl xmlns:a1611="http://schemas.microsoft.com/office/drawing/2016/11/main" r:id="rId18"/>
+                                <a1611:picAttrSrcUrl xmlns:a1611="http://schemas.microsoft.com/office/drawing/2016/11/main" r:id="rId14"/>
                               </a:ext>
                             </a:extLst>
                           </a:blip>
@@ -24397,13 +24327,13 @@
                           </pic:cNvPicPr>
                         </pic:nvPicPr>
                         <pic:blipFill>
-                          <a:blip r:embed="rId17" cstate="print">
+                          <a:blip r:embed="rId13" cstate="print">
                             <a:extLst>
                               <a:ext uri="{28A0092B-C50C-407E-A947-70E740481C1C}">
                                 <a14:useLocalDpi xmlns:a14="http://schemas.microsoft.com/office/drawing/2010/main" val="0"/>
                               </a:ext>
                               <a:ext uri="{837473B0-CC2E-450A-ABE3-18F120FF3D39}">
-                                <a1611:picAttrSrcUrl xmlns:a1611="http://schemas.microsoft.com/office/drawing/2016/11/main" r:id="rId18"/>
+                                <a1611:picAttrSrcUrl xmlns:a1611="http://schemas.microsoft.com/office/drawing/2016/11/main" r:id="rId14"/>
                               </a:ext>
                             </a:extLst>
                           </a:blip>
@@ -24460,13 +24390,13 @@
                           </pic:cNvPicPr>
                         </pic:nvPicPr>
                         <pic:blipFill>
-                          <a:blip r:embed="rId17" cstate="print">
+                          <a:blip r:embed="rId13" cstate="print">
                             <a:extLst>
                               <a:ext uri="{28A0092B-C50C-407E-A947-70E740481C1C}">
                                 <a14:useLocalDpi xmlns:a14="http://schemas.microsoft.com/office/drawing/2010/main" val="0"/>
                               </a:ext>
                               <a:ext uri="{837473B0-CC2E-450A-ABE3-18F120FF3D39}">
-                                <a1611:picAttrSrcUrl xmlns:a1611="http://schemas.microsoft.com/office/drawing/2016/11/main" r:id="rId18"/>
+                                <a1611:picAttrSrcUrl xmlns:a1611="http://schemas.microsoft.com/office/drawing/2016/11/main" r:id="rId14"/>
                               </a:ext>
                             </a:extLst>
                           </a:blip>
@@ -24523,13 +24453,13 @@
                           </pic:cNvPicPr>
                         </pic:nvPicPr>
                         <pic:blipFill>
-                          <a:blip r:embed="rId17" cstate="print">
+                          <a:blip r:embed="rId13" cstate="print">
                             <a:extLst>
                               <a:ext uri="{28A0092B-C50C-407E-A947-70E740481C1C}">
                                 <a14:useLocalDpi xmlns:a14="http://schemas.microsoft.com/office/drawing/2010/main" val="0"/>
                               </a:ext>
                               <a:ext uri="{837473B0-CC2E-450A-ABE3-18F120FF3D39}">
-                                <a1611:picAttrSrcUrl xmlns:a1611="http://schemas.microsoft.com/office/drawing/2016/11/main" r:id="rId18"/>
+                                <a1611:picAttrSrcUrl xmlns:a1611="http://schemas.microsoft.com/office/drawing/2016/11/main" r:id="rId14"/>
                               </a:ext>
                             </a:extLst>
                           </a:blip>
@@ -24586,13 +24516,13 @@
                           </pic:cNvPicPr>
                         </pic:nvPicPr>
                         <pic:blipFill>
-                          <a:blip r:embed="rId17" cstate="print">
+                          <a:blip r:embed="rId13" cstate="print">
                             <a:extLst>
                               <a:ext uri="{28A0092B-C50C-407E-A947-70E740481C1C}">
                                 <a14:useLocalDpi xmlns:a14="http://schemas.microsoft.com/office/drawing/2010/main" val="0"/>
                               </a:ext>
                               <a:ext uri="{837473B0-CC2E-450A-ABE3-18F120FF3D39}">
-                                <a1611:picAttrSrcUrl xmlns:a1611="http://schemas.microsoft.com/office/drawing/2016/11/main" r:id="rId18"/>
+                                <a1611:picAttrSrcUrl xmlns:a1611="http://schemas.microsoft.com/office/drawing/2016/11/main" r:id="rId14"/>
                               </a:ext>
                             </a:extLst>
                           </a:blip>
@@ -24649,13 +24579,13 @@
                           </pic:cNvPicPr>
                         </pic:nvPicPr>
                         <pic:blipFill>
-                          <a:blip r:embed="rId17" cstate="print">
+                          <a:blip r:embed="rId13" cstate="print">
                             <a:extLst>
                               <a:ext uri="{28A0092B-C50C-407E-A947-70E740481C1C}">
                                 <a14:useLocalDpi xmlns:a14="http://schemas.microsoft.com/office/drawing/2010/main" val="0"/>
                               </a:ext>
                               <a:ext uri="{837473B0-CC2E-450A-ABE3-18F120FF3D39}">
-                                <a1611:picAttrSrcUrl xmlns:a1611="http://schemas.microsoft.com/office/drawing/2016/11/main" r:id="rId18"/>
+                                <a1611:picAttrSrcUrl xmlns:a1611="http://schemas.microsoft.com/office/drawing/2016/11/main" r:id="rId14"/>
                               </a:ext>
                             </a:extLst>
                           </a:blip>
@@ -24712,13 +24642,13 @@
                           </pic:cNvPicPr>
                         </pic:nvPicPr>
                         <pic:blipFill>
-                          <a:blip r:embed="rId17" cstate="print">
+                          <a:blip r:embed="rId13" cstate="print">
                             <a:extLst>
                               <a:ext uri="{28A0092B-C50C-407E-A947-70E740481C1C}">
                                 <a14:useLocalDpi xmlns:a14="http://schemas.microsoft.com/office/drawing/2010/main" val="0"/>
                               </a:ext>
                               <a:ext uri="{837473B0-CC2E-450A-ABE3-18F120FF3D39}">
-                                <a1611:picAttrSrcUrl xmlns:a1611="http://schemas.microsoft.com/office/drawing/2016/11/main" r:id="rId18"/>
+                                <a1611:picAttrSrcUrl xmlns:a1611="http://schemas.microsoft.com/office/drawing/2016/11/main" r:id="rId14"/>
                               </a:ext>
                             </a:extLst>
                           </a:blip>
@@ -24775,13 +24705,13 @@
                           </pic:cNvPicPr>
                         </pic:nvPicPr>
                         <pic:blipFill>
-                          <a:blip r:embed="rId17" cstate="print">
+                          <a:blip r:embed="rId13" cstate="print">
                             <a:extLst>
                               <a:ext uri="{28A0092B-C50C-407E-A947-70E740481C1C}">
                                 <a14:useLocalDpi xmlns:a14="http://schemas.microsoft.com/office/drawing/2010/main" val="0"/>
                               </a:ext>
                               <a:ext uri="{837473B0-CC2E-450A-ABE3-18F120FF3D39}">
-                                <a1611:picAttrSrcUrl xmlns:a1611="http://schemas.microsoft.com/office/drawing/2016/11/main" r:id="rId18"/>
+                                <a1611:picAttrSrcUrl xmlns:a1611="http://schemas.microsoft.com/office/drawing/2016/11/main" r:id="rId14"/>
                               </a:ext>
                             </a:extLst>
                           </a:blip>
@@ -24881,13 +24811,13 @@
                           </pic:cNvPicPr>
                         </pic:nvPicPr>
                         <pic:blipFill>
-                          <a:blip r:embed="rId17" cstate="print">
+                          <a:blip r:embed="rId13" cstate="print">
                             <a:extLst>
                               <a:ext uri="{28A0092B-C50C-407E-A947-70E740481C1C}">
                                 <a14:useLocalDpi xmlns:a14="http://schemas.microsoft.com/office/drawing/2010/main" val="0"/>
                               </a:ext>
                               <a:ext uri="{837473B0-CC2E-450A-ABE3-18F120FF3D39}">
-                                <a1611:picAttrSrcUrl xmlns:a1611="http://schemas.microsoft.com/office/drawing/2016/11/main" r:id="rId18"/>
+                                <a1611:picAttrSrcUrl xmlns:a1611="http://schemas.microsoft.com/office/drawing/2016/11/main" r:id="rId14"/>
                               </a:ext>
                             </a:extLst>
                           </a:blip>
@@ -24944,13 +24874,13 @@
                           </pic:cNvPicPr>
                         </pic:nvPicPr>
                         <pic:blipFill>
-                          <a:blip r:embed="rId17" cstate="print">
+                          <a:blip r:embed="rId13" cstate="print">
                             <a:extLst>
                               <a:ext uri="{28A0092B-C50C-407E-A947-70E740481C1C}">
                                 <a14:useLocalDpi xmlns:a14="http://schemas.microsoft.com/office/drawing/2010/main" val="0"/>
                               </a:ext>
                               <a:ext uri="{837473B0-CC2E-450A-ABE3-18F120FF3D39}">
-                                <a1611:picAttrSrcUrl xmlns:a1611="http://schemas.microsoft.com/office/drawing/2016/11/main" r:id="rId18"/>
+                                <a1611:picAttrSrcUrl xmlns:a1611="http://schemas.microsoft.com/office/drawing/2016/11/main" r:id="rId14"/>
                               </a:ext>
                             </a:extLst>
                           </a:blip>
@@ -25007,13 +24937,13 @@
                           </pic:cNvPicPr>
                         </pic:nvPicPr>
                         <pic:blipFill>
-                          <a:blip r:embed="rId17" cstate="print">
+                          <a:blip r:embed="rId13" cstate="print">
                             <a:extLst>
                               <a:ext uri="{28A0092B-C50C-407E-A947-70E740481C1C}">
                                 <a14:useLocalDpi xmlns:a14="http://schemas.microsoft.com/office/drawing/2010/main" val="0"/>
                               </a:ext>
                               <a:ext uri="{837473B0-CC2E-450A-ABE3-18F120FF3D39}">
-                                <a1611:picAttrSrcUrl xmlns:a1611="http://schemas.microsoft.com/office/drawing/2016/11/main" r:id="rId18"/>
+                                <a1611:picAttrSrcUrl xmlns:a1611="http://schemas.microsoft.com/office/drawing/2016/11/main" r:id="rId14"/>
                               </a:ext>
                             </a:extLst>
                           </a:blip>
@@ -25070,13 +25000,13 @@
                           </pic:cNvPicPr>
                         </pic:nvPicPr>
                         <pic:blipFill>
-                          <a:blip r:embed="rId17" cstate="print">
+                          <a:blip r:embed="rId13" cstate="print">
                             <a:extLst>
                               <a:ext uri="{28A0092B-C50C-407E-A947-70E740481C1C}">
                                 <a14:useLocalDpi xmlns:a14="http://schemas.microsoft.com/office/drawing/2010/main" val="0"/>
                               </a:ext>
                               <a:ext uri="{837473B0-CC2E-450A-ABE3-18F120FF3D39}">
-                                <a1611:picAttrSrcUrl xmlns:a1611="http://schemas.microsoft.com/office/drawing/2016/11/main" r:id="rId18"/>
+                                <a1611:picAttrSrcUrl xmlns:a1611="http://schemas.microsoft.com/office/drawing/2016/11/main" r:id="rId14"/>
                               </a:ext>
                             </a:extLst>
                           </a:blip>
@@ -25133,13 +25063,13 @@
                           </pic:cNvPicPr>
                         </pic:nvPicPr>
                         <pic:blipFill>
-                          <a:blip r:embed="rId17" cstate="print">
+                          <a:blip r:embed="rId13" cstate="print">
                             <a:extLst>
                               <a:ext uri="{28A0092B-C50C-407E-A947-70E740481C1C}">
                                 <a14:useLocalDpi xmlns:a14="http://schemas.microsoft.com/office/drawing/2010/main" val="0"/>
                               </a:ext>
                               <a:ext uri="{837473B0-CC2E-450A-ABE3-18F120FF3D39}">
-                                <a1611:picAttrSrcUrl xmlns:a1611="http://schemas.microsoft.com/office/drawing/2016/11/main" r:id="rId18"/>
+                                <a1611:picAttrSrcUrl xmlns:a1611="http://schemas.microsoft.com/office/drawing/2016/11/main" r:id="rId14"/>
                               </a:ext>
                             </a:extLst>
                           </a:blip>
@@ -25196,13 +25126,13 @@
                           </pic:cNvPicPr>
                         </pic:nvPicPr>
                         <pic:blipFill>
-                          <a:blip r:embed="rId17" cstate="print">
+                          <a:blip r:embed="rId13" cstate="print">
                             <a:extLst>
                               <a:ext uri="{28A0092B-C50C-407E-A947-70E740481C1C}">
                                 <a14:useLocalDpi xmlns:a14="http://schemas.microsoft.com/office/drawing/2010/main" val="0"/>
                               </a:ext>
                               <a:ext uri="{837473B0-CC2E-450A-ABE3-18F120FF3D39}">
-                                <a1611:picAttrSrcUrl xmlns:a1611="http://schemas.microsoft.com/office/drawing/2016/11/main" r:id="rId18"/>
+                                <a1611:picAttrSrcUrl xmlns:a1611="http://schemas.microsoft.com/office/drawing/2016/11/main" r:id="rId14"/>
                               </a:ext>
                             </a:extLst>
                           </a:blip>
@@ -25259,13 +25189,13 @@
                           </pic:cNvPicPr>
                         </pic:nvPicPr>
                         <pic:blipFill>
-                          <a:blip r:embed="rId17" cstate="print">
+                          <a:blip r:embed="rId13" cstate="print">
                             <a:extLst>
                               <a:ext uri="{28A0092B-C50C-407E-A947-70E740481C1C}">
                                 <a14:useLocalDpi xmlns:a14="http://schemas.microsoft.com/office/drawing/2010/main" val="0"/>
                               </a:ext>
                               <a:ext uri="{837473B0-CC2E-450A-ABE3-18F120FF3D39}">
-                                <a1611:picAttrSrcUrl xmlns:a1611="http://schemas.microsoft.com/office/drawing/2016/11/main" r:id="rId18"/>
+                                <a1611:picAttrSrcUrl xmlns:a1611="http://schemas.microsoft.com/office/drawing/2016/11/main" r:id="rId14"/>
                               </a:ext>
                             </a:extLst>
                           </a:blip>
@@ -25366,13 +25296,13 @@
                           </pic:cNvPicPr>
                         </pic:nvPicPr>
                         <pic:blipFill>
-                          <a:blip r:embed="rId17" cstate="print">
+                          <a:blip r:embed="rId13" cstate="print">
                             <a:extLst>
                               <a:ext uri="{28A0092B-C50C-407E-A947-70E740481C1C}">
                                 <a14:useLocalDpi xmlns:a14="http://schemas.microsoft.com/office/drawing/2010/main" val="0"/>
                               </a:ext>
                               <a:ext uri="{837473B0-CC2E-450A-ABE3-18F120FF3D39}">
-                                <a1611:picAttrSrcUrl xmlns:a1611="http://schemas.microsoft.com/office/drawing/2016/11/main" r:id="rId18"/>
+                                <a1611:picAttrSrcUrl xmlns:a1611="http://schemas.microsoft.com/office/drawing/2016/11/main" r:id="rId14"/>
                               </a:ext>
                             </a:extLst>
                           </a:blip>
@@ -25429,13 +25359,13 @@
                           </pic:cNvPicPr>
                         </pic:nvPicPr>
                         <pic:blipFill>
-                          <a:blip r:embed="rId17" cstate="print">
+                          <a:blip r:embed="rId13" cstate="print">
                             <a:extLst>
                               <a:ext uri="{28A0092B-C50C-407E-A947-70E740481C1C}">
                                 <a14:useLocalDpi xmlns:a14="http://schemas.microsoft.com/office/drawing/2010/main" val="0"/>
                               </a:ext>
                               <a:ext uri="{837473B0-CC2E-450A-ABE3-18F120FF3D39}">
-                                <a1611:picAttrSrcUrl xmlns:a1611="http://schemas.microsoft.com/office/drawing/2016/11/main" r:id="rId18"/>
+                                <a1611:picAttrSrcUrl xmlns:a1611="http://schemas.microsoft.com/office/drawing/2016/11/main" r:id="rId14"/>
                               </a:ext>
                             </a:extLst>
                           </a:blip>
@@ -25492,13 +25422,13 @@
                           </pic:cNvPicPr>
                         </pic:nvPicPr>
                         <pic:blipFill>
-                          <a:blip r:embed="rId17" cstate="print">
+                          <a:blip r:embed="rId13" cstate="print">
                             <a:extLst>
                               <a:ext uri="{28A0092B-C50C-407E-A947-70E740481C1C}">
                                 <a14:useLocalDpi xmlns:a14="http://schemas.microsoft.com/office/drawing/2010/main" val="0"/>
                               </a:ext>
                               <a:ext uri="{837473B0-CC2E-450A-ABE3-18F120FF3D39}">
-                                <a1611:picAttrSrcUrl xmlns:a1611="http://schemas.microsoft.com/office/drawing/2016/11/main" r:id="rId18"/>
+                                <a1611:picAttrSrcUrl xmlns:a1611="http://schemas.microsoft.com/office/drawing/2016/11/main" r:id="rId14"/>
                               </a:ext>
                             </a:extLst>
                           </a:blip>
@@ -25555,13 +25485,13 @@
                           </pic:cNvPicPr>
                         </pic:nvPicPr>
                         <pic:blipFill>
-                          <a:blip r:embed="rId17" cstate="print">
+                          <a:blip r:embed="rId13" cstate="print">
                             <a:extLst>
                               <a:ext uri="{28A0092B-C50C-407E-A947-70E740481C1C}">
                                 <a14:useLocalDpi xmlns:a14="http://schemas.microsoft.com/office/drawing/2010/main" val="0"/>
                               </a:ext>
                               <a:ext uri="{837473B0-CC2E-450A-ABE3-18F120FF3D39}">
-                                <a1611:picAttrSrcUrl xmlns:a1611="http://schemas.microsoft.com/office/drawing/2016/11/main" r:id="rId18"/>
+                                <a1611:picAttrSrcUrl xmlns:a1611="http://schemas.microsoft.com/office/drawing/2016/11/main" r:id="rId14"/>
                               </a:ext>
                             </a:extLst>
                           </a:blip>
@@ -25618,13 +25548,13 @@
                           </pic:cNvPicPr>
                         </pic:nvPicPr>
                         <pic:blipFill>
-                          <a:blip r:embed="rId17" cstate="print">
+                          <a:blip r:embed="rId13" cstate="print">
                             <a:extLst>
                               <a:ext uri="{28A0092B-C50C-407E-A947-70E740481C1C}">
                                 <a14:useLocalDpi xmlns:a14="http://schemas.microsoft.com/office/drawing/2010/main" val="0"/>
                               </a:ext>
                               <a:ext uri="{837473B0-CC2E-450A-ABE3-18F120FF3D39}">
-                                <a1611:picAttrSrcUrl xmlns:a1611="http://schemas.microsoft.com/office/drawing/2016/11/main" r:id="rId18"/>
+                                <a1611:picAttrSrcUrl xmlns:a1611="http://schemas.microsoft.com/office/drawing/2016/11/main" r:id="rId14"/>
                               </a:ext>
                             </a:extLst>
                           </a:blip>
@@ -25681,13 +25611,13 @@
                           </pic:cNvPicPr>
                         </pic:nvPicPr>
                         <pic:blipFill>
-                          <a:blip r:embed="rId17" cstate="print">
+                          <a:blip r:embed="rId13" cstate="print">
                             <a:extLst>
                               <a:ext uri="{28A0092B-C50C-407E-A947-70E740481C1C}">
                                 <a14:useLocalDpi xmlns:a14="http://schemas.microsoft.com/office/drawing/2010/main" val="0"/>
                               </a:ext>
                               <a:ext uri="{837473B0-CC2E-450A-ABE3-18F120FF3D39}">
-                                <a1611:picAttrSrcUrl xmlns:a1611="http://schemas.microsoft.com/office/drawing/2016/11/main" r:id="rId18"/>
+                                <a1611:picAttrSrcUrl xmlns:a1611="http://schemas.microsoft.com/office/drawing/2016/11/main" r:id="rId14"/>
                               </a:ext>
                             </a:extLst>
                           </a:blip>
@@ -25744,13 +25674,13 @@
                           </pic:cNvPicPr>
                         </pic:nvPicPr>
                         <pic:blipFill>
-                          <a:blip r:embed="rId17" cstate="print">
+                          <a:blip r:embed="rId13" cstate="print">
                             <a:extLst>
                               <a:ext uri="{28A0092B-C50C-407E-A947-70E740481C1C}">
                                 <a14:useLocalDpi xmlns:a14="http://schemas.microsoft.com/office/drawing/2010/main" val="0"/>
                               </a:ext>
                               <a:ext uri="{837473B0-CC2E-450A-ABE3-18F120FF3D39}">
-                                <a1611:picAttrSrcUrl xmlns:a1611="http://schemas.microsoft.com/office/drawing/2016/11/main" r:id="rId18"/>
+                                <a1611:picAttrSrcUrl xmlns:a1611="http://schemas.microsoft.com/office/drawing/2016/11/main" r:id="rId14"/>
                               </a:ext>
                             </a:extLst>
                           </a:blip>
@@ -25850,13 +25780,13 @@
                           </pic:cNvPicPr>
                         </pic:nvPicPr>
                         <pic:blipFill>
-                          <a:blip r:embed="rId17" cstate="print">
+                          <a:blip r:embed="rId13" cstate="print">
                             <a:extLst>
                               <a:ext uri="{28A0092B-C50C-407E-A947-70E740481C1C}">
                                 <a14:useLocalDpi xmlns:a14="http://schemas.microsoft.com/office/drawing/2010/main" val="0"/>
                               </a:ext>
                               <a:ext uri="{837473B0-CC2E-450A-ABE3-18F120FF3D39}">
-                                <a1611:picAttrSrcUrl xmlns:a1611="http://schemas.microsoft.com/office/drawing/2016/11/main" r:id="rId18"/>
+                                <a1611:picAttrSrcUrl xmlns:a1611="http://schemas.microsoft.com/office/drawing/2016/11/main" r:id="rId14"/>
                               </a:ext>
                             </a:extLst>
                           </a:blip>
@@ -25913,13 +25843,13 @@
                           </pic:cNvPicPr>
                         </pic:nvPicPr>
                         <pic:blipFill>
-                          <a:blip r:embed="rId17" cstate="print">
+                          <a:blip r:embed="rId13" cstate="print">
                             <a:extLst>
                               <a:ext uri="{28A0092B-C50C-407E-A947-70E740481C1C}">
                                 <a14:useLocalDpi xmlns:a14="http://schemas.microsoft.com/office/drawing/2010/main" val="0"/>
                               </a:ext>
                               <a:ext uri="{837473B0-CC2E-450A-ABE3-18F120FF3D39}">
-                                <a1611:picAttrSrcUrl xmlns:a1611="http://schemas.microsoft.com/office/drawing/2016/11/main" r:id="rId18"/>
+                                <a1611:picAttrSrcUrl xmlns:a1611="http://schemas.microsoft.com/office/drawing/2016/11/main" r:id="rId14"/>
                               </a:ext>
                             </a:extLst>
                           </a:blip>
@@ -25976,13 +25906,13 @@
                           </pic:cNvPicPr>
                         </pic:nvPicPr>
                         <pic:blipFill>
-                          <a:blip r:embed="rId17" cstate="print">
+                          <a:blip r:embed="rId13" cstate="print">
                             <a:extLst>
                               <a:ext uri="{28A0092B-C50C-407E-A947-70E740481C1C}">
                                 <a14:useLocalDpi xmlns:a14="http://schemas.microsoft.com/office/drawing/2010/main" val="0"/>
                               </a:ext>
                               <a:ext uri="{837473B0-CC2E-450A-ABE3-18F120FF3D39}">
-                                <a1611:picAttrSrcUrl xmlns:a1611="http://schemas.microsoft.com/office/drawing/2016/11/main" r:id="rId18"/>
+                                <a1611:picAttrSrcUrl xmlns:a1611="http://schemas.microsoft.com/office/drawing/2016/11/main" r:id="rId14"/>
                               </a:ext>
                             </a:extLst>
                           </a:blip>
@@ -26039,13 +25969,13 @@
                           </pic:cNvPicPr>
                         </pic:nvPicPr>
                         <pic:blipFill>
-                          <a:blip r:embed="rId17" cstate="print">
+                          <a:blip r:embed="rId13" cstate="print">
                             <a:extLst>
                               <a:ext uri="{28A0092B-C50C-407E-A947-70E740481C1C}">
                                 <a14:useLocalDpi xmlns:a14="http://schemas.microsoft.com/office/drawing/2010/main" val="0"/>
                               </a:ext>
                               <a:ext uri="{837473B0-CC2E-450A-ABE3-18F120FF3D39}">
-                                <a1611:picAttrSrcUrl xmlns:a1611="http://schemas.microsoft.com/office/drawing/2016/11/main" r:id="rId18"/>
+                                <a1611:picAttrSrcUrl xmlns:a1611="http://schemas.microsoft.com/office/drawing/2016/11/main" r:id="rId14"/>
                               </a:ext>
                             </a:extLst>
                           </a:blip>
@@ -26102,13 +26032,13 @@
                           </pic:cNvPicPr>
                         </pic:nvPicPr>
                         <pic:blipFill>
-                          <a:blip r:embed="rId17" cstate="print">
+                          <a:blip r:embed="rId13" cstate="print">
                             <a:extLst>
                               <a:ext uri="{28A0092B-C50C-407E-A947-70E740481C1C}">
                                 <a14:useLocalDpi xmlns:a14="http://schemas.microsoft.com/office/drawing/2010/main" val="0"/>
                               </a:ext>
                               <a:ext uri="{837473B0-CC2E-450A-ABE3-18F120FF3D39}">
-                                <a1611:picAttrSrcUrl xmlns:a1611="http://schemas.microsoft.com/office/drawing/2016/11/main" r:id="rId18"/>
+                                <a1611:picAttrSrcUrl xmlns:a1611="http://schemas.microsoft.com/office/drawing/2016/11/main" r:id="rId14"/>
                               </a:ext>
                             </a:extLst>
                           </a:blip>
@@ -26165,13 +26095,13 @@
                           </pic:cNvPicPr>
                         </pic:nvPicPr>
                         <pic:blipFill>
-                          <a:blip r:embed="rId17" cstate="print">
+                          <a:blip r:embed="rId13" cstate="print">
                             <a:extLst>
                               <a:ext uri="{28A0092B-C50C-407E-A947-70E740481C1C}">
                                 <a14:useLocalDpi xmlns:a14="http://schemas.microsoft.com/office/drawing/2010/main" val="0"/>
                               </a:ext>
                               <a:ext uri="{837473B0-CC2E-450A-ABE3-18F120FF3D39}">
-                                <a1611:picAttrSrcUrl xmlns:a1611="http://schemas.microsoft.com/office/drawing/2016/11/main" r:id="rId18"/>
+                                <a1611:picAttrSrcUrl xmlns:a1611="http://schemas.microsoft.com/office/drawing/2016/11/main" r:id="rId14"/>
                               </a:ext>
                             </a:extLst>
                           </a:blip>
@@ -26228,13 +26158,13 @@
                           </pic:cNvPicPr>
                         </pic:nvPicPr>
                         <pic:blipFill>
-                          <a:blip r:embed="rId17" cstate="print">
+                          <a:blip r:embed="rId13" cstate="print">
                             <a:extLst>
                               <a:ext uri="{28A0092B-C50C-407E-A947-70E740481C1C}">
                                 <a14:useLocalDpi xmlns:a14="http://schemas.microsoft.com/office/drawing/2010/main" val="0"/>
                               </a:ext>
                               <a:ext uri="{837473B0-CC2E-450A-ABE3-18F120FF3D39}">
-                                <a1611:picAttrSrcUrl xmlns:a1611="http://schemas.microsoft.com/office/drawing/2016/11/main" r:id="rId18"/>
+                                <a1611:picAttrSrcUrl xmlns:a1611="http://schemas.microsoft.com/office/drawing/2016/11/main" r:id="rId14"/>
                               </a:ext>
                             </a:extLst>
                           </a:blip>
@@ -26335,13 +26265,13 @@
                           </pic:cNvPicPr>
                         </pic:nvPicPr>
                         <pic:blipFill>
-                          <a:blip r:embed="rId17" cstate="print">
+                          <a:blip r:embed="rId13" cstate="print">
                             <a:extLst>
                               <a:ext uri="{28A0092B-C50C-407E-A947-70E740481C1C}">
                                 <a14:useLocalDpi xmlns:a14="http://schemas.microsoft.com/office/drawing/2010/main" val="0"/>
                               </a:ext>
                               <a:ext uri="{837473B0-CC2E-450A-ABE3-18F120FF3D39}">
-                                <a1611:picAttrSrcUrl xmlns:a1611="http://schemas.microsoft.com/office/drawing/2016/11/main" r:id="rId18"/>
+                                <a1611:picAttrSrcUrl xmlns:a1611="http://schemas.microsoft.com/office/drawing/2016/11/main" r:id="rId14"/>
                               </a:ext>
                             </a:extLst>
                           </a:blip>
@@ -26398,13 +26328,13 @@
                           </pic:cNvPicPr>
                         </pic:nvPicPr>
                         <pic:blipFill>
-                          <a:blip r:embed="rId17" cstate="print">
+                          <a:blip r:embed="rId13" cstate="print">
                             <a:extLst>
                               <a:ext uri="{28A0092B-C50C-407E-A947-70E740481C1C}">
                                 <a14:useLocalDpi xmlns:a14="http://schemas.microsoft.com/office/drawing/2010/main" val="0"/>
                               </a:ext>
                               <a:ext uri="{837473B0-CC2E-450A-ABE3-18F120FF3D39}">
-                                <a1611:picAttrSrcUrl xmlns:a1611="http://schemas.microsoft.com/office/drawing/2016/11/main" r:id="rId18"/>
+                                <a1611:picAttrSrcUrl xmlns:a1611="http://schemas.microsoft.com/office/drawing/2016/11/main" r:id="rId14"/>
                               </a:ext>
                             </a:extLst>
                           </a:blip>
@@ -26461,13 +26391,13 @@
                           </pic:cNvPicPr>
                         </pic:nvPicPr>
                         <pic:blipFill>
-                          <a:blip r:embed="rId17" cstate="print">
+                          <a:blip r:embed="rId13" cstate="print">
                             <a:extLst>
                               <a:ext uri="{28A0092B-C50C-407E-A947-70E740481C1C}">
                                 <a14:useLocalDpi xmlns:a14="http://schemas.microsoft.com/office/drawing/2010/main" val="0"/>
                               </a:ext>
                               <a:ext uri="{837473B0-CC2E-450A-ABE3-18F120FF3D39}">
-                                <a1611:picAttrSrcUrl xmlns:a1611="http://schemas.microsoft.com/office/drawing/2016/11/main" r:id="rId18"/>
+                                <a1611:picAttrSrcUrl xmlns:a1611="http://schemas.microsoft.com/office/drawing/2016/11/main" r:id="rId14"/>
                               </a:ext>
                             </a:extLst>
                           </a:blip>
@@ -26524,13 +26454,13 @@
                           </pic:cNvPicPr>
                         </pic:nvPicPr>
                         <pic:blipFill>
-                          <a:blip r:embed="rId17" cstate="print">
+                          <a:blip r:embed="rId13" cstate="print">
                             <a:extLst>
                               <a:ext uri="{28A0092B-C50C-407E-A947-70E740481C1C}">
                                 <a14:useLocalDpi xmlns:a14="http://schemas.microsoft.com/office/drawing/2010/main" val="0"/>
                               </a:ext>
                               <a:ext uri="{837473B0-CC2E-450A-ABE3-18F120FF3D39}">
-                                <a1611:picAttrSrcUrl xmlns:a1611="http://schemas.microsoft.com/office/drawing/2016/11/main" r:id="rId18"/>
+                                <a1611:picAttrSrcUrl xmlns:a1611="http://schemas.microsoft.com/office/drawing/2016/11/main" r:id="rId14"/>
                               </a:ext>
                             </a:extLst>
                           </a:blip>
@@ -26587,13 +26517,13 @@
                           </pic:cNvPicPr>
                         </pic:nvPicPr>
                         <pic:blipFill>
-                          <a:blip r:embed="rId17" cstate="print">
+                          <a:blip r:embed="rId13" cstate="print">
                             <a:extLst>
                               <a:ext uri="{28A0092B-C50C-407E-A947-70E740481C1C}">
                                 <a14:useLocalDpi xmlns:a14="http://schemas.microsoft.com/office/drawing/2010/main" val="0"/>
                               </a:ext>
                               <a:ext uri="{837473B0-CC2E-450A-ABE3-18F120FF3D39}">
-                                <a1611:picAttrSrcUrl xmlns:a1611="http://schemas.microsoft.com/office/drawing/2016/11/main" r:id="rId18"/>
+                                <a1611:picAttrSrcUrl xmlns:a1611="http://schemas.microsoft.com/office/drawing/2016/11/main" r:id="rId14"/>
                               </a:ext>
                             </a:extLst>
                           </a:blip>
@@ -26650,13 +26580,13 @@
                           </pic:cNvPicPr>
                         </pic:nvPicPr>
                         <pic:blipFill>
-                          <a:blip r:embed="rId17" cstate="print">
+                          <a:blip r:embed="rId13" cstate="print">
                             <a:extLst>
                               <a:ext uri="{28A0092B-C50C-407E-A947-70E740481C1C}">
                                 <a14:useLocalDpi xmlns:a14="http://schemas.microsoft.com/office/drawing/2010/main" val="0"/>
                               </a:ext>
                               <a:ext uri="{837473B0-CC2E-450A-ABE3-18F120FF3D39}">
-                                <a1611:picAttrSrcUrl xmlns:a1611="http://schemas.microsoft.com/office/drawing/2016/11/main" r:id="rId18"/>
+                                <a1611:picAttrSrcUrl xmlns:a1611="http://schemas.microsoft.com/office/drawing/2016/11/main" r:id="rId14"/>
                               </a:ext>
                             </a:extLst>
                           </a:blip>
@@ -26713,13 +26643,13 @@
                           </pic:cNvPicPr>
                         </pic:nvPicPr>
                         <pic:blipFill>
-                          <a:blip r:embed="rId17" cstate="print">
+                          <a:blip r:embed="rId13" cstate="print">
                             <a:extLst>
                               <a:ext uri="{28A0092B-C50C-407E-A947-70E740481C1C}">
                                 <a14:useLocalDpi xmlns:a14="http://schemas.microsoft.com/office/drawing/2010/main" val="0"/>
                               </a:ext>
                               <a:ext uri="{837473B0-CC2E-450A-ABE3-18F120FF3D39}">
-                                <a1611:picAttrSrcUrl xmlns:a1611="http://schemas.microsoft.com/office/drawing/2016/11/main" r:id="rId18"/>
+                                <a1611:picAttrSrcUrl xmlns:a1611="http://schemas.microsoft.com/office/drawing/2016/11/main" r:id="rId14"/>
                               </a:ext>
                             </a:extLst>
                           </a:blip>
@@ -26819,13 +26749,13 @@
                           </pic:cNvPicPr>
                         </pic:nvPicPr>
                         <pic:blipFill>
-                          <a:blip r:embed="rId17" cstate="print">
+                          <a:blip r:embed="rId13" cstate="print">
                             <a:extLst>
                               <a:ext uri="{28A0092B-C50C-407E-A947-70E740481C1C}">
                                 <a14:useLocalDpi xmlns:a14="http://schemas.microsoft.com/office/drawing/2010/main" val="0"/>
                               </a:ext>
                               <a:ext uri="{837473B0-CC2E-450A-ABE3-18F120FF3D39}">
-                                <a1611:picAttrSrcUrl xmlns:a1611="http://schemas.microsoft.com/office/drawing/2016/11/main" r:id="rId18"/>
+                                <a1611:picAttrSrcUrl xmlns:a1611="http://schemas.microsoft.com/office/drawing/2016/11/main" r:id="rId14"/>
                               </a:ext>
                             </a:extLst>
                           </a:blip>
@@ -26882,13 +26812,13 @@
                           </pic:cNvPicPr>
                         </pic:nvPicPr>
                         <pic:blipFill>
-                          <a:blip r:embed="rId17" cstate="print">
+                          <a:blip r:embed="rId13" cstate="print">
                             <a:extLst>
                               <a:ext uri="{28A0092B-C50C-407E-A947-70E740481C1C}">
                                 <a14:useLocalDpi xmlns:a14="http://schemas.microsoft.com/office/drawing/2010/main" val="0"/>
                               </a:ext>
                               <a:ext uri="{837473B0-CC2E-450A-ABE3-18F120FF3D39}">
-                                <a1611:picAttrSrcUrl xmlns:a1611="http://schemas.microsoft.com/office/drawing/2016/11/main" r:id="rId18"/>
+                                <a1611:picAttrSrcUrl xmlns:a1611="http://schemas.microsoft.com/office/drawing/2016/11/main" r:id="rId14"/>
                               </a:ext>
                             </a:extLst>
                           </a:blip>
@@ -26945,13 +26875,13 @@
                           </pic:cNvPicPr>
                         </pic:nvPicPr>
                         <pic:blipFill>
-                          <a:blip r:embed="rId17" cstate="print">
+                          <a:blip r:embed="rId13" cstate="print">
                             <a:extLst>
                               <a:ext uri="{28A0092B-C50C-407E-A947-70E740481C1C}">
                                 <a14:useLocalDpi xmlns:a14="http://schemas.microsoft.com/office/drawing/2010/main" val="0"/>
                               </a:ext>
                               <a:ext uri="{837473B0-CC2E-450A-ABE3-18F120FF3D39}">
-                                <a1611:picAttrSrcUrl xmlns:a1611="http://schemas.microsoft.com/office/drawing/2016/11/main" r:id="rId18"/>
+                                <a1611:picAttrSrcUrl xmlns:a1611="http://schemas.microsoft.com/office/drawing/2016/11/main" r:id="rId14"/>
                               </a:ext>
                             </a:extLst>
                           </a:blip>
@@ -27008,13 +26938,13 @@
                           </pic:cNvPicPr>
                         </pic:nvPicPr>
                         <pic:blipFill>
-                          <a:blip r:embed="rId17" cstate="print">
+                          <a:blip r:embed="rId13" cstate="print">
                             <a:extLst>
                               <a:ext uri="{28A0092B-C50C-407E-A947-70E740481C1C}">
                                 <a14:useLocalDpi xmlns:a14="http://schemas.microsoft.com/office/drawing/2010/main" val="0"/>
                               </a:ext>
                               <a:ext uri="{837473B0-CC2E-450A-ABE3-18F120FF3D39}">
-                                <a1611:picAttrSrcUrl xmlns:a1611="http://schemas.microsoft.com/office/drawing/2016/11/main" r:id="rId18"/>
+                                <a1611:picAttrSrcUrl xmlns:a1611="http://schemas.microsoft.com/office/drawing/2016/11/main" r:id="rId14"/>
                               </a:ext>
                             </a:extLst>
                           </a:blip>
@@ -27071,13 +27001,13 @@
                           </pic:cNvPicPr>
                         </pic:nvPicPr>
                         <pic:blipFill>
-                          <a:blip r:embed="rId17" cstate="print">
+                          <a:blip r:embed="rId13" cstate="print">
                             <a:extLst>
                               <a:ext uri="{28A0092B-C50C-407E-A947-70E740481C1C}">
                                 <a14:useLocalDpi xmlns:a14="http://schemas.microsoft.com/office/drawing/2010/main" val="0"/>
                               </a:ext>
                               <a:ext uri="{837473B0-CC2E-450A-ABE3-18F120FF3D39}">
-                                <a1611:picAttrSrcUrl xmlns:a1611="http://schemas.microsoft.com/office/drawing/2016/11/main" r:id="rId18"/>
+                                <a1611:picAttrSrcUrl xmlns:a1611="http://schemas.microsoft.com/office/drawing/2016/11/main" r:id="rId14"/>
                               </a:ext>
                             </a:extLst>
                           </a:blip>
@@ -27134,13 +27064,13 @@
                           </pic:cNvPicPr>
                         </pic:nvPicPr>
                         <pic:blipFill>
-                          <a:blip r:embed="rId17" cstate="print">
+                          <a:blip r:embed="rId13" cstate="print">
                             <a:extLst>
                               <a:ext uri="{28A0092B-C50C-407E-A947-70E740481C1C}">
                                 <a14:useLocalDpi xmlns:a14="http://schemas.microsoft.com/office/drawing/2010/main" val="0"/>
                               </a:ext>
                               <a:ext uri="{837473B0-CC2E-450A-ABE3-18F120FF3D39}">
-                                <a1611:picAttrSrcUrl xmlns:a1611="http://schemas.microsoft.com/office/drawing/2016/11/main" r:id="rId18"/>
+                                <a1611:picAttrSrcUrl xmlns:a1611="http://schemas.microsoft.com/office/drawing/2016/11/main" r:id="rId14"/>
                               </a:ext>
                             </a:extLst>
                           </a:blip>
@@ -27197,13 +27127,13 @@
                           </pic:cNvPicPr>
                         </pic:nvPicPr>
                         <pic:blipFill>
-                          <a:blip r:embed="rId17" cstate="print">
+                          <a:blip r:embed="rId13" cstate="print">
                             <a:extLst>
                               <a:ext uri="{28A0092B-C50C-407E-A947-70E740481C1C}">
                                 <a14:useLocalDpi xmlns:a14="http://schemas.microsoft.com/office/drawing/2010/main" val="0"/>
                               </a:ext>
                               <a:ext uri="{837473B0-CC2E-450A-ABE3-18F120FF3D39}">
-                                <a1611:picAttrSrcUrl xmlns:a1611="http://schemas.microsoft.com/office/drawing/2016/11/main" r:id="rId18"/>
+                                <a1611:picAttrSrcUrl xmlns:a1611="http://schemas.microsoft.com/office/drawing/2016/11/main" r:id="rId14"/>
                               </a:ext>
                             </a:extLst>
                           </a:blip>
@@ -27304,13 +27234,13 @@
                           </pic:cNvPicPr>
                         </pic:nvPicPr>
                         <pic:blipFill>
-                          <a:blip r:embed="rId17" cstate="print">
+                          <a:blip r:embed="rId13" cstate="print">
                             <a:extLst>
                               <a:ext uri="{28A0092B-C50C-407E-A947-70E740481C1C}">
                                 <a14:useLocalDpi xmlns:a14="http://schemas.microsoft.com/office/drawing/2010/main" val="0"/>
                               </a:ext>
                               <a:ext uri="{837473B0-CC2E-450A-ABE3-18F120FF3D39}">
-                                <a1611:picAttrSrcUrl xmlns:a1611="http://schemas.microsoft.com/office/drawing/2016/11/main" r:id="rId18"/>
+                                <a1611:picAttrSrcUrl xmlns:a1611="http://schemas.microsoft.com/office/drawing/2016/11/main" r:id="rId14"/>
                               </a:ext>
                             </a:extLst>
                           </a:blip>
@@ -27367,13 +27297,13 @@
                           </pic:cNvPicPr>
                         </pic:nvPicPr>
                         <pic:blipFill>
-                          <a:blip r:embed="rId17" cstate="print">
+                          <a:blip r:embed="rId13" cstate="print">
                             <a:extLst>
                               <a:ext uri="{28A0092B-C50C-407E-A947-70E740481C1C}">
                                 <a14:useLocalDpi xmlns:a14="http://schemas.microsoft.com/office/drawing/2010/main" val="0"/>
                               </a:ext>
                               <a:ext uri="{837473B0-CC2E-450A-ABE3-18F120FF3D39}">
-                                <a1611:picAttrSrcUrl xmlns:a1611="http://schemas.microsoft.com/office/drawing/2016/11/main" r:id="rId18"/>
+                                <a1611:picAttrSrcUrl xmlns:a1611="http://schemas.microsoft.com/office/drawing/2016/11/main" r:id="rId14"/>
                               </a:ext>
                             </a:extLst>
                           </a:blip>
@@ -27430,13 +27360,13 @@
                           </pic:cNvPicPr>
                         </pic:nvPicPr>
                         <pic:blipFill>
-                          <a:blip r:embed="rId17" cstate="print">
+                          <a:blip r:embed="rId13" cstate="print">
                             <a:extLst>
                               <a:ext uri="{28A0092B-C50C-407E-A947-70E740481C1C}">
                                 <a14:useLocalDpi xmlns:a14="http://schemas.microsoft.com/office/drawing/2010/main" val="0"/>
                               </a:ext>
                               <a:ext uri="{837473B0-CC2E-450A-ABE3-18F120FF3D39}">
-                                <a1611:picAttrSrcUrl xmlns:a1611="http://schemas.microsoft.com/office/drawing/2016/11/main" r:id="rId18"/>
+                                <a1611:picAttrSrcUrl xmlns:a1611="http://schemas.microsoft.com/office/drawing/2016/11/main" r:id="rId14"/>
                               </a:ext>
                             </a:extLst>
                           </a:blip>
@@ -27493,13 +27423,13 @@
                           </pic:cNvPicPr>
                         </pic:nvPicPr>
                         <pic:blipFill>
-                          <a:blip r:embed="rId17" cstate="print">
+                          <a:blip r:embed="rId13" cstate="print">
                             <a:extLst>
                               <a:ext uri="{28A0092B-C50C-407E-A947-70E740481C1C}">
                                 <a14:useLocalDpi xmlns:a14="http://schemas.microsoft.com/office/drawing/2010/main" val="0"/>
                               </a:ext>
                               <a:ext uri="{837473B0-CC2E-450A-ABE3-18F120FF3D39}">
-                                <a1611:picAttrSrcUrl xmlns:a1611="http://schemas.microsoft.com/office/drawing/2016/11/main" r:id="rId18"/>
+                                <a1611:picAttrSrcUrl xmlns:a1611="http://schemas.microsoft.com/office/drawing/2016/11/main" r:id="rId14"/>
                               </a:ext>
                             </a:extLst>
                           </a:blip>
@@ -27556,13 +27486,13 @@
                           </pic:cNvPicPr>
                         </pic:nvPicPr>
                         <pic:blipFill>
-                          <a:blip r:embed="rId17" cstate="print">
+                          <a:blip r:embed="rId13" cstate="print">
                             <a:extLst>
                               <a:ext uri="{28A0092B-C50C-407E-A947-70E740481C1C}">
                                 <a14:useLocalDpi xmlns:a14="http://schemas.microsoft.com/office/drawing/2010/main" val="0"/>
                               </a:ext>
                               <a:ext uri="{837473B0-CC2E-450A-ABE3-18F120FF3D39}">
-                                <a1611:picAttrSrcUrl xmlns:a1611="http://schemas.microsoft.com/office/drawing/2016/11/main" r:id="rId18"/>
+                                <a1611:picAttrSrcUrl xmlns:a1611="http://schemas.microsoft.com/office/drawing/2016/11/main" r:id="rId14"/>
                               </a:ext>
                             </a:extLst>
                           </a:blip>
@@ -27619,13 +27549,13 @@
                           </pic:cNvPicPr>
                         </pic:nvPicPr>
                         <pic:blipFill>
-                          <a:blip r:embed="rId17" cstate="print">
+                          <a:blip r:embed="rId13" cstate="print">
                             <a:extLst>
                               <a:ext uri="{28A0092B-C50C-407E-A947-70E740481C1C}">
                                 <a14:useLocalDpi xmlns:a14="http://schemas.microsoft.com/office/drawing/2010/main" val="0"/>
                               </a:ext>
                               <a:ext uri="{837473B0-CC2E-450A-ABE3-18F120FF3D39}">
-                                <a1611:picAttrSrcUrl xmlns:a1611="http://schemas.microsoft.com/office/drawing/2016/11/main" r:id="rId18"/>
+                                <a1611:picAttrSrcUrl xmlns:a1611="http://schemas.microsoft.com/office/drawing/2016/11/main" r:id="rId14"/>
                               </a:ext>
                             </a:extLst>
                           </a:blip>
@@ -27682,13 +27612,13 @@
                           </pic:cNvPicPr>
                         </pic:nvPicPr>
                         <pic:blipFill>
-                          <a:blip r:embed="rId17" cstate="print">
+                          <a:blip r:embed="rId13" cstate="print">
                             <a:extLst>
                               <a:ext uri="{28A0092B-C50C-407E-A947-70E740481C1C}">
                                 <a14:useLocalDpi xmlns:a14="http://schemas.microsoft.com/office/drawing/2010/main" val="0"/>
                               </a:ext>
                               <a:ext uri="{837473B0-CC2E-450A-ABE3-18F120FF3D39}">
-                                <a1611:picAttrSrcUrl xmlns:a1611="http://schemas.microsoft.com/office/drawing/2016/11/main" r:id="rId18"/>
+                                <a1611:picAttrSrcUrl xmlns:a1611="http://schemas.microsoft.com/office/drawing/2016/11/main" r:id="rId14"/>
                               </a:ext>
                             </a:extLst>
                           </a:blip>
@@ -27788,13 +27718,13 @@
                           </pic:cNvPicPr>
                         </pic:nvPicPr>
                         <pic:blipFill>
-                          <a:blip r:embed="rId17" cstate="print">
+                          <a:blip r:embed="rId13" cstate="print">
                             <a:extLst>
                               <a:ext uri="{28A0092B-C50C-407E-A947-70E740481C1C}">
                                 <a14:useLocalDpi xmlns:a14="http://schemas.microsoft.com/office/drawing/2010/main" val="0"/>
                               </a:ext>
                               <a:ext uri="{837473B0-CC2E-450A-ABE3-18F120FF3D39}">
-                                <a1611:picAttrSrcUrl xmlns:a1611="http://schemas.microsoft.com/office/drawing/2016/11/main" r:id="rId18"/>
+                                <a1611:picAttrSrcUrl xmlns:a1611="http://schemas.microsoft.com/office/drawing/2016/11/main" r:id="rId14"/>
                               </a:ext>
                             </a:extLst>
                           </a:blip>
@@ -27851,13 +27781,13 @@
                           </pic:cNvPicPr>
                         </pic:nvPicPr>
                         <pic:blipFill>
-                          <a:blip r:embed="rId17" cstate="print">
+                          <a:blip r:embed="rId13" cstate="print">
                             <a:extLst>
                               <a:ext uri="{28A0092B-C50C-407E-A947-70E740481C1C}">
                                 <a14:useLocalDpi xmlns:a14="http://schemas.microsoft.com/office/drawing/2010/main" val="0"/>
                               </a:ext>
                               <a:ext uri="{837473B0-CC2E-450A-ABE3-18F120FF3D39}">
-                                <a1611:picAttrSrcUrl xmlns:a1611="http://schemas.microsoft.com/office/drawing/2016/11/main" r:id="rId18"/>
+                                <a1611:picAttrSrcUrl xmlns:a1611="http://schemas.microsoft.com/office/drawing/2016/11/main" r:id="rId14"/>
                               </a:ext>
                             </a:extLst>
                           </a:blip>
@@ -27914,13 +27844,13 @@
                           </pic:cNvPicPr>
                         </pic:nvPicPr>
                         <pic:blipFill>
-                          <a:blip r:embed="rId17" cstate="print">
+                          <a:blip r:embed="rId13" cstate="print">
                             <a:extLst>
                               <a:ext uri="{28A0092B-C50C-407E-A947-70E740481C1C}">
                                 <a14:useLocalDpi xmlns:a14="http://schemas.microsoft.com/office/drawing/2010/main" val="0"/>
                               </a:ext>
                               <a:ext uri="{837473B0-CC2E-450A-ABE3-18F120FF3D39}">
-                                <a1611:picAttrSrcUrl xmlns:a1611="http://schemas.microsoft.com/office/drawing/2016/11/main" r:id="rId18"/>
+                                <a1611:picAttrSrcUrl xmlns:a1611="http://schemas.microsoft.com/office/drawing/2016/11/main" r:id="rId14"/>
                               </a:ext>
                             </a:extLst>
                           </a:blip>
@@ -27977,13 +27907,13 @@
                           </pic:cNvPicPr>
                         </pic:nvPicPr>
                         <pic:blipFill>
-                          <a:blip r:embed="rId17" cstate="print">
+                          <a:blip r:embed="rId13" cstate="print">
                             <a:extLst>
                               <a:ext uri="{28A0092B-C50C-407E-A947-70E740481C1C}">
                                 <a14:useLocalDpi xmlns:a14="http://schemas.microsoft.com/office/drawing/2010/main" val="0"/>
                               </a:ext>
                               <a:ext uri="{837473B0-CC2E-450A-ABE3-18F120FF3D39}">
-                                <a1611:picAttrSrcUrl xmlns:a1611="http://schemas.microsoft.com/office/drawing/2016/11/main" r:id="rId18"/>
+                                <a1611:picAttrSrcUrl xmlns:a1611="http://schemas.microsoft.com/office/drawing/2016/11/main" r:id="rId14"/>
                               </a:ext>
                             </a:extLst>
                           </a:blip>
@@ -28040,13 +27970,13 @@
                           </pic:cNvPicPr>
                         </pic:nvPicPr>
                         <pic:blipFill>
-                          <a:blip r:embed="rId17" cstate="print">
+                          <a:blip r:embed="rId13" cstate="print">
                             <a:extLst>
                               <a:ext uri="{28A0092B-C50C-407E-A947-70E740481C1C}">
                                 <a14:useLocalDpi xmlns:a14="http://schemas.microsoft.com/office/drawing/2010/main" val="0"/>
                               </a:ext>
                               <a:ext uri="{837473B0-CC2E-450A-ABE3-18F120FF3D39}">
-                                <a1611:picAttrSrcUrl xmlns:a1611="http://schemas.microsoft.com/office/drawing/2016/11/main" r:id="rId18"/>
+                                <a1611:picAttrSrcUrl xmlns:a1611="http://schemas.microsoft.com/office/drawing/2016/11/main" r:id="rId14"/>
                               </a:ext>
                             </a:extLst>
                           </a:blip>
@@ -28103,13 +28033,13 @@
                           </pic:cNvPicPr>
                         </pic:nvPicPr>
                         <pic:blipFill>
-                          <a:blip r:embed="rId17" cstate="print">
+                          <a:blip r:embed="rId13" cstate="print">
                             <a:extLst>
                               <a:ext uri="{28A0092B-C50C-407E-A947-70E740481C1C}">
                                 <a14:useLocalDpi xmlns:a14="http://schemas.microsoft.com/office/drawing/2010/main" val="0"/>
                               </a:ext>
                               <a:ext uri="{837473B0-CC2E-450A-ABE3-18F120FF3D39}">
-                                <a1611:picAttrSrcUrl xmlns:a1611="http://schemas.microsoft.com/office/drawing/2016/11/main" r:id="rId18"/>
+                                <a1611:picAttrSrcUrl xmlns:a1611="http://schemas.microsoft.com/office/drawing/2016/11/main" r:id="rId14"/>
                               </a:ext>
                             </a:extLst>
                           </a:blip>
@@ -28166,13 +28096,13 @@
                           </pic:cNvPicPr>
                         </pic:nvPicPr>
                         <pic:blipFill>
-                          <a:blip r:embed="rId17" cstate="print">
+                          <a:blip r:embed="rId13" cstate="print">
                             <a:extLst>
                               <a:ext uri="{28A0092B-C50C-407E-A947-70E740481C1C}">
                                 <a14:useLocalDpi xmlns:a14="http://schemas.microsoft.com/office/drawing/2010/main" val="0"/>
                               </a:ext>
                               <a:ext uri="{837473B0-CC2E-450A-ABE3-18F120FF3D39}">
-                                <a1611:picAttrSrcUrl xmlns:a1611="http://schemas.microsoft.com/office/drawing/2016/11/main" r:id="rId18"/>
+                                <a1611:picAttrSrcUrl xmlns:a1611="http://schemas.microsoft.com/office/drawing/2016/11/main" r:id="rId14"/>
                               </a:ext>
                             </a:extLst>
                           </a:blip>
@@ -28273,13 +28203,13 @@
                           </pic:cNvPicPr>
                         </pic:nvPicPr>
                         <pic:blipFill>
-                          <a:blip r:embed="rId17" cstate="print">
+                          <a:blip r:embed="rId13" cstate="print">
                             <a:extLst>
                               <a:ext uri="{28A0092B-C50C-407E-A947-70E740481C1C}">
                                 <a14:useLocalDpi xmlns:a14="http://schemas.microsoft.com/office/drawing/2010/main" val="0"/>
                               </a:ext>
                               <a:ext uri="{837473B0-CC2E-450A-ABE3-18F120FF3D39}">
-                                <a1611:picAttrSrcUrl xmlns:a1611="http://schemas.microsoft.com/office/drawing/2016/11/main" r:id="rId18"/>
+                                <a1611:picAttrSrcUrl xmlns:a1611="http://schemas.microsoft.com/office/drawing/2016/11/main" r:id="rId14"/>
                               </a:ext>
                             </a:extLst>
                           </a:blip>
@@ -28336,13 +28266,13 @@
                           </pic:cNvPicPr>
                         </pic:nvPicPr>
                         <pic:blipFill>
-                          <a:blip r:embed="rId17" cstate="print">
+                          <a:blip r:embed="rId13" cstate="print">
                             <a:extLst>
                               <a:ext uri="{28A0092B-C50C-407E-A947-70E740481C1C}">
                                 <a14:useLocalDpi xmlns:a14="http://schemas.microsoft.com/office/drawing/2010/main" val="0"/>
                               </a:ext>
                               <a:ext uri="{837473B0-CC2E-450A-ABE3-18F120FF3D39}">
-                                <a1611:picAttrSrcUrl xmlns:a1611="http://schemas.microsoft.com/office/drawing/2016/11/main" r:id="rId18"/>
+                                <a1611:picAttrSrcUrl xmlns:a1611="http://schemas.microsoft.com/office/drawing/2016/11/main" r:id="rId14"/>
                               </a:ext>
                             </a:extLst>
                           </a:blip>
@@ -28399,13 +28329,13 @@
                           </pic:cNvPicPr>
                         </pic:nvPicPr>
                         <pic:blipFill>
-                          <a:blip r:embed="rId17" cstate="print">
+                          <a:blip r:embed="rId13" cstate="print">
                             <a:extLst>
                               <a:ext uri="{28A0092B-C50C-407E-A947-70E740481C1C}">
                                 <a14:useLocalDpi xmlns:a14="http://schemas.microsoft.com/office/drawing/2010/main" val="0"/>
                               </a:ext>
                               <a:ext uri="{837473B0-CC2E-450A-ABE3-18F120FF3D39}">
-                                <a1611:picAttrSrcUrl xmlns:a1611="http://schemas.microsoft.com/office/drawing/2016/11/main" r:id="rId18"/>
+                                <a1611:picAttrSrcUrl xmlns:a1611="http://schemas.microsoft.com/office/drawing/2016/11/main" r:id="rId14"/>
                               </a:ext>
                             </a:extLst>
                           </a:blip>
@@ -28462,13 +28392,13 @@
                           </pic:cNvPicPr>
                         </pic:nvPicPr>
                         <pic:blipFill>
-                          <a:blip r:embed="rId17" cstate="print">
+                          <a:blip r:embed="rId13" cstate="print">
                             <a:extLst>
                               <a:ext uri="{28A0092B-C50C-407E-A947-70E740481C1C}">
                                 <a14:useLocalDpi xmlns:a14="http://schemas.microsoft.com/office/drawing/2010/main" val="0"/>
                               </a:ext>
                               <a:ext uri="{837473B0-CC2E-450A-ABE3-18F120FF3D39}">
-                                <a1611:picAttrSrcUrl xmlns:a1611="http://schemas.microsoft.com/office/drawing/2016/11/main" r:id="rId18"/>
+                                <a1611:picAttrSrcUrl xmlns:a1611="http://schemas.microsoft.com/office/drawing/2016/11/main" r:id="rId14"/>
                               </a:ext>
                             </a:extLst>
                           </a:blip>
@@ -28525,13 +28455,13 @@
                           </pic:cNvPicPr>
                         </pic:nvPicPr>
                         <pic:blipFill>
-                          <a:blip r:embed="rId17" cstate="print">
+                          <a:blip r:embed="rId13" cstate="print">
                             <a:extLst>
                               <a:ext uri="{28A0092B-C50C-407E-A947-70E740481C1C}">
                                 <a14:useLocalDpi xmlns:a14="http://schemas.microsoft.com/office/drawing/2010/main" val="0"/>
                               </a:ext>
                               <a:ext uri="{837473B0-CC2E-450A-ABE3-18F120FF3D39}">
-                                <a1611:picAttrSrcUrl xmlns:a1611="http://schemas.microsoft.com/office/drawing/2016/11/main" r:id="rId18"/>
+                                <a1611:picAttrSrcUrl xmlns:a1611="http://schemas.microsoft.com/office/drawing/2016/11/main" r:id="rId14"/>
                               </a:ext>
                             </a:extLst>
                           </a:blip>
@@ -28588,13 +28518,13 @@
                           </pic:cNvPicPr>
                         </pic:nvPicPr>
                         <pic:blipFill>
-                          <a:blip r:embed="rId17" cstate="print">
+                          <a:blip r:embed="rId13" cstate="print">
                             <a:extLst>
                               <a:ext uri="{28A0092B-C50C-407E-A947-70E740481C1C}">
                                 <a14:useLocalDpi xmlns:a14="http://schemas.microsoft.com/office/drawing/2010/main" val="0"/>
                               </a:ext>
                               <a:ext uri="{837473B0-CC2E-450A-ABE3-18F120FF3D39}">
-                                <a1611:picAttrSrcUrl xmlns:a1611="http://schemas.microsoft.com/office/drawing/2016/11/main" r:id="rId18"/>
+                                <a1611:picAttrSrcUrl xmlns:a1611="http://schemas.microsoft.com/office/drawing/2016/11/main" r:id="rId14"/>
                               </a:ext>
                             </a:extLst>
                           </a:blip>
@@ -28651,13 +28581,13 @@
                           </pic:cNvPicPr>
                         </pic:nvPicPr>
                         <pic:blipFill>
-                          <a:blip r:embed="rId17" cstate="print">
+                          <a:blip r:embed="rId13" cstate="print">
                             <a:extLst>
                               <a:ext uri="{28A0092B-C50C-407E-A947-70E740481C1C}">
                                 <a14:useLocalDpi xmlns:a14="http://schemas.microsoft.com/office/drawing/2010/main" val="0"/>
                               </a:ext>
                               <a:ext uri="{837473B0-CC2E-450A-ABE3-18F120FF3D39}">
-                                <a1611:picAttrSrcUrl xmlns:a1611="http://schemas.microsoft.com/office/drawing/2016/11/main" r:id="rId18"/>
+                                <a1611:picAttrSrcUrl xmlns:a1611="http://schemas.microsoft.com/office/drawing/2016/11/main" r:id="rId14"/>
                               </a:ext>
                             </a:extLst>
                           </a:blip>
@@ -28757,13 +28687,13 @@
                           </pic:cNvPicPr>
                         </pic:nvPicPr>
                         <pic:blipFill>
-                          <a:blip r:embed="rId17" cstate="print">
+                          <a:blip r:embed="rId13" cstate="print">
                             <a:extLst>
                               <a:ext uri="{28A0092B-C50C-407E-A947-70E740481C1C}">
                                 <a14:useLocalDpi xmlns:a14="http://schemas.microsoft.com/office/drawing/2010/main" val="0"/>
                               </a:ext>
                               <a:ext uri="{837473B0-CC2E-450A-ABE3-18F120FF3D39}">
-                                <a1611:picAttrSrcUrl xmlns:a1611="http://schemas.microsoft.com/office/drawing/2016/11/main" r:id="rId18"/>
+                                <a1611:picAttrSrcUrl xmlns:a1611="http://schemas.microsoft.com/office/drawing/2016/11/main" r:id="rId14"/>
                               </a:ext>
                             </a:extLst>
                           </a:blip>
@@ -28820,13 +28750,13 @@
                           </pic:cNvPicPr>
                         </pic:nvPicPr>
                         <pic:blipFill>
-                          <a:blip r:embed="rId17" cstate="print">
+                          <a:blip r:embed="rId13" cstate="print">
                             <a:extLst>
                               <a:ext uri="{28A0092B-C50C-407E-A947-70E740481C1C}">
                                 <a14:useLocalDpi xmlns:a14="http://schemas.microsoft.com/office/drawing/2010/main" val="0"/>
                               </a:ext>
                               <a:ext uri="{837473B0-CC2E-450A-ABE3-18F120FF3D39}">
-                                <a1611:picAttrSrcUrl xmlns:a1611="http://schemas.microsoft.com/office/drawing/2016/11/main" r:id="rId18"/>
+                                <a1611:picAttrSrcUrl xmlns:a1611="http://schemas.microsoft.com/office/drawing/2016/11/main" r:id="rId14"/>
                               </a:ext>
                             </a:extLst>
                           </a:blip>
@@ -28883,13 +28813,13 @@
                           </pic:cNvPicPr>
                         </pic:nvPicPr>
                         <pic:blipFill>
-                          <a:blip r:embed="rId17" cstate="print">
+                          <a:blip r:embed="rId13" cstate="print">
                             <a:extLst>
                               <a:ext uri="{28A0092B-C50C-407E-A947-70E740481C1C}">
                                 <a14:useLocalDpi xmlns:a14="http://schemas.microsoft.com/office/drawing/2010/main" val="0"/>
                               </a:ext>
                               <a:ext uri="{837473B0-CC2E-450A-ABE3-18F120FF3D39}">
-                                <a1611:picAttrSrcUrl xmlns:a1611="http://schemas.microsoft.com/office/drawing/2016/11/main" r:id="rId18"/>
+                                <a1611:picAttrSrcUrl xmlns:a1611="http://schemas.microsoft.com/office/drawing/2016/11/main" r:id="rId14"/>
                               </a:ext>
                             </a:extLst>
                           </a:blip>
@@ -28946,13 +28876,13 @@
                           </pic:cNvPicPr>
                         </pic:nvPicPr>
                         <pic:blipFill>
-                          <a:blip r:embed="rId17" cstate="print">
+                          <a:blip r:embed="rId13" cstate="print">
                             <a:extLst>
                               <a:ext uri="{28A0092B-C50C-407E-A947-70E740481C1C}">
                                 <a14:useLocalDpi xmlns:a14="http://schemas.microsoft.com/office/drawing/2010/main" val="0"/>
                               </a:ext>
                               <a:ext uri="{837473B0-CC2E-450A-ABE3-18F120FF3D39}">
-                                <a1611:picAttrSrcUrl xmlns:a1611="http://schemas.microsoft.com/office/drawing/2016/11/main" r:id="rId18"/>
+                                <a1611:picAttrSrcUrl xmlns:a1611="http://schemas.microsoft.com/office/drawing/2016/11/main" r:id="rId14"/>
                               </a:ext>
                             </a:extLst>
                           </a:blip>
@@ -29009,13 +28939,13 @@
                           </pic:cNvPicPr>
                         </pic:nvPicPr>
                         <pic:blipFill>
-                          <a:blip r:embed="rId17" cstate="print">
+                          <a:blip r:embed="rId13" cstate="print">
                             <a:extLst>
                               <a:ext uri="{28A0092B-C50C-407E-A947-70E740481C1C}">
                                 <a14:useLocalDpi xmlns:a14="http://schemas.microsoft.com/office/drawing/2010/main" val="0"/>
                               </a:ext>
                               <a:ext uri="{837473B0-CC2E-450A-ABE3-18F120FF3D39}">
-                                <a1611:picAttrSrcUrl xmlns:a1611="http://schemas.microsoft.com/office/drawing/2016/11/main" r:id="rId18"/>
+                                <a1611:picAttrSrcUrl xmlns:a1611="http://schemas.microsoft.com/office/drawing/2016/11/main" r:id="rId14"/>
                               </a:ext>
                             </a:extLst>
                           </a:blip>
@@ -29072,13 +29002,13 @@
                           </pic:cNvPicPr>
                         </pic:nvPicPr>
                         <pic:blipFill>
-                          <a:blip r:embed="rId17" cstate="print">
+                          <a:blip r:embed="rId13" cstate="print">
                             <a:extLst>
                               <a:ext uri="{28A0092B-C50C-407E-A947-70E740481C1C}">
                                 <a14:useLocalDpi xmlns:a14="http://schemas.microsoft.com/office/drawing/2010/main" val="0"/>
                               </a:ext>
                               <a:ext uri="{837473B0-CC2E-450A-ABE3-18F120FF3D39}">
-                                <a1611:picAttrSrcUrl xmlns:a1611="http://schemas.microsoft.com/office/drawing/2016/11/main" r:id="rId18"/>
+                                <a1611:picAttrSrcUrl xmlns:a1611="http://schemas.microsoft.com/office/drawing/2016/11/main" r:id="rId14"/>
                               </a:ext>
                             </a:extLst>
                           </a:blip>
@@ -29135,13 +29065,13 @@
                           </pic:cNvPicPr>
                         </pic:nvPicPr>
                         <pic:blipFill>
-                          <a:blip r:embed="rId17" cstate="print">
+                          <a:blip r:embed="rId13" cstate="print">
                             <a:extLst>
                               <a:ext uri="{28A0092B-C50C-407E-A947-70E740481C1C}">
                                 <a14:useLocalDpi xmlns:a14="http://schemas.microsoft.com/office/drawing/2010/main" val="0"/>
                               </a:ext>
                               <a:ext uri="{837473B0-CC2E-450A-ABE3-18F120FF3D39}">
-                                <a1611:picAttrSrcUrl xmlns:a1611="http://schemas.microsoft.com/office/drawing/2016/11/main" r:id="rId18"/>
+                                <a1611:picAttrSrcUrl xmlns:a1611="http://schemas.microsoft.com/office/drawing/2016/11/main" r:id="rId14"/>
                               </a:ext>
                             </a:extLst>
                           </a:blip>
@@ -29242,13 +29172,13 @@
                           </pic:cNvPicPr>
                         </pic:nvPicPr>
                         <pic:blipFill>
-                          <a:blip r:embed="rId17" cstate="print">
+                          <a:blip r:embed="rId13" cstate="print">
                             <a:extLst>
                               <a:ext uri="{28A0092B-C50C-407E-A947-70E740481C1C}">
                                 <a14:useLocalDpi xmlns:a14="http://schemas.microsoft.com/office/drawing/2010/main" val="0"/>
                               </a:ext>
                               <a:ext uri="{837473B0-CC2E-450A-ABE3-18F120FF3D39}">
-                                <a1611:picAttrSrcUrl xmlns:a1611="http://schemas.microsoft.com/office/drawing/2016/11/main" r:id="rId18"/>
+                                <a1611:picAttrSrcUrl xmlns:a1611="http://schemas.microsoft.com/office/drawing/2016/11/main" r:id="rId14"/>
                               </a:ext>
                             </a:extLst>
                           </a:blip>
@@ -29305,13 +29235,13 @@
                           </pic:cNvPicPr>
                         </pic:nvPicPr>
                         <pic:blipFill>
-                          <a:blip r:embed="rId17" cstate="print">
+                          <a:blip r:embed="rId13" cstate="print">
                             <a:extLst>
                               <a:ext uri="{28A0092B-C50C-407E-A947-70E740481C1C}">
                                 <a14:useLocalDpi xmlns:a14="http://schemas.microsoft.com/office/drawing/2010/main" val="0"/>
                               </a:ext>
                               <a:ext uri="{837473B0-CC2E-450A-ABE3-18F120FF3D39}">
-                                <a1611:picAttrSrcUrl xmlns:a1611="http://schemas.microsoft.com/office/drawing/2016/11/main" r:id="rId18"/>
+                                <a1611:picAttrSrcUrl xmlns:a1611="http://schemas.microsoft.com/office/drawing/2016/11/main" r:id="rId14"/>
                               </a:ext>
                             </a:extLst>
                           </a:blip>
@@ -29368,13 +29298,13 @@
                           </pic:cNvPicPr>
                         </pic:nvPicPr>
                         <pic:blipFill>
-                          <a:blip r:embed="rId17" cstate="print">
+                          <a:blip r:embed="rId13" cstate="print">
                             <a:extLst>
                               <a:ext uri="{28A0092B-C50C-407E-A947-70E740481C1C}">
                                 <a14:useLocalDpi xmlns:a14="http://schemas.microsoft.com/office/drawing/2010/main" val="0"/>
                               </a:ext>
                               <a:ext uri="{837473B0-CC2E-450A-ABE3-18F120FF3D39}">
-                                <a1611:picAttrSrcUrl xmlns:a1611="http://schemas.microsoft.com/office/drawing/2016/11/main" r:id="rId18"/>
+                                <a1611:picAttrSrcUrl xmlns:a1611="http://schemas.microsoft.com/office/drawing/2016/11/main" r:id="rId14"/>
                               </a:ext>
                             </a:extLst>
                           </a:blip>
@@ -29431,13 +29361,13 @@
                           </pic:cNvPicPr>
                         </pic:nvPicPr>
                         <pic:blipFill>
-                          <a:blip r:embed="rId17" cstate="print">
+                          <a:blip r:embed="rId13" cstate="print">
                             <a:extLst>
                               <a:ext uri="{28A0092B-C50C-407E-A947-70E740481C1C}">
                                 <a14:useLocalDpi xmlns:a14="http://schemas.microsoft.com/office/drawing/2010/main" val="0"/>
                               </a:ext>
                               <a:ext uri="{837473B0-CC2E-450A-ABE3-18F120FF3D39}">
-                                <a1611:picAttrSrcUrl xmlns:a1611="http://schemas.microsoft.com/office/drawing/2016/11/main" r:id="rId18"/>
+                                <a1611:picAttrSrcUrl xmlns:a1611="http://schemas.microsoft.com/office/drawing/2016/11/main" r:id="rId14"/>
                               </a:ext>
                             </a:extLst>
                           </a:blip>
@@ -29494,13 +29424,13 @@
                           </pic:cNvPicPr>
                         </pic:nvPicPr>
                         <pic:blipFill>
-                          <a:blip r:embed="rId17" cstate="print">
+                          <a:blip r:embed="rId13" cstate="print">
                             <a:extLst>
                               <a:ext uri="{28A0092B-C50C-407E-A947-70E740481C1C}">
                                 <a14:useLocalDpi xmlns:a14="http://schemas.microsoft.com/office/drawing/2010/main" val="0"/>
                               </a:ext>
                               <a:ext uri="{837473B0-CC2E-450A-ABE3-18F120FF3D39}">
-                                <a1611:picAttrSrcUrl xmlns:a1611="http://schemas.microsoft.com/office/drawing/2016/11/main" r:id="rId18"/>
+                                <a1611:picAttrSrcUrl xmlns:a1611="http://schemas.microsoft.com/office/drawing/2016/11/main" r:id="rId14"/>
                               </a:ext>
                             </a:extLst>
                           </a:blip>
@@ -29557,13 +29487,13 @@
                           </pic:cNvPicPr>
                         </pic:nvPicPr>
                         <pic:blipFill>
-                          <a:blip r:embed="rId17" cstate="print">
+                          <a:blip r:embed="rId13" cstate="print">
                             <a:extLst>
                               <a:ext uri="{28A0092B-C50C-407E-A947-70E740481C1C}">
                                 <a14:useLocalDpi xmlns:a14="http://schemas.microsoft.com/office/drawing/2010/main" val="0"/>
                               </a:ext>
                               <a:ext uri="{837473B0-CC2E-450A-ABE3-18F120FF3D39}">
-                                <a1611:picAttrSrcUrl xmlns:a1611="http://schemas.microsoft.com/office/drawing/2016/11/main" r:id="rId18"/>
+                                <a1611:picAttrSrcUrl xmlns:a1611="http://schemas.microsoft.com/office/drawing/2016/11/main" r:id="rId14"/>
                               </a:ext>
                             </a:extLst>
                           </a:blip>
@@ -29620,13 +29550,13 @@
                           </pic:cNvPicPr>
                         </pic:nvPicPr>
                         <pic:blipFill>
-                          <a:blip r:embed="rId17" cstate="print">
+                          <a:blip r:embed="rId13" cstate="print">
                             <a:extLst>
                               <a:ext uri="{28A0092B-C50C-407E-A947-70E740481C1C}">
                                 <a14:useLocalDpi xmlns:a14="http://schemas.microsoft.com/office/drawing/2010/main" val="0"/>
                               </a:ext>
                               <a:ext uri="{837473B0-CC2E-450A-ABE3-18F120FF3D39}">
-                                <a1611:picAttrSrcUrl xmlns:a1611="http://schemas.microsoft.com/office/drawing/2016/11/main" r:id="rId18"/>
+                                <a1611:picAttrSrcUrl xmlns:a1611="http://schemas.microsoft.com/office/drawing/2016/11/main" r:id="rId14"/>
                               </a:ext>
                             </a:extLst>
                           </a:blip>
@@ -29726,13 +29656,13 @@
                           </pic:cNvPicPr>
                         </pic:nvPicPr>
                         <pic:blipFill>
-                          <a:blip r:embed="rId17" cstate="print">
+                          <a:blip r:embed="rId13" cstate="print">
                             <a:extLst>
                               <a:ext uri="{28A0092B-C50C-407E-A947-70E740481C1C}">
                                 <a14:useLocalDpi xmlns:a14="http://schemas.microsoft.com/office/drawing/2010/main" val="0"/>
                               </a:ext>
                               <a:ext uri="{837473B0-CC2E-450A-ABE3-18F120FF3D39}">
-                                <a1611:picAttrSrcUrl xmlns:a1611="http://schemas.microsoft.com/office/drawing/2016/11/main" r:id="rId18"/>
+                                <a1611:picAttrSrcUrl xmlns:a1611="http://schemas.microsoft.com/office/drawing/2016/11/main" r:id="rId14"/>
                               </a:ext>
                             </a:extLst>
                           </a:blip>
@@ -29789,13 +29719,13 @@
                           </pic:cNvPicPr>
                         </pic:nvPicPr>
                         <pic:blipFill>
-                          <a:blip r:embed="rId17" cstate="print">
+                          <a:blip r:embed="rId13" cstate="print">
                             <a:extLst>
                               <a:ext uri="{28A0092B-C50C-407E-A947-70E740481C1C}">
                                 <a14:useLocalDpi xmlns:a14="http://schemas.microsoft.com/office/drawing/2010/main" val="0"/>
                               </a:ext>
                               <a:ext uri="{837473B0-CC2E-450A-ABE3-18F120FF3D39}">
-                                <a1611:picAttrSrcUrl xmlns:a1611="http://schemas.microsoft.com/office/drawing/2016/11/main" r:id="rId18"/>
+                                <a1611:picAttrSrcUrl xmlns:a1611="http://schemas.microsoft.com/office/drawing/2016/11/main" r:id="rId14"/>
                               </a:ext>
                             </a:extLst>
                           </a:blip>
@@ -29852,13 +29782,13 @@
                           </pic:cNvPicPr>
                         </pic:nvPicPr>
                         <pic:blipFill>
-                          <a:blip r:embed="rId17" cstate="print">
+                          <a:blip r:embed="rId13" cstate="print">
                             <a:extLst>
                               <a:ext uri="{28A0092B-C50C-407E-A947-70E740481C1C}">
                                 <a14:useLocalDpi xmlns:a14="http://schemas.microsoft.com/office/drawing/2010/main" val="0"/>
                               </a:ext>
                               <a:ext uri="{837473B0-CC2E-450A-ABE3-18F120FF3D39}">
-                                <a1611:picAttrSrcUrl xmlns:a1611="http://schemas.microsoft.com/office/drawing/2016/11/main" r:id="rId18"/>
+                                <a1611:picAttrSrcUrl xmlns:a1611="http://schemas.microsoft.com/office/drawing/2016/11/main" r:id="rId14"/>
                               </a:ext>
                             </a:extLst>
                           </a:blip>
@@ -29915,13 +29845,13 @@
                           </pic:cNvPicPr>
                         </pic:nvPicPr>
                         <pic:blipFill>
-                          <a:blip r:embed="rId17" cstate="print">
+                          <a:blip r:embed="rId13" cstate="print">
                             <a:extLst>
                               <a:ext uri="{28A0092B-C50C-407E-A947-70E740481C1C}">
                                 <a14:useLocalDpi xmlns:a14="http://schemas.microsoft.com/office/drawing/2010/main" val="0"/>
                               </a:ext>
                               <a:ext uri="{837473B0-CC2E-450A-ABE3-18F120FF3D39}">
-                                <a1611:picAttrSrcUrl xmlns:a1611="http://schemas.microsoft.com/office/drawing/2016/11/main" r:id="rId18"/>
+                                <a1611:picAttrSrcUrl xmlns:a1611="http://schemas.microsoft.com/office/drawing/2016/11/main" r:id="rId14"/>
                               </a:ext>
                             </a:extLst>
                           </a:blip>
@@ -29978,13 +29908,13 @@
                           </pic:cNvPicPr>
                         </pic:nvPicPr>
                         <pic:blipFill>
-                          <a:blip r:embed="rId17" cstate="print">
+                          <a:blip r:embed="rId13" cstate="print">
                             <a:extLst>
                               <a:ext uri="{28A0092B-C50C-407E-A947-70E740481C1C}">
                                 <a14:useLocalDpi xmlns:a14="http://schemas.microsoft.com/office/drawing/2010/main" val="0"/>
                               </a:ext>
                               <a:ext uri="{837473B0-CC2E-450A-ABE3-18F120FF3D39}">
-                                <a1611:picAttrSrcUrl xmlns:a1611="http://schemas.microsoft.com/office/drawing/2016/11/main" r:id="rId18"/>
+                                <a1611:picAttrSrcUrl xmlns:a1611="http://schemas.microsoft.com/office/drawing/2016/11/main" r:id="rId14"/>
                               </a:ext>
                             </a:extLst>
                           </a:blip>
@@ -30041,13 +29971,13 @@
                           </pic:cNvPicPr>
                         </pic:nvPicPr>
                         <pic:blipFill>
-                          <a:blip r:embed="rId17" cstate="print">
+                          <a:blip r:embed="rId13" cstate="print">
                             <a:extLst>
                               <a:ext uri="{28A0092B-C50C-407E-A947-70E740481C1C}">
                                 <a14:useLocalDpi xmlns:a14="http://schemas.microsoft.com/office/drawing/2010/main" val="0"/>
                               </a:ext>
                               <a:ext uri="{837473B0-CC2E-450A-ABE3-18F120FF3D39}">
-                                <a1611:picAttrSrcUrl xmlns:a1611="http://schemas.microsoft.com/office/drawing/2016/11/main" r:id="rId18"/>
+                                <a1611:picAttrSrcUrl xmlns:a1611="http://schemas.microsoft.com/office/drawing/2016/11/main" r:id="rId14"/>
                               </a:ext>
                             </a:extLst>
                           </a:blip>
@@ -30104,13 +30034,13 @@
                           </pic:cNvPicPr>
                         </pic:nvPicPr>
                         <pic:blipFill>
-                          <a:blip r:embed="rId17" cstate="print">
+                          <a:blip r:embed="rId13" cstate="print">
                             <a:extLst>
                               <a:ext uri="{28A0092B-C50C-407E-A947-70E740481C1C}">
                                 <a14:useLocalDpi xmlns:a14="http://schemas.microsoft.com/office/drawing/2010/main" val="0"/>
                               </a:ext>
                               <a:ext uri="{837473B0-CC2E-450A-ABE3-18F120FF3D39}">
-                                <a1611:picAttrSrcUrl xmlns:a1611="http://schemas.microsoft.com/office/drawing/2016/11/main" r:id="rId18"/>
+                                <a1611:picAttrSrcUrl xmlns:a1611="http://schemas.microsoft.com/office/drawing/2016/11/main" r:id="rId14"/>
                               </a:ext>
                             </a:extLst>
                           </a:blip>
@@ -30211,13 +30141,13 @@
                           </pic:cNvPicPr>
                         </pic:nvPicPr>
                         <pic:blipFill>
-                          <a:blip r:embed="rId17" cstate="print">
+                          <a:blip r:embed="rId13" cstate="print">
                             <a:extLst>
                               <a:ext uri="{28A0092B-C50C-407E-A947-70E740481C1C}">
                                 <a14:useLocalDpi xmlns:a14="http://schemas.microsoft.com/office/drawing/2010/main" val="0"/>
                               </a:ext>
                               <a:ext uri="{837473B0-CC2E-450A-ABE3-18F120FF3D39}">
-                                <a1611:picAttrSrcUrl xmlns:a1611="http://schemas.microsoft.com/office/drawing/2016/11/main" r:id="rId18"/>
+                                <a1611:picAttrSrcUrl xmlns:a1611="http://schemas.microsoft.com/office/drawing/2016/11/main" r:id="rId14"/>
                               </a:ext>
                             </a:extLst>
                           </a:blip>
@@ -30274,13 +30204,13 @@
                           </pic:cNvPicPr>
                         </pic:nvPicPr>
                         <pic:blipFill>
-                          <a:blip r:embed="rId17" cstate="print">
+                          <a:blip r:embed="rId13" cstate="print">
                             <a:extLst>
                               <a:ext uri="{28A0092B-C50C-407E-A947-70E740481C1C}">
                                 <a14:useLocalDpi xmlns:a14="http://schemas.microsoft.com/office/drawing/2010/main" val="0"/>
                               </a:ext>
                               <a:ext uri="{837473B0-CC2E-450A-ABE3-18F120FF3D39}">
-                                <a1611:picAttrSrcUrl xmlns:a1611="http://schemas.microsoft.com/office/drawing/2016/11/main" r:id="rId18"/>
+                                <a1611:picAttrSrcUrl xmlns:a1611="http://schemas.microsoft.com/office/drawing/2016/11/main" r:id="rId14"/>
                               </a:ext>
                             </a:extLst>
                           </a:blip>
@@ -30337,13 +30267,13 @@
                           </pic:cNvPicPr>
                         </pic:nvPicPr>
                         <pic:blipFill>
-                          <a:blip r:embed="rId17" cstate="print">
+                          <a:blip r:embed="rId13" cstate="print">
                             <a:extLst>
                               <a:ext uri="{28A0092B-C50C-407E-A947-70E740481C1C}">
                                 <a14:useLocalDpi xmlns:a14="http://schemas.microsoft.com/office/drawing/2010/main" val="0"/>
                               </a:ext>
                               <a:ext uri="{837473B0-CC2E-450A-ABE3-18F120FF3D39}">
-                                <a1611:picAttrSrcUrl xmlns:a1611="http://schemas.microsoft.com/office/drawing/2016/11/main" r:id="rId18"/>
+                                <a1611:picAttrSrcUrl xmlns:a1611="http://schemas.microsoft.com/office/drawing/2016/11/main" r:id="rId14"/>
                               </a:ext>
                             </a:extLst>
                           </a:blip>
@@ -30400,13 +30330,13 @@
                           </pic:cNvPicPr>
                         </pic:nvPicPr>
                         <pic:blipFill>
-                          <a:blip r:embed="rId17" cstate="print">
+                          <a:blip r:embed="rId13" cstate="print">
                             <a:extLst>
                               <a:ext uri="{28A0092B-C50C-407E-A947-70E740481C1C}">
                                 <a14:useLocalDpi xmlns:a14="http://schemas.microsoft.com/office/drawing/2010/main" val="0"/>
                               </a:ext>
                               <a:ext uri="{837473B0-CC2E-450A-ABE3-18F120FF3D39}">
-                                <a1611:picAttrSrcUrl xmlns:a1611="http://schemas.microsoft.com/office/drawing/2016/11/main" r:id="rId18"/>
+                                <a1611:picAttrSrcUrl xmlns:a1611="http://schemas.microsoft.com/office/drawing/2016/11/main" r:id="rId14"/>
                               </a:ext>
                             </a:extLst>
                           </a:blip>
@@ -30463,13 +30393,13 @@
                           </pic:cNvPicPr>
                         </pic:nvPicPr>
                         <pic:blipFill>
-                          <a:blip r:embed="rId17" cstate="print">
+                          <a:blip r:embed="rId13" cstate="print">
                             <a:extLst>
                               <a:ext uri="{28A0092B-C50C-407E-A947-70E740481C1C}">
                                 <a14:useLocalDpi xmlns:a14="http://schemas.microsoft.com/office/drawing/2010/main" val="0"/>
                               </a:ext>
                               <a:ext uri="{837473B0-CC2E-450A-ABE3-18F120FF3D39}">
-                                <a1611:picAttrSrcUrl xmlns:a1611="http://schemas.microsoft.com/office/drawing/2016/11/main" r:id="rId18"/>
+                                <a1611:picAttrSrcUrl xmlns:a1611="http://schemas.microsoft.com/office/drawing/2016/11/main" r:id="rId14"/>
                               </a:ext>
                             </a:extLst>
                           </a:blip>
@@ -30526,13 +30456,13 @@
                           </pic:cNvPicPr>
                         </pic:nvPicPr>
                         <pic:blipFill>
-                          <a:blip r:embed="rId17" cstate="print">
+                          <a:blip r:embed="rId13" cstate="print">
                             <a:extLst>
                               <a:ext uri="{28A0092B-C50C-407E-A947-70E740481C1C}">
                                 <a14:useLocalDpi xmlns:a14="http://schemas.microsoft.com/office/drawing/2010/main" val="0"/>
                               </a:ext>
                               <a:ext uri="{837473B0-CC2E-450A-ABE3-18F120FF3D39}">
-                                <a1611:picAttrSrcUrl xmlns:a1611="http://schemas.microsoft.com/office/drawing/2016/11/main" r:id="rId18"/>
+                                <a1611:picAttrSrcUrl xmlns:a1611="http://schemas.microsoft.com/office/drawing/2016/11/main" r:id="rId14"/>
                               </a:ext>
                             </a:extLst>
                           </a:blip>
@@ -30589,13 +30519,13 @@
                           </pic:cNvPicPr>
                         </pic:nvPicPr>
                         <pic:blipFill>
-                          <a:blip r:embed="rId17" cstate="print">
+                          <a:blip r:embed="rId13" cstate="print">
                             <a:extLst>
                               <a:ext uri="{28A0092B-C50C-407E-A947-70E740481C1C}">
                                 <a14:useLocalDpi xmlns:a14="http://schemas.microsoft.com/office/drawing/2010/main" val="0"/>
                               </a:ext>
                               <a:ext uri="{837473B0-CC2E-450A-ABE3-18F120FF3D39}">
-                                <a1611:picAttrSrcUrl xmlns:a1611="http://schemas.microsoft.com/office/drawing/2016/11/main" r:id="rId18"/>
+                                <a1611:picAttrSrcUrl xmlns:a1611="http://schemas.microsoft.com/office/drawing/2016/11/main" r:id="rId14"/>
                               </a:ext>
                             </a:extLst>
                           </a:blip>
@@ -30695,13 +30625,13 @@
                           </pic:cNvPicPr>
                         </pic:nvPicPr>
                         <pic:blipFill>
-                          <a:blip r:embed="rId17" cstate="print">
+                          <a:blip r:embed="rId13" cstate="print">
                             <a:extLst>
                               <a:ext uri="{28A0092B-C50C-407E-A947-70E740481C1C}">
                                 <a14:useLocalDpi xmlns:a14="http://schemas.microsoft.com/office/drawing/2010/main" val="0"/>
                               </a:ext>
                               <a:ext uri="{837473B0-CC2E-450A-ABE3-18F120FF3D39}">
-                                <a1611:picAttrSrcUrl xmlns:a1611="http://schemas.microsoft.com/office/drawing/2016/11/main" r:id="rId18"/>
+                                <a1611:picAttrSrcUrl xmlns:a1611="http://schemas.microsoft.com/office/drawing/2016/11/main" r:id="rId14"/>
                               </a:ext>
                             </a:extLst>
                           </a:blip>
@@ -30758,13 +30688,13 @@
                           </pic:cNvPicPr>
                         </pic:nvPicPr>
                         <pic:blipFill>
-                          <a:blip r:embed="rId17" cstate="print">
+                          <a:blip r:embed="rId13" cstate="print">
                             <a:extLst>
                               <a:ext uri="{28A0092B-C50C-407E-A947-70E740481C1C}">
                                 <a14:useLocalDpi xmlns:a14="http://schemas.microsoft.com/office/drawing/2010/main" val="0"/>
                               </a:ext>
                               <a:ext uri="{837473B0-CC2E-450A-ABE3-18F120FF3D39}">
-                                <a1611:picAttrSrcUrl xmlns:a1611="http://schemas.microsoft.com/office/drawing/2016/11/main" r:id="rId18"/>
+                                <a1611:picAttrSrcUrl xmlns:a1611="http://schemas.microsoft.com/office/drawing/2016/11/main" r:id="rId14"/>
                               </a:ext>
                             </a:extLst>
                           </a:blip>
@@ -30821,13 +30751,13 @@
                           </pic:cNvPicPr>
                         </pic:nvPicPr>
                         <pic:blipFill>
-                          <a:blip r:embed="rId17" cstate="print">
+                          <a:blip r:embed="rId13" cstate="print">
                             <a:extLst>
                               <a:ext uri="{28A0092B-C50C-407E-A947-70E740481C1C}">
                                 <a14:useLocalDpi xmlns:a14="http://schemas.microsoft.com/office/drawing/2010/main" val="0"/>
                               </a:ext>
                               <a:ext uri="{837473B0-CC2E-450A-ABE3-18F120FF3D39}">
-                                <a1611:picAttrSrcUrl xmlns:a1611="http://schemas.microsoft.com/office/drawing/2016/11/main" r:id="rId18"/>
+                                <a1611:picAttrSrcUrl xmlns:a1611="http://schemas.microsoft.com/office/drawing/2016/11/main" r:id="rId14"/>
                               </a:ext>
                             </a:extLst>
                           </a:blip>
@@ -30884,13 +30814,13 @@
                           </pic:cNvPicPr>
                         </pic:nvPicPr>
                         <pic:blipFill>
-                          <a:blip r:embed="rId17" cstate="print">
+                          <a:blip r:embed="rId13" cstate="print">
                             <a:extLst>
                               <a:ext uri="{28A0092B-C50C-407E-A947-70E740481C1C}">
                                 <a14:useLocalDpi xmlns:a14="http://schemas.microsoft.com/office/drawing/2010/main" val="0"/>
                               </a:ext>
                               <a:ext uri="{837473B0-CC2E-450A-ABE3-18F120FF3D39}">
-                                <a1611:picAttrSrcUrl xmlns:a1611="http://schemas.microsoft.com/office/drawing/2016/11/main" r:id="rId18"/>
+                                <a1611:picAttrSrcUrl xmlns:a1611="http://schemas.microsoft.com/office/drawing/2016/11/main" r:id="rId14"/>
                               </a:ext>
                             </a:extLst>
                           </a:blip>
@@ -30947,13 +30877,13 @@
                           </pic:cNvPicPr>
                         </pic:nvPicPr>
                         <pic:blipFill>
-                          <a:blip r:embed="rId17" cstate="print">
+                          <a:blip r:embed="rId13" cstate="print">
                             <a:extLst>
                               <a:ext uri="{28A0092B-C50C-407E-A947-70E740481C1C}">
                                 <a14:useLocalDpi xmlns:a14="http://schemas.microsoft.com/office/drawing/2010/main" val="0"/>
                               </a:ext>
                               <a:ext uri="{837473B0-CC2E-450A-ABE3-18F120FF3D39}">
-                                <a1611:picAttrSrcUrl xmlns:a1611="http://schemas.microsoft.com/office/drawing/2016/11/main" r:id="rId18"/>
+                                <a1611:picAttrSrcUrl xmlns:a1611="http://schemas.microsoft.com/office/drawing/2016/11/main" r:id="rId14"/>
                               </a:ext>
                             </a:extLst>
                           </a:blip>
@@ -31010,13 +30940,13 @@
                           </pic:cNvPicPr>
                         </pic:nvPicPr>
                         <pic:blipFill>
-                          <a:blip r:embed="rId17" cstate="print">
+                          <a:blip r:embed="rId13" cstate="print">
                             <a:extLst>
                               <a:ext uri="{28A0092B-C50C-407E-A947-70E740481C1C}">
                                 <a14:useLocalDpi xmlns:a14="http://schemas.microsoft.com/office/drawing/2010/main" val="0"/>
                               </a:ext>
                               <a:ext uri="{837473B0-CC2E-450A-ABE3-18F120FF3D39}">
-                                <a1611:picAttrSrcUrl xmlns:a1611="http://schemas.microsoft.com/office/drawing/2016/11/main" r:id="rId18"/>
+                                <a1611:picAttrSrcUrl xmlns:a1611="http://schemas.microsoft.com/office/drawing/2016/11/main" r:id="rId14"/>
                               </a:ext>
                             </a:extLst>
                           </a:blip>
@@ -31073,13 +31003,13 @@
                           </pic:cNvPicPr>
                         </pic:nvPicPr>
                         <pic:blipFill>
-                          <a:blip r:embed="rId17" cstate="print">
+                          <a:blip r:embed="rId13" cstate="print">
                             <a:extLst>
                               <a:ext uri="{28A0092B-C50C-407E-A947-70E740481C1C}">
                                 <a14:useLocalDpi xmlns:a14="http://schemas.microsoft.com/office/drawing/2010/main" val="0"/>
                               </a:ext>
                               <a:ext uri="{837473B0-CC2E-450A-ABE3-18F120FF3D39}">
-                                <a1611:picAttrSrcUrl xmlns:a1611="http://schemas.microsoft.com/office/drawing/2016/11/main" r:id="rId18"/>
+                                <a1611:picAttrSrcUrl xmlns:a1611="http://schemas.microsoft.com/office/drawing/2016/11/main" r:id="rId14"/>
                               </a:ext>
                             </a:extLst>
                           </a:blip>
@@ -31144,18 +31074,8 @@
           <w:numId w:val="1"/>
         </w:numPr>
       </w:pPr>
-      <w:commentRangeStart w:id="7"/>
       <w:r>
         <w:t>Abschluss</w:t>
-      </w:r>
-      <w:commentRangeEnd w:id="7"/>
-      <w:r>
-        <w:rPr>
-          <w:rStyle w:val="Kommentarzeichen"/>
-          <w:rFonts w:asciiTheme="minorHAnsi" w:eastAsiaTheme="minorHAnsi" w:hAnsiTheme="minorHAnsi" w:cstheme="minorBidi"/>
-          <w:color w:val="auto"/>
-        </w:rPr>
-        <w:commentReference w:id="7"/>
       </w:r>
     </w:p>
     <w:p>
@@ -31292,10 +31212,15 @@
       </w:r>
       <w:r>
         <w:tab/>
-        <w:t xml:space="preserve">              </w:t>
+        <w:t xml:space="preserve">              ____</w:t>
       </w:r>
+      <w:proofErr w:type="gramStart"/>
       <w:r>
-        <w:t>_____ : _____</w:t>
+        <w:t>_ :</w:t>
+      </w:r>
+      <w:proofErr w:type="gramEnd"/>
+      <w:r>
+        <w:t xml:space="preserve"> _____</w:t>
       </w:r>
     </w:p>
     <w:p>
@@ -31442,18 +31367,12 @@
           <w:b/>
         </w:rPr>
       </w:pPr>
-      <w:bookmarkStart w:id="8" w:name="_Hlk69204279"/>
+      <w:bookmarkStart w:id="0" w:name="_Hlk69204279"/>
       <w:r>
         <w:rPr>
           <w:b/>
         </w:rPr>
-        <w:t>Stärken</w:t>
-      </w:r>
-      <w:r>
-        <w:rPr>
-          <w:b/>
-        </w:rPr>
-        <w:t>:</w:t>
+        <w:t>Stärken:</w:t>
       </w:r>
     </w:p>
     <w:p>
@@ -31543,7 +31462,7 @@
     <w:p/>
     <w:p/>
     <w:p/>
-    <w:bookmarkEnd w:id="8"/>
+    <w:bookmarkEnd w:id="0"/>
     <w:p/>
     <w:p>
       <w:pPr>
@@ -31556,13 +31475,7 @@
         <w:rPr>
           <w:b/>
         </w:rPr>
-        <w:t>Schwächen</w:t>
-      </w:r>
-      <w:r>
-        <w:rPr>
-          <w:b/>
-        </w:rPr>
-        <w:t>:</w:t>
+        <w:t>Schwächen:</w:t>
       </w:r>
     </w:p>
     <w:p>
@@ -31759,7 +31672,7 @@
     </w:p>
     <w:p/>
     <w:sectPr>
-      <w:headerReference w:type="default" r:id="rId19"/>
+      <w:headerReference w:type="default" r:id="rId15"/>
       <w:pgSz w:w="11906" w:h="16838"/>
       <w:pgMar w:top="1417" w:right="1417" w:bottom="1134" w:left="1417" w:header="708" w:footer="708" w:gutter="0"/>
       <w:cols w:space="708"/>
@@ -31769,1106 +31682,8 @@
 </w:document>
 </file>
 
-<file path=word/comments.xml><?xml version="1.0" encoding="utf-8"?>
-<w:comments xmlns:wpc="http://schemas.microsoft.com/office/word/2010/wordprocessingCanvas" xmlns:cx="http://schemas.microsoft.com/office/drawing/2014/chartex" xmlns:cx1="http://schemas.microsoft.com/office/drawing/2015/9/8/chartex" xmlns:cx2="http://schemas.microsoft.com/office/drawing/2015/10/21/chartex" xmlns:cx3="http://schemas.microsoft.com/office/drawing/2016/5/9/chartex" xmlns:cx4="http://schemas.microsoft.com/office/drawing/2016/5/10/chartex" xmlns:cx5="http://schemas.microsoft.com/office/drawing/2016/5/11/chartex" xmlns:cx6="http://schemas.microsoft.com/office/drawing/2016/5/12/chartex" xmlns:cx7="http://schemas.microsoft.com/office/drawing/2016/5/13/chartex" xmlns:cx8="http://schemas.microsoft.com/office/drawing/2016/5/14/chartex" xmlns:mc="http://schemas.openxmlformats.org/markup-compatibility/2006" xmlns:aink="http://schemas.microsoft.com/office/drawing/2016/ink" xmlns:am3d="http://schemas.microsoft.com/office/drawing/2017/model3d" xmlns:o="urn:schemas-microsoft-com:office:office" xmlns:r="http://schemas.openxmlformats.org/officeDocument/2006/relationships" xmlns:m="http://schemas.openxmlformats.org/officeDocument/2006/math" xmlns:v="urn:schemas-microsoft-com:vml" xmlns:wp14="http://schemas.microsoft.com/office/word/2010/wordprocessingDrawing" xmlns:wp="http://schemas.openxmlformats.org/drawingml/2006/wordprocessingDrawing" xmlns:w10="urn:schemas-microsoft-com:office:word" xmlns:w="http://schemas.openxmlformats.org/wordprocessingml/2006/main" xmlns:w14="http://schemas.microsoft.com/office/word/2010/wordml" xmlns:w15="http://schemas.microsoft.com/office/word/2012/wordml" xmlns:w16cex="http://schemas.microsoft.com/office/word/2018/wordml/cex" xmlns:w16cid="http://schemas.microsoft.com/office/word/2016/wordml/cid" xmlns:w16="http://schemas.microsoft.com/office/word/2018/wordml" xmlns:w16se="http://schemas.microsoft.com/office/word/2015/wordml/symex" xmlns:wpg="http://schemas.microsoft.com/office/word/2010/wordprocessingGroup" xmlns:wpi="http://schemas.microsoft.com/office/word/2010/wordprocessingInk" xmlns:wne="http://schemas.microsoft.com/office/word/2006/wordml" xmlns:wps="http://schemas.microsoft.com/office/word/2010/wordprocessingShape" mc:Ignorable="w14 w15 w16se w16cid w16 w16cex wp14">
-  <w:comment w:id="0" w:author="Mathias Müller" w:date="2021-03-24T15:40:00Z" w:initials="MM">
-    <w:p>
-      <w:pPr>
-        <w:pStyle w:val="Kommentartext"/>
-      </w:pPr>
-      <w:r>
-        <w:rPr>
-          <w:rStyle w:val="Kommentarzeichen"/>
-        </w:rPr>
-        <w:annotationRef/>
-      </w:r>
-      <w:r>
-        <w:t>Ggf. kürzer</w:t>
-      </w:r>
-    </w:p>
-  </w:comment>
-  <w:comment w:id="1" w:author="Mathias Müller" w:date="2021-03-24T15:44:00Z" w:initials="MM">
-    <w:p>
-      <w:pPr>
-        <w:pStyle w:val="Kommentartext"/>
-      </w:pPr>
-      <w:r>
-        <w:rPr>
-          <w:rStyle w:val="Kommentarzeichen"/>
-        </w:rPr>
-        <w:annotationRef/>
-      </w:r>
-      <w:r>
-        <w:t>Nach jedem Block</w:t>
-      </w:r>
-    </w:p>
-  </w:comment>
-  <w:comment w:id="2" w:author="Mathias Müller" w:date="2021-03-24T15:45:00Z" w:initials="MM">
-    <w:p>
-      <w:pPr>
-        <w:pStyle w:val="Kommentartext"/>
-      </w:pPr>
-      <w:r>
-        <w:rPr>
-          <w:rStyle w:val="Kommentarzeichen"/>
-        </w:rPr>
-        <w:annotationRef/>
-      </w:r>
-      <w:r>
-        <w:t>Am ende</w:t>
-      </w:r>
-    </w:p>
-  </w:comment>
-  <w:comment w:id="3" w:author="Mathias Müller" w:date="2021-03-24T15:57:00Z" w:initials="MM">
-    <w:p>
-      <w:pPr>
-        <w:pStyle w:val="Kommentartext"/>
-        <w:numPr>
-          <w:ilvl w:val="0"/>
-          <w:numId w:val="9"/>
-        </w:numPr>
-      </w:pPr>
-      <w:r>
-        <w:rPr>
-          <w:rStyle w:val="Kommentarzeichen"/>
-        </w:rPr>
-        <w:annotationRef/>
-      </w:r>
-      <w:r>
-        <w:t xml:space="preserve">Allgemeinen teil und </w:t>
-      </w:r>
-      <w:proofErr w:type="spellStart"/>
-      <w:r>
-        <w:t>AttrakDiff</w:t>
-      </w:r>
-      <w:proofErr w:type="spellEnd"/>
-      <w:r>
-        <w:t xml:space="preserve"> in Google Forms</w:t>
-      </w:r>
-    </w:p>
-    <w:p>
-      <w:pPr>
-        <w:pStyle w:val="Kommentartext"/>
-        <w:numPr>
-          <w:ilvl w:val="0"/>
-          <w:numId w:val="9"/>
-        </w:numPr>
-      </w:pPr>
-      <w:r>
-        <w:t>Auf Tablet für Probanden vorbereiten, zwischendurch reichen &amp; desinfizieren</w:t>
-      </w:r>
-    </w:p>
-    <w:p>
-      <w:pPr>
-        <w:pStyle w:val="Kommentartext"/>
-        <w:numPr>
-          <w:ilvl w:val="0"/>
-          <w:numId w:val="9"/>
-        </w:numPr>
-      </w:pPr>
-    </w:p>
-  </w:comment>
-  <w:comment w:id="4" w:author="Mathias Müller" w:date="2021-04-13T10:48:00Z" w:initials="MM">
-    <w:p>
-      <w:r>
-        <w:rPr>
-          <w:rStyle w:val="Kommentarzeichen"/>
-        </w:rPr>
-        <w:annotationRef/>
-      </w:r>
-      <w:r>
-        <w:t xml:space="preserve">In </w:t>
-      </w:r>
-      <w:proofErr w:type="spellStart"/>
-      <w:r>
-        <w:t>the</w:t>
-      </w:r>
-      <w:proofErr w:type="spellEnd"/>
-      <w:r>
-        <w:t xml:space="preserve"> </w:t>
-      </w:r>
-      <w:proofErr w:type="spellStart"/>
-      <w:r>
-        <w:t>following</w:t>
-      </w:r>
-      <w:proofErr w:type="spellEnd"/>
-      <w:r>
-        <w:t xml:space="preserve">, you will find </w:t>
-      </w:r>
-      <w:proofErr w:type="spellStart"/>
-      <w:r>
-        <w:t>word</w:t>
-      </w:r>
-      <w:proofErr w:type="spellEnd"/>
-      <w:r>
-        <w:t xml:space="preserve"> </w:t>
-      </w:r>
-      <w:proofErr w:type="spellStart"/>
-      <w:r>
-        <w:t>pairs</w:t>
-      </w:r>
-      <w:proofErr w:type="spellEnd"/>
-      <w:r>
-        <w:t xml:space="preserve"> </w:t>
-      </w:r>
-      <w:proofErr w:type="spellStart"/>
-      <w:r>
-        <w:t>that</w:t>
-      </w:r>
-      <w:proofErr w:type="spellEnd"/>
-      <w:r>
-        <w:t xml:space="preserve"> </w:t>
-      </w:r>
-      <w:proofErr w:type="spellStart"/>
-      <w:r>
-        <w:t>are</w:t>
-      </w:r>
-      <w:proofErr w:type="spellEnd"/>
-      <w:r>
-        <w:t xml:space="preserve"> </w:t>
-      </w:r>
-      <w:proofErr w:type="spellStart"/>
-      <w:r>
-        <w:t>intended</w:t>
-      </w:r>
-      <w:proofErr w:type="spellEnd"/>
-      <w:r>
-        <w:t xml:space="preserve"> to </w:t>
-      </w:r>
-      <w:proofErr w:type="spellStart"/>
-      <w:r>
-        <w:t>aid</w:t>
-      </w:r>
-      <w:proofErr w:type="spellEnd"/>
-      <w:r>
-        <w:t xml:space="preserve"> you in </w:t>
-      </w:r>
-      <w:proofErr w:type="spellStart"/>
-      <w:r>
-        <w:t>assessing</w:t>
-      </w:r>
-      <w:proofErr w:type="spellEnd"/>
-      <w:r>
-        <w:t xml:space="preserve"> </w:t>
-      </w:r>
-      <w:proofErr w:type="spellStart"/>
-      <w:r>
-        <w:t>the</w:t>
-      </w:r>
-      <w:proofErr w:type="spellEnd"/>
-      <w:r>
-        <w:t xml:space="preserve"> </w:t>
-      </w:r>
-      <w:proofErr w:type="spellStart"/>
-      <w:r>
-        <w:t>product</w:t>
-      </w:r>
-      <w:proofErr w:type="spellEnd"/>
-      <w:r>
-        <w:t xml:space="preserve"> </w:t>
-      </w:r>
-      <w:proofErr w:type="spellStart"/>
-      <w:r>
-        <w:t>that</w:t>
-      </w:r>
-      <w:proofErr w:type="spellEnd"/>
-      <w:r>
-        <w:t xml:space="preserve"> you </w:t>
-      </w:r>
-      <w:proofErr w:type="spellStart"/>
-      <w:r>
-        <w:t>have</w:t>
-      </w:r>
-      <w:proofErr w:type="spellEnd"/>
-      <w:r>
-        <w:t xml:space="preserve"> just </w:t>
-      </w:r>
-      <w:proofErr w:type="spellStart"/>
-      <w:r>
-        <w:t>become</w:t>
-      </w:r>
-      <w:proofErr w:type="spellEnd"/>
-      <w:r>
-        <w:t xml:space="preserve"> </w:t>
-      </w:r>
-      <w:proofErr w:type="spellStart"/>
-      <w:r>
-        <w:t>acquainted</w:t>
-      </w:r>
-      <w:proofErr w:type="spellEnd"/>
-      <w:r>
-        <w:t xml:space="preserve"> with. The </w:t>
-      </w:r>
-      <w:proofErr w:type="spellStart"/>
-      <w:r>
-        <w:t>word</w:t>
-      </w:r>
-      <w:proofErr w:type="spellEnd"/>
-      <w:r>
-        <w:t xml:space="preserve"> </w:t>
-      </w:r>
-      <w:proofErr w:type="spellStart"/>
-      <w:r>
-        <w:t>pairs</w:t>
-      </w:r>
-      <w:proofErr w:type="spellEnd"/>
-      <w:r>
-        <w:t xml:space="preserve"> </w:t>
-      </w:r>
-      <w:proofErr w:type="spellStart"/>
-      <w:r>
-        <w:t>represent</w:t>
-      </w:r>
-      <w:proofErr w:type="spellEnd"/>
-      <w:r>
-        <w:t xml:space="preserve"> extreme </w:t>
-      </w:r>
-      <w:proofErr w:type="spellStart"/>
-      <w:r>
-        <w:t>opposites</w:t>
-      </w:r>
-      <w:proofErr w:type="spellEnd"/>
-      <w:r>
-        <w:t xml:space="preserve">, with </w:t>
-      </w:r>
-      <w:proofErr w:type="spellStart"/>
-      <w:r>
-        <w:t>seven</w:t>
-      </w:r>
-      <w:proofErr w:type="spellEnd"/>
-      <w:r>
-        <w:t xml:space="preserve"> </w:t>
-      </w:r>
-      <w:proofErr w:type="spellStart"/>
-      <w:r>
-        <w:t>graduations</w:t>
-      </w:r>
-      <w:proofErr w:type="spellEnd"/>
-      <w:r>
-        <w:t xml:space="preserve"> possible </w:t>
-      </w:r>
-      <w:proofErr w:type="spellStart"/>
-      <w:r>
-        <w:t>between</w:t>
-      </w:r>
-      <w:proofErr w:type="spellEnd"/>
-      <w:r>
-        <w:t xml:space="preserve"> </w:t>
-      </w:r>
-      <w:proofErr w:type="spellStart"/>
-      <w:r>
-        <w:t>them</w:t>
-      </w:r>
-      <w:proofErr w:type="spellEnd"/>
-      <w:r>
-        <w:t xml:space="preserve">. </w:t>
-      </w:r>
-    </w:p>
-    <w:p>
-      <w:pPr>
-        <w:pStyle w:val="Kommentartext"/>
-      </w:pPr>
-    </w:p>
-  </w:comment>
-  <w:comment w:id="5" w:author="Mathias Müller" w:date="2021-04-13T10:46:00Z" w:initials="MM">
-    <w:p>
-      <w:pPr>
-        <w:pStyle w:val="Kommentartext"/>
-      </w:pPr>
-      <w:r>
-        <w:rPr>
-          <w:rStyle w:val="Kommentarzeichen"/>
-        </w:rPr>
-        <w:annotationRef/>
-      </w:r>
-      <w:r>
-        <w:t xml:space="preserve">The </w:t>
-      </w:r>
-      <w:proofErr w:type="spellStart"/>
-      <w:r>
-        <w:t>above</w:t>
-      </w:r>
-      <w:proofErr w:type="spellEnd"/>
-      <w:r>
-        <w:t xml:space="preserve"> </w:t>
-      </w:r>
-      <w:proofErr w:type="spellStart"/>
-      <w:r>
-        <w:t>evaluation</w:t>
-      </w:r>
-      <w:proofErr w:type="spellEnd"/>
-      <w:r>
-        <w:t xml:space="preserve"> </w:t>
-      </w:r>
-      <w:proofErr w:type="spellStart"/>
-      <w:r>
-        <w:t>example</w:t>
-      </w:r>
-      <w:proofErr w:type="spellEnd"/>
-      <w:r>
-        <w:t xml:space="preserve"> </w:t>
-      </w:r>
-      <w:proofErr w:type="spellStart"/>
-      <w:r>
-        <w:t>suggests</w:t>
-      </w:r>
-      <w:proofErr w:type="spellEnd"/>
-      <w:r>
-        <w:t xml:space="preserve"> </w:t>
-      </w:r>
-      <w:proofErr w:type="spellStart"/>
-      <w:r>
-        <w:t>that</w:t>
-      </w:r>
-      <w:proofErr w:type="spellEnd"/>
-      <w:r>
-        <w:t xml:space="preserve"> </w:t>
-      </w:r>
-      <w:proofErr w:type="spellStart"/>
-      <w:r>
-        <w:t>the</w:t>
-      </w:r>
-      <w:proofErr w:type="spellEnd"/>
-      <w:r>
-        <w:t xml:space="preserve"> </w:t>
-      </w:r>
-      <w:proofErr w:type="spellStart"/>
-      <w:r>
-        <w:t>product</w:t>
-      </w:r>
-      <w:proofErr w:type="spellEnd"/>
-      <w:r>
-        <w:t xml:space="preserve"> </w:t>
-      </w:r>
-      <w:proofErr w:type="spellStart"/>
-      <w:r>
-        <w:t>is</w:t>
-      </w:r>
-      <w:proofErr w:type="spellEnd"/>
-      <w:r>
-        <w:t xml:space="preserve"> </w:t>
-      </w:r>
-      <w:proofErr w:type="spellStart"/>
-      <w:r>
-        <w:t>mainly</w:t>
-      </w:r>
-      <w:proofErr w:type="spellEnd"/>
-      <w:r>
-        <w:t xml:space="preserve"> to </w:t>
-      </w:r>
-      <w:proofErr w:type="spellStart"/>
-      <w:r>
-        <w:t>your</w:t>
-      </w:r>
-      <w:proofErr w:type="spellEnd"/>
-      <w:r>
-        <w:t xml:space="preserve"> </w:t>
-      </w:r>
-      <w:proofErr w:type="spellStart"/>
-      <w:r>
-        <w:t>liking</w:t>
-      </w:r>
-      <w:proofErr w:type="spellEnd"/>
-      <w:r>
-        <w:t xml:space="preserve">, but </w:t>
-      </w:r>
-      <w:proofErr w:type="spellStart"/>
-      <w:r>
-        <w:t>could</w:t>
-      </w:r>
-      <w:proofErr w:type="spellEnd"/>
-      <w:r>
-        <w:t xml:space="preserve"> stand </w:t>
-      </w:r>
-      <w:proofErr w:type="spellStart"/>
-      <w:r>
-        <w:t>some</w:t>
-      </w:r>
-      <w:proofErr w:type="spellEnd"/>
-      <w:r>
-        <w:t xml:space="preserve"> </w:t>
-      </w:r>
-      <w:proofErr w:type="spellStart"/>
-      <w:r>
-        <w:t>improvement</w:t>
-      </w:r>
-      <w:proofErr w:type="spellEnd"/>
-      <w:r>
-        <w:t xml:space="preserve">. </w:t>
-      </w:r>
-    </w:p>
-    <w:p>
-      <w:pPr>
-        <w:pStyle w:val="Kommentartext"/>
-      </w:pPr>
-      <w:r>
-        <w:t xml:space="preserve">Do not </w:t>
-      </w:r>
-      <w:proofErr w:type="spellStart"/>
-      <w:r>
-        <w:t>ponder</w:t>
-      </w:r>
-      <w:proofErr w:type="spellEnd"/>
-      <w:r>
-        <w:t xml:space="preserve"> </w:t>
-      </w:r>
-      <w:proofErr w:type="spellStart"/>
-      <w:r>
-        <w:t>too</w:t>
-      </w:r>
-      <w:proofErr w:type="spellEnd"/>
-      <w:r>
-        <w:t xml:space="preserve"> </w:t>
-      </w:r>
-      <w:proofErr w:type="spellStart"/>
-      <w:r>
-        <w:t>long</w:t>
-      </w:r>
-      <w:proofErr w:type="spellEnd"/>
-      <w:r>
-        <w:t xml:space="preserve"> </w:t>
-      </w:r>
-      <w:proofErr w:type="spellStart"/>
-      <w:r>
-        <w:t>over</w:t>
-      </w:r>
-      <w:proofErr w:type="spellEnd"/>
-      <w:r>
-        <w:t xml:space="preserve"> </w:t>
-      </w:r>
-      <w:proofErr w:type="spellStart"/>
-      <w:r>
-        <w:t>your</w:t>
-      </w:r>
-      <w:proofErr w:type="spellEnd"/>
-      <w:r>
-        <w:t xml:space="preserve"> </w:t>
-      </w:r>
-      <w:proofErr w:type="spellStart"/>
-      <w:r>
-        <w:t>response</w:t>
-      </w:r>
-      <w:proofErr w:type="spellEnd"/>
-      <w:r>
-        <w:t xml:space="preserve">. Just </w:t>
-      </w:r>
-      <w:proofErr w:type="spellStart"/>
-      <w:r>
-        <w:t>offer</w:t>
-      </w:r>
-      <w:proofErr w:type="spellEnd"/>
-      <w:r>
-        <w:t xml:space="preserve"> </w:t>
-      </w:r>
-      <w:proofErr w:type="spellStart"/>
-      <w:r>
-        <w:t>the</w:t>
-      </w:r>
-      <w:proofErr w:type="spellEnd"/>
-      <w:r>
-        <w:t xml:space="preserve"> </w:t>
-      </w:r>
-      <w:proofErr w:type="spellStart"/>
-      <w:r>
-        <w:t>first</w:t>
-      </w:r>
-      <w:proofErr w:type="spellEnd"/>
-      <w:r>
-        <w:t xml:space="preserve"> </w:t>
-      </w:r>
-      <w:proofErr w:type="spellStart"/>
-      <w:r>
-        <w:t>assessment</w:t>
-      </w:r>
-      <w:proofErr w:type="spellEnd"/>
-      <w:r>
-        <w:t xml:space="preserve"> </w:t>
-      </w:r>
-      <w:proofErr w:type="spellStart"/>
-      <w:r>
-        <w:t>that</w:t>
-      </w:r>
-      <w:proofErr w:type="spellEnd"/>
-      <w:r>
-        <w:t xml:space="preserve"> </w:t>
-      </w:r>
-      <w:proofErr w:type="spellStart"/>
-      <w:r>
-        <w:t>enters</w:t>
-      </w:r>
-      <w:proofErr w:type="spellEnd"/>
-      <w:r>
-        <w:t xml:space="preserve"> </w:t>
-      </w:r>
-      <w:proofErr w:type="spellStart"/>
-      <w:r>
-        <w:t>your</w:t>
-      </w:r>
-      <w:proofErr w:type="spellEnd"/>
-      <w:r>
-        <w:t xml:space="preserve"> mind. </w:t>
-      </w:r>
-    </w:p>
-    <w:p>
-      <w:pPr>
-        <w:pStyle w:val="Kommentartext"/>
-      </w:pPr>
-      <w:proofErr w:type="spellStart"/>
-      <w:r>
-        <w:t>Perhaps</w:t>
-      </w:r>
-      <w:proofErr w:type="spellEnd"/>
-      <w:r>
-        <w:t xml:space="preserve"> </w:t>
-      </w:r>
-      <w:proofErr w:type="spellStart"/>
-      <w:r>
-        <w:t>some</w:t>
-      </w:r>
-      <w:proofErr w:type="spellEnd"/>
-      <w:r>
-        <w:t xml:space="preserve"> of </w:t>
-      </w:r>
-      <w:proofErr w:type="spellStart"/>
-      <w:r>
-        <w:t>the</w:t>
-      </w:r>
-      <w:proofErr w:type="spellEnd"/>
-      <w:r>
-        <w:t xml:space="preserve"> </w:t>
-      </w:r>
-      <w:proofErr w:type="spellStart"/>
-      <w:r>
-        <w:t>assessment</w:t>
-      </w:r>
-      <w:proofErr w:type="spellEnd"/>
-      <w:r>
-        <w:t xml:space="preserve"> </w:t>
-      </w:r>
-      <w:proofErr w:type="spellStart"/>
-      <w:r>
-        <w:t>terms</w:t>
-      </w:r>
-      <w:proofErr w:type="spellEnd"/>
-      <w:r>
-        <w:t xml:space="preserve"> </w:t>
-      </w:r>
-      <w:proofErr w:type="spellStart"/>
-      <w:r>
-        <w:t>are</w:t>
-      </w:r>
-      <w:proofErr w:type="spellEnd"/>
-      <w:r>
-        <w:t xml:space="preserve"> not </w:t>
-      </w:r>
-      <w:proofErr w:type="spellStart"/>
-      <w:r>
-        <w:t>quite</w:t>
-      </w:r>
-      <w:proofErr w:type="spellEnd"/>
-      <w:r>
-        <w:t xml:space="preserve"> </w:t>
-      </w:r>
-      <w:proofErr w:type="spellStart"/>
-      <w:r>
-        <w:t>suitable</w:t>
-      </w:r>
-      <w:proofErr w:type="spellEnd"/>
-      <w:r>
-        <w:t xml:space="preserve"> to </w:t>
-      </w:r>
-      <w:proofErr w:type="spellStart"/>
-      <w:r>
-        <w:t>the</w:t>
-      </w:r>
-      <w:proofErr w:type="spellEnd"/>
-      <w:r>
-        <w:t xml:space="preserve"> </w:t>
-      </w:r>
-      <w:proofErr w:type="spellStart"/>
-      <w:r>
-        <w:t>product</w:t>
-      </w:r>
-      <w:proofErr w:type="spellEnd"/>
-      <w:r>
-        <w:t xml:space="preserve">. </w:t>
-      </w:r>
-      <w:proofErr w:type="spellStart"/>
-      <w:r>
-        <w:t>Despite</w:t>
-      </w:r>
-      <w:proofErr w:type="spellEnd"/>
-      <w:r>
-        <w:t xml:space="preserve"> </w:t>
-      </w:r>
-      <w:proofErr w:type="spellStart"/>
-      <w:r>
-        <w:t>this</w:t>
-      </w:r>
-      <w:proofErr w:type="spellEnd"/>
-      <w:r>
-        <w:t xml:space="preserve">, </w:t>
-      </w:r>
-      <w:proofErr w:type="spellStart"/>
-      <w:r>
-        <w:t>however</w:t>
-      </w:r>
-      <w:proofErr w:type="spellEnd"/>
-      <w:r>
-        <w:t xml:space="preserve">, </w:t>
-      </w:r>
-      <w:proofErr w:type="spellStart"/>
-      <w:r>
-        <w:t>please</w:t>
-      </w:r>
-      <w:proofErr w:type="spellEnd"/>
-      <w:r>
-        <w:t xml:space="preserve"> </w:t>
-      </w:r>
-      <w:proofErr w:type="spellStart"/>
-      <w:r>
-        <w:t>checkmark</w:t>
-      </w:r>
-      <w:proofErr w:type="spellEnd"/>
-      <w:r>
-        <w:t xml:space="preserve"> at least </w:t>
-      </w:r>
-      <w:proofErr w:type="spellStart"/>
-      <w:r>
-        <w:t>one</w:t>
-      </w:r>
-      <w:proofErr w:type="spellEnd"/>
-      <w:r>
-        <w:t xml:space="preserve"> box in </w:t>
-      </w:r>
-      <w:proofErr w:type="spellStart"/>
-      <w:r>
-        <w:t>the</w:t>
-      </w:r>
-      <w:proofErr w:type="spellEnd"/>
-      <w:r>
-        <w:t xml:space="preserve"> </w:t>
-      </w:r>
-      <w:proofErr w:type="spellStart"/>
-      <w:r>
-        <w:t>scale</w:t>
-      </w:r>
-      <w:proofErr w:type="spellEnd"/>
-      <w:r>
-        <w:t xml:space="preserve">. </w:t>
-      </w:r>
-      <w:proofErr w:type="spellStart"/>
-      <w:r>
-        <w:t>Please</w:t>
-      </w:r>
-      <w:proofErr w:type="spellEnd"/>
-      <w:r>
-        <w:t xml:space="preserve"> </w:t>
-      </w:r>
-      <w:proofErr w:type="spellStart"/>
-      <w:r>
-        <w:t>consider</w:t>
-      </w:r>
-      <w:proofErr w:type="spellEnd"/>
-      <w:r>
-        <w:t xml:space="preserve"> </w:t>
-      </w:r>
-      <w:proofErr w:type="spellStart"/>
-      <w:r>
-        <w:t>that</w:t>
-      </w:r>
-      <w:proofErr w:type="spellEnd"/>
-      <w:r>
-        <w:t xml:space="preserve"> </w:t>
-      </w:r>
-      <w:proofErr w:type="spellStart"/>
-      <w:r>
-        <w:t>there</w:t>
-      </w:r>
-      <w:proofErr w:type="spellEnd"/>
-      <w:r>
-        <w:t xml:space="preserve"> </w:t>
-      </w:r>
-      <w:proofErr w:type="spellStart"/>
-      <w:r>
-        <w:t>are</w:t>
-      </w:r>
-      <w:proofErr w:type="spellEnd"/>
-      <w:r>
-        <w:t xml:space="preserve"> </w:t>
-      </w:r>
-      <w:proofErr w:type="spellStart"/>
-      <w:r>
-        <w:t>no</w:t>
-      </w:r>
-      <w:proofErr w:type="spellEnd"/>
-      <w:r>
-        <w:t xml:space="preserve"> “</w:t>
-      </w:r>
-      <w:proofErr w:type="spellStart"/>
-      <w:r>
-        <w:t>correct</w:t>
-      </w:r>
-      <w:proofErr w:type="spellEnd"/>
-      <w:r>
-        <w:t xml:space="preserve">” </w:t>
-      </w:r>
-      <w:proofErr w:type="spellStart"/>
-      <w:r>
-        <w:t>or</w:t>
-      </w:r>
-      <w:proofErr w:type="spellEnd"/>
-      <w:r>
-        <w:t xml:space="preserve"> “</w:t>
-      </w:r>
-      <w:proofErr w:type="spellStart"/>
-      <w:r>
-        <w:t>incorrect</w:t>
-      </w:r>
-      <w:proofErr w:type="spellEnd"/>
-      <w:r>
-        <w:t xml:space="preserve">” </w:t>
-      </w:r>
-      <w:proofErr w:type="spellStart"/>
-      <w:r>
-        <w:t>answers</w:t>
-      </w:r>
-      <w:proofErr w:type="spellEnd"/>
-      <w:r>
-        <w:t xml:space="preserve"> – </w:t>
-      </w:r>
-      <w:proofErr w:type="spellStart"/>
-      <w:r>
-        <w:t>only</w:t>
-      </w:r>
-      <w:proofErr w:type="spellEnd"/>
-      <w:r>
-        <w:t xml:space="preserve"> </w:t>
-      </w:r>
-      <w:proofErr w:type="spellStart"/>
-      <w:r>
-        <w:t>your</w:t>
-      </w:r>
-      <w:proofErr w:type="spellEnd"/>
-      <w:r>
-        <w:t xml:space="preserve"> own personal </w:t>
-      </w:r>
-      <w:proofErr w:type="spellStart"/>
-      <w:r>
-        <w:t>opinion</w:t>
-      </w:r>
-      <w:proofErr w:type="spellEnd"/>
-      <w:r>
-        <w:t xml:space="preserve"> </w:t>
-      </w:r>
-      <w:proofErr w:type="spellStart"/>
-      <w:r>
-        <w:t>counts</w:t>
-      </w:r>
-      <w:proofErr w:type="spellEnd"/>
-      <w:r>
-        <w:t>!</w:t>
-      </w:r>
-    </w:p>
-  </w:comment>
-  <w:comment w:id="6" w:author="Mathias Müller" w:date="2021-04-13T10:53:00Z" w:initials="MM">
-    <w:p>
-      <w:r>
-        <w:rPr>
-          <w:rStyle w:val="Kommentarzeichen"/>
-        </w:rPr>
-        <w:annotationRef/>
-      </w:r>
-      <w:proofErr w:type="spellStart"/>
-      <w:r>
-        <w:t>Please</w:t>
-      </w:r>
-      <w:proofErr w:type="spellEnd"/>
-      <w:r>
-        <w:t xml:space="preserve"> </w:t>
-      </w:r>
-      <w:proofErr w:type="spellStart"/>
-      <w:r>
-        <w:t>provide</w:t>
-      </w:r>
-      <w:proofErr w:type="spellEnd"/>
-      <w:r>
-        <w:t xml:space="preserve"> </w:t>
-      </w:r>
-      <w:proofErr w:type="spellStart"/>
-      <w:r>
-        <w:t>your</w:t>
-      </w:r>
-      <w:proofErr w:type="spellEnd"/>
-      <w:r>
-        <w:t xml:space="preserve"> </w:t>
-      </w:r>
-      <w:proofErr w:type="spellStart"/>
-      <w:r>
-        <w:t>impressions</w:t>
-      </w:r>
-      <w:proofErr w:type="spellEnd"/>
-      <w:r>
-        <w:t xml:space="preserve"> of </w:t>
-      </w:r>
-      <w:proofErr w:type="spellStart"/>
-      <w:r>
-        <w:t>the</w:t>
-      </w:r>
-      <w:proofErr w:type="spellEnd"/>
-      <w:r>
-        <w:t xml:space="preserve"> </w:t>
-      </w:r>
-      <w:proofErr w:type="spellStart"/>
-      <w:r>
-        <w:t>product</w:t>
-      </w:r>
-      <w:proofErr w:type="spellEnd"/>
-      <w:r>
-        <w:t xml:space="preserve"> you </w:t>
-      </w:r>
-      <w:proofErr w:type="spellStart"/>
-      <w:r>
-        <w:t>have</w:t>
-      </w:r>
-      <w:proofErr w:type="spellEnd"/>
-      <w:r>
-        <w:t xml:space="preserve"> </w:t>
-      </w:r>
-      <w:proofErr w:type="spellStart"/>
-      <w:r>
-        <w:t>tested</w:t>
-      </w:r>
-      <w:proofErr w:type="spellEnd"/>
-      <w:r>
-        <w:t xml:space="preserve"> </w:t>
-      </w:r>
-      <w:proofErr w:type="spellStart"/>
-      <w:r>
-        <w:t>by</w:t>
-      </w:r>
-      <w:proofErr w:type="spellEnd"/>
-      <w:r>
-        <w:t xml:space="preserve"> check </w:t>
-      </w:r>
-      <w:proofErr w:type="spellStart"/>
-      <w:r>
-        <w:t>marking</w:t>
-      </w:r>
-      <w:proofErr w:type="spellEnd"/>
-      <w:r>
-        <w:t xml:space="preserve"> </w:t>
-      </w:r>
-      <w:proofErr w:type="spellStart"/>
-      <w:r>
-        <w:t>your</w:t>
-      </w:r>
-      <w:proofErr w:type="spellEnd"/>
-      <w:r>
-        <w:t xml:space="preserve"> </w:t>
-      </w:r>
-      <w:proofErr w:type="spellStart"/>
-      <w:r>
-        <w:t>impression</w:t>
-      </w:r>
-      <w:proofErr w:type="spellEnd"/>
-      <w:r>
-        <w:t xml:space="preserve"> on </w:t>
-      </w:r>
-      <w:proofErr w:type="spellStart"/>
-      <w:r>
-        <w:t>the</w:t>
-      </w:r>
-      <w:proofErr w:type="spellEnd"/>
-      <w:r>
-        <w:t xml:space="preserve"> </w:t>
-      </w:r>
-      <w:proofErr w:type="spellStart"/>
-      <w:r>
-        <w:t>scale</w:t>
-      </w:r>
-      <w:proofErr w:type="spellEnd"/>
-      <w:r>
-        <w:t xml:space="preserve"> </w:t>
-      </w:r>
-      <w:proofErr w:type="spellStart"/>
-      <w:r>
-        <w:t>between</w:t>
-      </w:r>
-      <w:proofErr w:type="spellEnd"/>
-      <w:r>
-        <w:t xml:space="preserve"> </w:t>
-      </w:r>
-      <w:proofErr w:type="spellStart"/>
-      <w:r>
-        <w:t>the</w:t>
-      </w:r>
-      <w:proofErr w:type="spellEnd"/>
-      <w:r>
-        <w:t xml:space="preserve"> </w:t>
-      </w:r>
-      <w:proofErr w:type="spellStart"/>
-      <w:r>
-        <w:t>terms</w:t>
-      </w:r>
-      <w:proofErr w:type="spellEnd"/>
-      <w:r>
-        <w:t xml:space="preserve"> </w:t>
-      </w:r>
-      <w:proofErr w:type="spellStart"/>
-      <w:r>
-        <w:t>offered</w:t>
-      </w:r>
-      <w:proofErr w:type="spellEnd"/>
-      <w:r>
-        <w:t xml:space="preserve"> in </w:t>
-      </w:r>
-      <w:proofErr w:type="spellStart"/>
-      <w:r>
-        <w:t>each</w:t>
-      </w:r>
-      <w:proofErr w:type="spellEnd"/>
-      <w:r>
-        <w:t xml:space="preserve"> </w:t>
-      </w:r>
-      <w:proofErr w:type="spellStart"/>
-      <w:r>
-        <w:t>line</w:t>
-      </w:r>
-      <w:proofErr w:type="spellEnd"/>
-    </w:p>
-    <w:p>
-      <w:pPr>
-        <w:pStyle w:val="Kommentartext"/>
-      </w:pPr>
-    </w:p>
-  </w:comment>
-  <w:comment w:id="7" w:author="Mathias Müller" w:date="2021-03-24T15:46:00Z" w:initials="MM">
-    <w:p>
-      <w:pPr>
-        <w:pStyle w:val="Kommentartext"/>
-      </w:pPr>
-      <w:r>
-        <w:rPr>
-          <w:rStyle w:val="Kommentarzeichen"/>
-        </w:rPr>
-        <w:annotationRef/>
-      </w:r>
-      <w:r>
-        <w:t>Durch den Versuchsleiter auszufüllen:</w:t>
-      </w:r>
-    </w:p>
-    <w:p>
-      <w:pPr>
-        <w:pStyle w:val="Kommentartext"/>
-        <w:numPr>
-          <w:ilvl w:val="0"/>
-          <w:numId w:val="8"/>
-        </w:numPr>
-      </w:pPr>
-      <w:r>
-        <w:t xml:space="preserve"> Zeitraum für Versuchsdurchführung</w:t>
-      </w:r>
-    </w:p>
-    <w:p>
-      <w:pPr>
-        <w:pStyle w:val="Kommentartext"/>
-        <w:numPr>
-          <w:ilvl w:val="0"/>
-          <w:numId w:val="8"/>
-        </w:numPr>
-      </w:pPr>
-      <w:r>
-        <w:t xml:space="preserve"> Abschließende Frage zu Anmerkungen zum versuch / System, …</w:t>
-      </w:r>
-    </w:p>
-    <w:p>
-      <w:pPr>
-        <w:pStyle w:val="Kommentartext"/>
-        <w:numPr>
-          <w:ilvl w:val="0"/>
-          <w:numId w:val="8"/>
-        </w:numPr>
-      </w:pPr>
-      <w:r>
-        <w:t xml:space="preserve"> Abschließende Frage zu Stärken / Schwächen </w:t>
-      </w:r>
-      <w:proofErr w:type="spellStart"/>
-      <w:r>
-        <w:t>Elastic</w:t>
-      </w:r>
-      <w:proofErr w:type="spellEnd"/>
-      <w:r>
-        <w:t xml:space="preserve"> Display</w:t>
-      </w:r>
-    </w:p>
-    <w:p>
-      <w:pPr>
-        <w:pStyle w:val="Kommentartext"/>
-        <w:numPr>
-          <w:ilvl w:val="0"/>
-          <w:numId w:val="8"/>
-        </w:numPr>
-      </w:pPr>
-      <w:r>
-        <w:t xml:space="preserve">Beobachtungsprotokoll durch </w:t>
-      </w:r>
-      <w:proofErr w:type="spellStart"/>
-      <w:r>
-        <w:t>Versuchleiter</w:t>
-      </w:r>
-      <w:proofErr w:type="spellEnd"/>
-    </w:p>
-    <w:p>
-      <w:pPr>
-        <w:pStyle w:val="Kommentartext"/>
-      </w:pPr>
-    </w:p>
-  </w:comment>
-</w:comments>
-</file>
-
-<file path=word/commentsExtended.xml><?xml version="1.0" encoding="utf-8"?>
-<w15:commentsEx xmlns:wpc="http://schemas.microsoft.com/office/word/2010/wordprocessingCanvas" xmlns:cx="http://schemas.microsoft.com/office/drawing/2014/chartex" xmlns:cx1="http://schemas.microsoft.com/office/drawing/2015/9/8/chartex" xmlns:cx2="http://schemas.microsoft.com/office/drawing/2015/10/21/chartex" xmlns:cx3="http://schemas.microsoft.com/office/drawing/2016/5/9/chartex" xmlns:cx4="http://schemas.microsoft.com/office/drawing/2016/5/10/chartex" xmlns:cx5="http://schemas.microsoft.com/office/drawing/2016/5/11/chartex" xmlns:cx6="http://schemas.microsoft.com/office/drawing/2016/5/12/chartex" xmlns:cx7="http://schemas.microsoft.com/office/drawing/2016/5/13/chartex" xmlns:cx8="http://schemas.microsoft.com/office/drawing/2016/5/14/chartex" xmlns:mc="http://schemas.openxmlformats.org/markup-compatibility/2006" xmlns:aink="http://schemas.microsoft.com/office/drawing/2016/ink" xmlns:am3d="http://schemas.microsoft.com/office/drawing/2017/model3d" xmlns:o="urn:schemas-microsoft-com:office:office" xmlns:r="http://schemas.openxmlformats.org/officeDocument/2006/relationships" xmlns:m="http://schemas.openxmlformats.org/officeDocument/2006/math" xmlns:v="urn:schemas-microsoft-com:vml" xmlns:wp14="http://schemas.microsoft.com/office/word/2010/wordprocessingDrawing" xmlns:wp="http://schemas.openxmlformats.org/drawingml/2006/wordprocessingDrawing" xmlns:w10="urn:schemas-microsoft-com:office:word" xmlns:w="http://schemas.openxmlformats.org/wordprocessingml/2006/main" xmlns:w14="http://schemas.microsoft.com/office/word/2010/wordml" xmlns:w15="http://schemas.microsoft.com/office/word/2012/wordml" xmlns:w16cex="http://schemas.microsoft.com/office/word/2018/wordml/cex" xmlns:w16cid="http://schemas.microsoft.com/office/word/2016/wordml/cid" xmlns:w16="http://schemas.microsoft.com/office/word/2018/wordml" xmlns:w16se="http://schemas.microsoft.com/office/word/2015/wordml/symex" xmlns:wpg="http://schemas.microsoft.com/office/word/2010/wordprocessingGroup" xmlns:wpi="http://schemas.microsoft.com/office/word/2010/wordprocessingInk" xmlns:wne="http://schemas.microsoft.com/office/word/2006/wordml" xmlns:wps="http://schemas.microsoft.com/office/word/2010/wordprocessingShape" mc:Ignorable="w14 w15 w16se w16cid w16 w16cex wp14">
-  <w15:commentEx w15:paraId="76F79D5A" w15:done="1"/>
-  <w15:commentEx w15:paraId="18885705" w15:done="1"/>
-  <w15:commentEx w15:paraId="4CEA5E10" w15:done="1"/>
-  <w15:commentEx w15:paraId="0B404127" w15:done="0"/>
-  <w15:commentEx w15:paraId="198E7C87" w15:done="0"/>
-  <w15:commentEx w15:paraId="7629D4E4" w15:done="0"/>
-  <w15:commentEx w15:paraId="57FB2956" w15:done="0"/>
-  <w15:commentEx w15:paraId="565B024F" w15:done="0"/>
-</w15:commentsEx>
-</file>
-
-<file path=word/commentsExtensible.xml><?xml version="1.0" encoding="utf-8"?>
-<w16cex:commentsExtensible xmlns:wpc="http://schemas.microsoft.com/office/word/2010/wordprocessingCanvas" xmlns:cx="http://schemas.microsoft.com/office/drawing/2014/chartex" xmlns:cx1="http://schemas.microsoft.com/office/drawing/2015/9/8/chartex" xmlns:cx2="http://schemas.microsoft.com/office/drawing/2015/10/21/chartex" xmlns:cx3="http://schemas.microsoft.com/office/drawing/2016/5/9/chartex" xmlns:cx4="http://schemas.microsoft.com/office/drawing/2016/5/10/chartex" xmlns:cx5="http://schemas.microsoft.com/office/drawing/2016/5/11/chartex" xmlns:cx6="http://schemas.microsoft.com/office/drawing/2016/5/12/chartex" xmlns:cx7="http://schemas.microsoft.com/office/drawing/2016/5/13/chartex" xmlns:cx8="http://schemas.microsoft.com/office/drawing/2016/5/14/chartex" xmlns:mc="http://schemas.openxmlformats.org/markup-compatibility/2006" xmlns:aink="http://schemas.microsoft.com/office/drawing/2016/ink" xmlns:am3d="http://schemas.microsoft.com/office/drawing/2017/model3d" xmlns:o="urn:schemas-microsoft-com:office:office" xmlns:r="http://schemas.openxmlformats.org/officeDocument/2006/relationships" xmlns:m="http://schemas.openxmlformats.org/officeDocument/2006/math" xmlns:v="urn:schemas-microsoft-com:vml" xmlns:wp14="http://schemas.microsoft.com/office/word/2010/wordprocessingDrawing" xmlns:wp="http://schemas.openxmlformats.org/drawingml/2006/wordprocessingDrawing" xmlns:w10="urn:schemas-microsoft-com:office:word" xmlns:w="http://schemas.openxmlformats.org/wordprocessingml/2006/main" xmlns:w14="http://schemas.microsoft.com/office/word/2010/wordml" xmlns:w15="http://schemas.microsoft.com/office/word/2012/wordml" xmlns:w16cex="http://schemas.microsoft.com/office/word/2018/wordml/cex" xmlns:w16cid="http://schemas.microsoft.com/office/word/2016/wordml/cid" xmlns:w16="http://schemas.microsoft.com/office/word/2018/wordml" xmlns:w16se="http://schemas.microsoft.com/office/word/2015/wordml/symex" xmlns:wpg="http://schemas.microsoft.com/office/word/2010/wordprocessingGroup" xmlns:wpi="http://schemas.microsoft.com/office/word/2010/wordprocessingInk" xmlns:wne="http://schemas.microsoft.com/office/word/2006/wordml" xmlns:wps="http://schemas.microsoft.com/office/word/2010/wordprocessingShape" mc:Ignorable="w14 w15 w16se w16cid w16 w16cex wp14">
-  <w16cex:commentExtensible w16cex:durableId="2405DBEA" w16cex:dateUtc="2021-03-24T14:40:00Z"/>
-  <w16cex:commentExtensible w16cex:durableId="2405DCF6" w16cex:dateUtc="2021-03-24T14:44:00Z"/>
-  <w16cex:commentExtensible w16cex:durableId="2405DD2C" w16cex:dateUtc="2021-03-24T14:45:00Z"/>
-  <w16cex:commentExtensible w16cex:durableId="2405DFEF" w16cex:dateUtc="2021-03-24T14:57:00Z"/>
-  <w16cex:commentExtensible w16cex:durableId="241FF566" w16cex:dateUtc="2021-04-13T08:48:00Z"/>
-  <w16cex:commentExtensible w16cex:durableId="241FF4F6" w16cex:dateUtc="2021-04-13T08:46:00Z"/>
-  <w16cex:commentExtensible w16cex:durableId="241FF69B" w16cex:dateUtc="2021-04-13T08:53:00Z"/>
-  <w16cex:commentExtensible w16cex:durableId="2405DD47" w16cex:dateUtc="2021-03-24T14:46:00Z"/>
-</w16cex:commentsExtensible>
-</file>
-
-<file path=word/commentsIds.xml><?xml version="1.0" encoding="utf-8"?>
-<w16cid:commentsIds xmlns:wpc="http://schemas.microsoft.com/office/word/2010/wordprocessingCanvas" xmlns:cx="http://schemas.microsoft.com/office/drawing/2014/chartex" xmlns:cx1="http://schemas.microsoft.com/office/drawing/2015/9/8/chartex" xmlns:cx2="http://schemas.microsoft.com/office/drawing/2015/10/21/chartex" xmlns:cx3="http://schemas.microsoft.com/office/drawing/2016/5/9/chartex" xmlns:cx4="http://schemas.microsoft.com/office/drawing/2016/5/10/chartex" xmlns:cx5="http://schemas.microsoft.com/office/drawing/2016/5/11/chartex" xmlns:cx6="http://schemas.microsoft.com/office/drawing/2016/5/12/chartex" xmlns:cx7="http://schemas.microsoft.com/office/drawing/2016/5/13/chartex" xmlns:cx8="http://schemas.microsoft.com/office/drawing/2016/5/14/chartex" xmlns:mc="http://schemas.openxmlformats.org/markup-compatibility/2006" xmlns:aink="http://schemas.microsoft.com/office/drawing/2016/ink" xmlns:am3d="http://schemas.microsoft.com/office/drawing/2017/model3d" xmlns:o="urn:schemas-microsoft-com:office:office" xmlns:r="http://schemas.openxmlformats.org/officeDocument/2006/relationships" xmlns:m="http://schemas.openxmlformats.org/officeDocument/2006/math" xmlns:v="urn:schemas-microsoft-com:vml" xmlns:wp14="http://schemas.microsoft.com/office/word/2010/wordprocessingDrawing" xmlns:wp="http://schemas.openxmlformats.org/drawingml/2006/wordprocessingDrawing" xmlns:w10="urn:schemas-microsoft-com:office:word" xmlns:w="http://schemas.openxmlformats.org/wordprocessingml/2006/main" xmlns:w14="http://schemas.microsoft.com/office/word/2010/wordml" xmlns:w15="http://schemas.microsoft.com/office/word/2012/wordml" xmlns:w16cex="http://schemas.microsoft.com/office/word/2018/wordml/cex" xmlns:w16cid="http://schemas.microsoft.com/office/word/2016/wordml/cid" xmlns:w16="http://schemas.microsoft.com/office/word/2018/wordml" xmlns:w16se="http://schemas.microsoft.com/office/word/2015/wordml/symex" xmlns:wpg="http://schemas.microsoft.com/office/word/2010/wordprocessingGroup" xmlns:wpi="http://schemas.microsoft.com/office/word/2010/wordprocessingInk" xmlns:wne="http://schemas.microsoft.com/office/word/2006/wordml" xmlns:wps="http://schemas.microsoft.com/office/word/2010/wordprocessingShape" mc:Ignorable="w14 w15 w16se w16cid w16 w16cex wp14">
-  <w16cid:commentId w16cid:paraId="76F79D5A" w16cid:durableId="2405DBEA"/>
-  <w16cid:commentId w16cid:paraId="18885705" w16cid:durableId="2405DCF6"/>
-  <w16cid:commentId w16cid:paraId="4CEA5E10" w16cid:durableId="2405DD2C"/>
-  <w16cid:commentId w16cid:paraId="0B404127" w16cid:durableId="2405DFEF"/>
-  <w16cid:commentId w16cid:paraId="198E7C87" w16cid:durableId="241FF566"/>
-  <w16cid:commentId w16cid:paraId="7629D4E4" w16cid:durableId="241FF4F6"/>
-  <w16cid:commentId w16cid:paraId="57FB2956" w16cid:durableId="241FF69B"/>
-  <w16cid:commentId w16cid:paraId="565B024F" w16cid:durableId="2405DD47"/>
-</w16cid:commentsIds>
-</file>
-
 <file path=word/endnotes.xml><?xml version="1.0" encoding="utf-8"?>
-<w:endnotes xmlns:wpc="http://schemas.microsoft.com/office/word/2010/wordprocessingCanvas" xmlns:cx="http://schemas.microsoft.com/office/drawing/2014/chartex" xmlns:cx1="http://schemas.microsoft.com/office/drawing/2015/9/8/chartex" xmlns:cx2="http://schemas.microsoft.com/office/drawing/2015/10/21/chartex" xmlns:cx3="http://schemas.microsoft.com/office/drawing/2016/5/9/chartex" xmlns:cx4="http://schemas.microsoft.com/office/drawing/2016/5/10/chartex" xmlns:cx5="http://schemas.microsoft.com/office/drawing/2016/5/11/chartex" xmlns:cx6="http://schemas.microsoft.com/office/drawing/2016/5/12/chartex" xmlns:cx7="http://schemas.microsoft.com/office/drawing/2016/5/13/chartex" xmlns:cx8="http://schemas.microsoft.com/office/drawing/2016/5/14/chartex" xmlns:mc="http://schemas.openxmlformats.org/markup-compatibility/2006" xmlns:aink="http://schemas.microsoft.com/office/drawing/2016/ink" xmlns:am3d="http://schemas.microsoft.com/office/drawing/2017/model3d" xmlns:o="urn:schemas-microsoft-com:office:office" xmlns:r="http://schemas.openxmlformats.org/officeDocument/2006/relationships" xmlns:m="http://schemas.openxmlformats.org/officeDocument/2006/math" xmlns:v="urn:schemas-microsoft-com:vml" xmlns:wp14="http://schemas.microsoft.com/office/word/2010/wordprocessingDrawing" xmlns:wp="http://schemas.openxmlformats.org/drawingml/2006/wordprocessingDrawing" xmlns:w10="urn:schemas-microsoft-com:office:word" xmlns:w="http://schemas.openxmlformats.org/wordprocessingml/2006/main" xmlns:w14="http://schemas.microsoft.com/office/word/2010/wordml" xmlns:w15="http://schemas.microsoft.com/office/word/2012/wordml" xmlns:w16cex="http://schemas.microsoft.com/office/word/2018/wordml/cex" xmlns:w16cid="http://schemas.microsoft.com/office/word/2016/wordml/cid" xmlns:w16="http://schemas.microsoft.com/office/word/2018/wordml" xmlns:w16se="http://schemas.microsoft.com/office/word/2015/wordml/symex" xmlns:wpg="http://schemas.microsoft.com/office/word/2010/wordprocessingGroup" xmlns:wpi="http://schemas.microsoft.com/office/word/2010/wordprocessingInk" xmlns:wne="http://schemas.microsoft.com/office/word/2006/wordml" xmlns:wps="http://schemas.microsoft.com/office/word/2010/wordprocessingShape" mc:Ignorable="w14 w15 w16se w16cid w16 w16cex wp14">
+<w:endnotes xmlns:wpc="http://schemas.microsoft.com/office/word/2010/wordprocessingCanvas" xmlns:cx="http://schemas.microsoft.com/office/drawing/2014/chartex" xmlns:cx1="http://schemas.microsoft.com/office/drawing/2015/9/8/chartex" xmlns:cx2="http://schemas.microsoft.com/office/drawing/2015/10/21/chartex" xmlns:cx3="http://schemas.microsoft.com/office/drawing/2016/5/9/chartex" xmlns:cx4="http://schemas.microsoft.com/office/drawing/2016/5/10/chartex" xmlns:cx5="http://schemas.microsoft.com/office/drawing/2016/5/11/chartex" xmlns:cx6="http://schemas.microsoft.com/office/drawing/2016/5/12/chartex" xmlns:cx7="http://schemas.microsoft.com/office/drawing/2016/5/13/chartex" xmlns:cx8="http://schemas.microsoft.com/office/drawing/2016/5/14/chartex" xmlns:mc="http://schemas.openxmlformats.org/markup-compatibility/2006" xmlns:aink="http://schemas.microsoft.com/office/drawing/2016/ink" xmlns:am3d="http://schemas.microsoft.com/office/drawing/2017/model3d" xmlns:o="urn:schemas-microsoft-com:office:office" xmlns:oel="http://schemas.microsoft.com/office/2019/extlst" xmlns:r="http://schemas.openxmlformats.org/officeDocument/2006/relationships" xmlns:m="http://schemas.openxmlformats.org/officeDocument/2006/math" xmlns:v="urn:schemas-microsoft-com:vml" xmlns:wp14="http://schemas.microsoft.com/office/word/2010/wordprocessingDrawing" xmlns:wp="http://schemas.openxmlformats.org/drawingml/2006/wordprocessingDrawing" xmlns:w10="urn:schemas-microsoft-com:office:word" xmlns:w="http://schemas.openxmlformats.org/wordprocessingml/2006/main" xmlns:w14="http://schemas.microsoft.com/office/word/2010/wordml" xmlns:w15="http://schemas.microsoft.com/office/word/2012/wordml" xmlns:w16cex="http://schemas.microsoft.com/office/word/2018/wordml/cex" xmlns:w16cid="http://schemas.microsoft.com/office/word/2016/wordml/cid" xmlns:w16="http://schemas.microsoft.com/office/word/2018/wordml" xmlns:w16du="http://schemas.microsoft.com/office/word/2023/wordml/word16du" xmlns:w16sdtdh="http://schemas.microsoft.com/office/word/2020/wordml/sdtdatahash" xmlns:w16sdtfl="http://schemas.microsoft.com/office/word/2024/wordml/sdtformatlock" xmlns:w16se="http://schemas.microsoft.com/office/word/2015/wordml/symex" xmlns:wpg="http://schemas.microsoft.com/office/word/2010/wordprocessingGroup" xmlns:wpi="http://schemas.microsoft.com/office/word/2010/wordprocessingInk" xmlns:wne="http://schemas.microsoft.com/office/word/2006/wordml" xmlns:wps="http://schemas.microsoft.com/office/word/2010/wordprocessingShape" mc:Ignorable="w14 w15 w16se w16cid w16 w16cex w16sdtdh w16sdtfl w16du wp14">
   <w:endnote w:type="separator" w:id="-1">
     <w:p>
       <w:pPr>
@@ -32893,7 +31708,7 @@
 </file>
 
 <file path=word/footer1.xml><?xml version="1.0" encoding="utf-8"?>
-<w:ftr xmlns:wpc="http://schemas.microsoft.com/office/word/2010/wordprocessingCanvas" xmlns:cx="http://schemas.microsoft.com/office/drawing/2014/chartex" xmlns:cx1="http://schemas.microsoft.com/office/drawing/2015/9/8/chartex" xmlns:cx2="http://schemas.microsoft.com/office/drawing/2015/10/21/chartex" xmlns:cx3="http://schemas.microsoft.com/office/drawing/2016/5/9/chartex" xmlns:cx4="http://schemas.microsoft.com/office/drawing/2016/5/10/chartex" xmlns:cx5="http://schemas.microsoft.com/office/drawing/2016/5/11/chartex" xmlns:cx6="http://schemas.microsoft.com/office/drawing/2016/5/12/chartex" xmlns:cx7="http://schemas.microsoft.com/office/drawing/2016/5/13/chartex" xmlns:cx8="http://schemas.microsoft.com/office/drawing/2016/5/14/chartex" xmlns:mc="http://schemas.openxmlformats.org/markup-compatibility/2006" xmlns:aink="http://schemas.microsoft.com/office/drawing/2016/ink" xmlns:am3d="http://schemas.microsoft.com/office/drawing/2017/model3d" xmlns:o="urn:schemas-microsoft-com:office:office" xmlns:r="http://schemas.openxmlformats.org/officeDocument/2006/relationships" xmlns:m="http://schemas.openxmlformats.org/officeDocument/2006/math" xmlns:v="urn:schemas-microsoft-com:vml" xmlns:wp14="http://schemas.microsoft.com/office/word/2010/wordprocessingDrawing" xmlns:wp="http://schemas.openxmlformats.org/drawingml/2006/wordprocessingDrawing" xmlns:w10="urn:schemas-microsoft-com:office:word" xmlns:w="http://schemas.openxmlformats.org/wordprocessingml/2006/main" xmlns:w14="http://schemas.microsoft.com/office/word/2010/wordml" xmlns:w15="http://schemas.microsoft.com/office/word/2012/wordml" xmlns:w16cex="http://schemas.microsoft.com/office/word/2018/wordml/cex" xmlns:w16cid="http://schemas.microsoft.com/office/word/2016/wordml/cid" xmlns:w16="http://schemas.microsoft.com/office/word/2018/wordml" xmlns:w16se="http://schemas.microsoft.com/office/word/2015/wordml/symex" xmlns:wpg="http://schemas.microsoft.com/office/word/2010/wordprocessingGroup" xmlns:wpi="http://schemas.microsoft.com/office/word/2010/wordprocessingInk" xmlns:wne="http://schemas.microsoft.com/office/word/2006/wordml" xmlns:wps="http://schemas.microsoft.com/office/word/2010/wordprocessingShape" mc:Ignorable="w14 w15 w16se w16cid w16 w16cex wp14">
+<w:ftr xmlns:wpc="http://schemas.microsoft.com/office/word/2010/wordprocessingCanvas" xmlns:cx="http://schemas.microsoft.com/office/drawing/2014/chartex" xmlns:cx1="http://schemas.microsoft.com/office/drawing/2015/9/8/chartex" xmlns:cx2="http://schemas.microsoft.com/office/drawing/2015/10/21/chartex" xmlns:cx3="http://schemas.microsoft.com/office/drawing/2016/5/9/chartex" xmlns:cx4="http://schemas.microsoft.com/office/drawing/2016/5/10/chartex" xmlns:cx5="http://schemas.microsoft.com/office/drawing/2016/5/11/chartex" xmlns:cx6="http://schemas.microsoft.com/office/drawing/2016/5/12/chartex" xmlns:cx7="http://schemas.microsoft.com/office/drawing/2016/5/13/chartex" xmlns:cx8="http://schemas.microsoft.com/office/drawing/2016/5/14/chartex" xmlns:mc="http://schemas.openxmlformats.org/markup-compatibility/2006" xmlns:aink="http://schemas.microsoft.com/office/drawing/2016/ink" xmlns:am3d="http://schemas.microsoft.com/office/drawing/2017/model3d" xmlns:o="urn:schemas-microsoft-com:office:office" xmlns:oel="http://schemas.microsoft.com/office/2019/extlst" xmlns:r="http://schemas.openxmlformats.org/officeDocument/2006/relationships" xmlns:m="http://schemas.openxmlformats.org/officeDocument/2006/math" xmlns:v="urn:schemas-microsoft-com:vml" xmlns:wp14="http://schemas.microsoft.com/office/word/2010/wordprocessingDrawing" xmlns:wp="http://schemas.openxmlformats.org/drawingml/2006/wordprocessingDrawing" xmlns:w10="urn:schemas-microsoft-com:office:word" xmlns:w="http://schemas.openxmlformats.org/wordprocessingml/2006/main" xmlns:w14="http://schemas.microsoft.com/office/word/2010/wordml" xmlns:w15="http://schemas.microsoft.com/office/word/2012/wordml" xmlns:w16cex="http://schemas.microsoft.com/office/word/2018/wordml/cex" xmlns:w16cid="http://schemas.microsoft.com/office/word/2016/wordml/cid" xmlns:w16="http://schemas.microsoft.com/office/word/2018/wordml" xmlns:w16du="http://schemas.microsoft.com/office/word/2023/wordml/word16du" xmlns:w16sdtdh="http://schemas.microsoft.com/office/word/2020/wordml/sdtdatahash" xmlns:w16sdtfl="http://schemas.microsoft.com/office/word/2024/wordml/sdtformatlock" xmlns:w16se="http://schemas.microsoft.com/office/word/2015/wordml/symex" xmlns:wpg="http://schemas.microsoft.com/office/word/2010/wordprocessingGroup" xmlns:wpi="http://schemas.microsoft.com/office/word/2010/wordprocessingInk" xmlns:wne="http://schemas.microsoft.com/office/word/2006/wordml" xmlns:wps="http://schemas.microsoft.com/office/word/2010/wordprocessingShape" mc:Ignorable="w14 w15 w16se w16cid w16 w16cex w16sdtdh w16sdtfl w16du wp14">
   <w:p>
     <w:pPr>
       <w:pStyle w:val="Fuzeile"/>
@@ -32903,7 +31718,7 @@
 </file>
 
 <file path=word/footer2.xml><?xml version="1.0" encoding="utf-8"?>
-<w:ftr xmlns:wpc="http://schemas.microsoft.com/office/word/2010/wordprocessingCanvas" xmlns:cx="http://schemas.microsoft.com/office/drawing/2014/chartex" xmlns:cx1="http://schemas.microsoft.com/office/drawing/2015/9/8/chartex" xmlns:cx2="http://schemas.microsoft.com/office/drawing/2015/10/21/chartex" xmlns:cx3="http://schemas.microsoft.com/office/drawing/2016/5/9/chartex" xmlns:cx4="http://schemas.microsoft.com/office/drawing/2016/5/10/chartex" xmlns:cx5="http://schemas.microsoft.com/office/drawing/2016/5/11/chartex" xmlns:cx6="http://schemas.microsoft.com/office/drawing/2016/5/12/chartex" xmlns:cx7="http://schemas.microsoft.com/office/drawing/2016/5/13/chartex" xmlns:cx8="http://schemas.microsoft.com/office/drawing/2016/5/14/chartex" xmlns:mc="http://schemas.openxmlformats.org/markup-compatibility/2006" xmlns:aink="http://schemas.microsoft.com/office/drawing/2016/ink" xmlns:am3d="http://schemas.microsoft.com/office/drawing/2017/model3d" xmlns:o="urn:schemas-microsoft-com:office:office" xmlns:r="http://schemas.openxmlformats.org/officeDocument/2006/relationships" xmlns:m="http://schemas.openxmlformats.org/officeDocument/2006/math" xmlns:v="urn:schemas-microsoft-com:vml" xmlns:wp14="http://schemas.microsoft.com/office/word/2010/wordprocessingDrawing" xmlns:wp="http://schemas.openxmlformats.org/drawingml/2006/wordprocessingDrawing" xmlns:w10="urn:schemas-microsoft-com:office:word" xmlns:w="http://schemas.openxmlformats.org/wordprocessingml/2006/main" xmlns:w14="http://schemas.microsoft.com/office/word/2010/wordml" xmlns:w15="http://schemas.microsoft.com/office/word/2012/wordml" xmlns:w16cex="http://schemas.microsoft.com/office/word/2018/wordml/cex" xmlns:w16cid="http://schemas.microsoft.com/office/word/2016/wordml/cid" xmlns:w16="http://schemas.microsoft.com/office/word/2018/wordml" xmlns:w16se="http://schemas.microsoft.com/office/word/2015/wordml/symex" xmlns:wpg="http://schemas.microsoft.com/office/word/2010/wordprocessingGroup" xmlns:wpi="http://schemas.microsoft.com/office/word/2010/wordprocessingInk" xmlns:wne="http://schemas.microsoft.com/office/word/2006/wordml" xmlns:wps="http://schemas.microsoft.com/office/word/2010/wordprocessingShape" mc:Ignorable="w14 w15 w16se w16cid w16 w16cex wp14">
+<w:ftr xmlns:wpc="http://schemas.microsoft.com/office/word/2010/wordprocessingCanvas" xmlns:cx="http://schemas.microsoft.com/office/drawing/2014/chartex" xmlns:cx1="http://schemas.microsoft.com/office/drawing/2015/9/8/chartex" xmlns:cx2="http://schemas.microsoft.com/office/drawing/2015/10/21/chartex" xmlns:cx3="http://schemas.microsoft.com/office/drawing/2016/5/9/chartex" xmlns:cx4="http://schemas.microsoft.com/office/drawing/2016/5/10/chartex" xmlns:cx5="http://schemas.microsoft.com/office/drawing/2016/5/11/chartex" xmlns:cx6="http://schemas.microsoft.com/office/drawing/2016/5/12/chartex" xmlns:cx7="http://schemas.microsoft.com/office/drawing/2016/5/13/chartex" xmlns:cx8="http://schemas.microsoft.com/office/drawing/2016/5/14/chartex" xmlns:mc="http://schemas.openxmlformats.org/markup-compatibility/2006" xmlns:aink="http://schemas.microsoft.com/office/drawing/2016/ink" xmlns:am3d="http://schemas.microsoft.com/office/drawing/2017/model3d" xmlns:o="urn:schemas-microsoft-com:office:office" xmlns:oel="http://schemas.microsoft.com/office/2019/extlst" xmlns:r="http://schemas.openxmlformats.org/officeDocument/2006/relationships" xmlns:m="http://schemas.openxmlformats.org/officeDocument/2006/math" xmlns:v="urn:schemas-microsoft-com:vml" xmlns:wp14="http://schemas.microsoft.com/office/word/2010/wordprocessingDrawing" xmlns:wp="http://schemas.openxmlformats.org/drawingml/2006/wordprocessingDrawing" xmlns:w10="urn:schemas-microsoft-com:office:word" xmlns:w="http://schemas.openxmlformats.org/wordprocessingml/2006/main" xmlns:w14="http://schemas.microsoft.com/office/word/2010/wordml" xmlns:w15="http://schemas.microsoft.com/office/word/2012/wordml" xmlns:w16cex="http://schemas.microsoft.com/office/word/2018/wordml/cex" xmlns:w16cid="http://schemas.microsoft.com/office/word/2016/wordml/cid" xmlns:w16="http://schemas.microsoft.com/office/word/2018/wordml" xmlns:w16du="http://schemas.microsoft.com/office/word/2023/wordml/word16du" xmlns:w16sdtdh="http://schemas.microsoft.com/office/word/2020/wordml/sdtdatahash" xmlns:w16sdtfl="http://schemas.microsoft.com/office/word/2024/wordml/sdtformatlock" xmlns:w16se="http://schemas.microsoft.com/office/word/2015/wordml/symex" xmlns:wpg="http://schemas.microsoft.com/office/word/2010/wordprocessingGroup" xmlns:wpi="http://schemas.microsoft.com/office/word/2010/wordprocessingInk" xmlns:wne="http://schemas.microsoft.com/office/word/2006/wordml" xmlns:wps="http://schemas.microsoft.com/office/word/2010/wordprocessingShape" mc:Ignorable="w14 w15 w16se w16cid w16 w16cex w16sdtdh w16sdtfl w16du wp14">
   <w:sdt>
     <w:sdtPr>
       <w:id w:val="755636801"/>
@@ -32912,6 +31727,7 @@
         <w:docPartUnique/>
       </w:docPartObj>
     </w:sdtPr>
+    <w:sdtEndPr/>
     <w:sdtContent>
       <w:p>
         <w:pPr>
@@ -32945,7 +31761,7 @@
 </file>
 
 <file path=word/footer3.xml><?xml version="1.0" encoding="utf-8"?>
-<w:ftr xmlns:wpc="http://schemas.microsoft.com/office/word/2010/wordprocessingCanvas" xmlns:cx="http://schemas.microsoft.com/office/drawing/2014/chartex" xmlns:cx1="http://schemas.microsoft.com/office/drawing/2015/9/8/chartex" xmlns:cx2="http://schemas.microsoft.com/office/drawing/2015/10/21/chartex" xmlns:cx3="http://schemas.microsoft.com/office/drawing/2016/5/9/chartex" xmlns:cx4="http://schemas.microsoft.com/office/drawing/2016/5/10/chartex" xmlns:cx5="http://schemas.microsoft.com/office/drawing/2016/5/11/chartex" xmlns:cx6="http://schemas.microsoft.com/office/drawing/2016/5/12/chartex" xmlns:cx7="http://schemas.microsoft.com/office/drawing/2016/5/13/chartex" xmlns:cx8="http://schemas.microsoft.com/office/drawing/2016/5/14/chartex" xmlns:mc="http://schemas.openxmlformats.org/markup-compatibility/2006" xmlns:aink="http://schemas.microsoft.com/office/drawing/2016/ink" xmlns:am3d="http://schemas.microsoft.com/office/drawing/2017/model3d" xmlns:o="urn:schemas-microsoft-com:office:office" xmlns:r="http://schemas.openxmlformats.org/officeDocument/2006/relationships" xmlns:m="http://schemas.openxmlformats.org/officeDocument/2006/math" xmlns:v="urn:schemas-microsoft-com:vml" xmlns:wp14="http://schemas.microsoft.com/office/word/2010/wordprocessingDrawing" xmlns:wp="http://schemas.openxmlformats.org/drawingml/2006/wordprocessingDrawing" xmlns:w10="urn:schemas-microsoft-com:office:word" xmlns:w="http://schemas.openxmlformats.org/wordprocessingml/2006/main" xmlns:w14="http://schemas.microsoft.com/office/word/2010/wordml" xmlns:w15="http://schemas.microsoft.com/office/word/2012/wordml" xmlns:w16cex="http://schemas.microsoft.com/office/word/2018/wordml/cex" xmlns:w16cid="http://schemas.microsoft.com/office/word/2016/wordml/cid" xmlns:w16="http://schemas.microsoft.com/office/word/2018/wordml" xmlns:w16se="http://schemas.microsoft.com/office/word/2015/wordml/symex" xmlns:wpg="http://schemas.microsoft.com/office/word/2010/wordprocessingGroup" xmlns:wpi="http://schemas.microsoft.com/office/word/2010/wordprocessingInk" xmlns:wne="http://schemas.microsoft.com/office/word/2006/wordml" xmlns:wps="http://schemas.microsoft.com/office/word/2010/wordprocessingShape" mc:Ignorable="w14 w15 w16se w16cid w16 w16cex wp14">
+<w:ftr xmlns:wpc="http://schemas.microsoft.com/office/word/2010/wordprocessingCanvas" xmlns:cx="http://schemas.microsoft.com/office/drawing/2014/chartex" xmlns:cx1="http://schemas.microsoft.com/office/drawing/2015/9/8/chartex" xmlns:cx2="http://schemas.microsoft.com/office/drawing/2015/10/21/chartex" xmlns:cx3="http://schemas.microsoft.com/office/drawing/2016/5/9/chartex" xmlns:cx4="http://schemas.microsoft.com/office/drawing/2016/5/10/chartex" xmlns:cx5="http://schemas.microsoft.com/office/drawing/2016/5/11/chartex" xmlns:cx6="http://schemas.microsoft.com/office/drawing/2016/5/12/chartex" xmlns:cx7="http://schemas.microsoft.com/office/drawing/2016/5/13/chartex" xmlns:cx8="http://schemas.microsoft.com/office/drawing/2016/5/14/chartex" xmlns:mc="http://schemas.openxmlformats.org/markup-compatibility/2006" xmlns:aink="http://schemas.microsoft.com/office/drawing/2016/ink" xmlns:am3d="http://schemas.microsoft.com/office/drawing/2017/model3d" xmlns:o="urn:schemas-microsoft-com:office:office" xmlns:oel="http://schemas.microsoft.com/office/2019/extlst" xmlns:r="http://schemas.openxmlformats.org/officeDocument/2006/relationships" xmlns:m="http://schemas.openxmlformats.org/officeDocument/2006/math" xmlns:v="urn:schemas-microsoft-com:vml" xmlns:wp14="http://schemas.microsoft.com/office/word/2010/wordprocessingDrawing" xmlns:wp="http://schemas.openxmlformats.org/drawingml/2006/wordprocessingDrawing" xmlns:w10="urn:schemas-microsoft-com:office:word" xmlns:w="http://schemas.openxmlformats.org/wordprocessingml/2006/main" xmlns:w14="http://schemas.microsoft.com/office/word/2010/wordml" xmlns:w15="http://schemas.microsoft.com/office/word/2012/wordml" xmlns:w16cex="http://schemas.microsoft.com/office/word/2018/wordml/cex" xmlns:w16cid="http://schemas.microsoft.com/office/word/2016/wordml/cid" xmlns:w16="http://schemas.microsoft.com/office/word/2018/wordml" xmlns:w16du="http://schemas.microsoft.com/office/word/2023/wordml/word16du" xmlns:w16sdtdh="http://schemas.microsoft.com/office/word/2020/wordml/sdtdatahash" xmlns:w16sdtfl="http://schemas.microsoft.com/office/word/2024/wordml/sdtformatlock" xmlns:w16se="http://schemas.microsoft.com/office/word/2015/wordml/symex" xmlns:wpg="http://schemas.microsoft.com/office/word/2010/wordprocessingGroup" xmlns:wpi="http://schemas.microsoft.com/office/word/2010/wordprocessingInk" xmlns:wne="http://schemas.microsoft.com/office/word/2006/wordml" xmlns:wps="http://schemas.microsoft.com/office/word/2010/wordprocessingShape" mc:Ignorable="w14 w15 w16se w16cid w16 w16cex w16sdtdh w16sdtfl w16du wp14">
   <w:p>
     <w:pPr>
       <w:pStyle w:val="Fuzeile"/>
@@ -32955,7 +31771,7 @@
 </file>
 
 <file path=word/footnotes.xml><?xml version="1.0" encoding="utf-8"?>
-<w:footnotes xmlns:wpc="http://schemas.microsoft.com/office/word/2010/wordprocessingCanvas" xmlns:cx="http://schemas.microsoft.com/office/drawing/2014/chartex" xmlns:cx1="http://schemas.microsoft.com/office/drawing/2015/9/8/chartex" xmlns:cx2="http://schemas.microsoft.com/office/drawing/2015/10/21/chartex" xmlns:cx3="http://schemas.microsoft.com/office/drawing/2016/5/9/chartex" xmlns:cx4="http://schemas.microsoft.com/office/drawing/2016/5/10/chartex" xmlns:cx5="http://schemas.microsoft.com/office/drawing/2016/5/11/chartex" xmlns:cx6="http://schemas.microsoft.com/office/drawing/2016/5/12/chartex" xmlns:cx7="http://schemas.microsoft.com/office/drawing/2016/5/13/chartex" xmlns:cx8="http://schemas.microsoft.com/office/drawing/2016/5/14/chartex" xmlns:mc="http://schemas.openxmlformats.org/markup-compatibility/2006" xmlns:aink="http://schemas.microsoft.com/office/drawing/2016/ink" xmlns:am3d="http://schemas.microsoft.com/office/drawing/2017/model3d" xmlns:o="urn:schemas-microsoft-com:office:office" xmlns:r="http://schemas.openxmlformats.org/officeDocument/2006/relationships" xmlns:m="http://schemas.openxmlformats.org/officeDocument/2006/math" xmlns:v="urn:schemas-microsoft-com:vml" xmlns:wp14="http://schemas.microsoft.com/office/word/2010/wordprocessingDrawing" xmlns:wp="http://schemas.openxmlformats.org/drawingml/2006/wordprocessingDrawing" xmlns:w10="urn:schemas-microsoft-com:office:word" xmlns:w="http://schemas.openxmlformats.org/wordprocessingml/2006/main" xmlns:w14="http://schemas.microsoft.com/office/word/2010/wordml" xmlns:w15="http://schemas.microsoft.com/office/word/2012/wordml" xmlns:w16cex="http://schemas.microsoft.com/office/word/2018/wordml/cex" xmlns:w16cid="http://schemas.microsoft.com/office/word/2016/wordml/cid" xmlns:w16="http://schemas.microsoft.com/office/word/2018/wordml" xmlns:w16se="http://schemas.microsoft.com/office/word/2015/wordml/symex" xmlns:wpg="http://schemas.microsoft.com/office/word/2010/wordprocessingGroup" xmlns:wpi="http://schemas.microsoft.com/office/word/2010/wordprocessingInk" xmlns:wne="http://schemas.microsoft.com/office/word/2006/wordml" xmlns:wps="http://schemas.microsoft.com/office/word/2010/wordprocessingShape" mc:Ignorable="w14 w15 w16se w16cid w16 w16cex wp14">
+<w:footnotes xmlns:wpc="http://schemas.microsoft.com/office/word/2010/wordprocessingCanvas" xmlns:cx="http://schemas.microsoft.com/office/drawing/2014/chartex" xmlns:cx1="http://schemas.microsoft.com/office/drawing/2015/9/8/chartex" xmlns:cx2="http://schemas.microsoft.com/office/drawing/2015/10/21/chartex" xmlns:cx3="http://schemas.microsoft.com/office/drawing/2016/5/9/chartex" xmlns:cx4="http://schemas.microsoft.com/office/drawing/2016/5/10/chartex" xmlns:cx5="http://schemas.microsoft.com/office/drawing/2016/5/11/chartex" xmlns:cx6="http://schemas.microsoft.com/office/drawing/2016/5/12/chartex" xmlns:cx7="http://schemas.microsoft.com/office/drawing/2016/5/13/chartex" xmlns:cx8="http://schemas.microsoft.com/office/drawing/2016/5/14/chartex" xmlns:mc="http://schemas.openxmlformats.org/markup-compatibility/2006" xmlns:aink="http://schemas.microsoft.com/office/drawing/2016/ink" xmlns:am3d="http://schemas.microsoft.com/office/drawing/2017/model3d" xmlns:o="urn:schemas-microsoft-com:office:office" xmlns:oel="http://schemas.microsoft.com/office/2019/extlst" xmlns:r="http://schemas.openxmlformats.org/officeDocument/2006/relationships" xmlns:m="http://schemas.openxmlformats.org/officeDocument/2006/math" xmlns:v="urn:schemas-microsoft-com:vml" xmlns:wp14="http://schemas.microsoft.com/office/word/2010/wordprocessingDrawing" xmlns:wp="http://schemas.openxmlformats.org/drawingml/2006/wordprocessingDrawing" xmlns:w10="urn:schemas-microsoft-com:office:word" xmlns:w="http://schemas.openxmlformats.org/wordprocessingml/2006/main" xmlns:w14="http://schemas.microsoft.com/office/word/2010/wordml" xmlns:w15="http://schemas.microsoft.com/office/word/2012/wordml" xmlns:w16cex="http://schemas.microsoft.com/office/word/2018/wordml/cex" xmlns:w16cid="http://schemas.microsoft.com/office/word/2016/wordml/cid" xmlns:w16="http://schemas.microsoft.com/office/word/2018/wordml" xmlns:w16du="http://schemas.microsoft.com/office/word/2023/wordml/word16du" xmlns:w16sdtdh="http://schemas.microsoft.com/office/word/2020/wordml/sdtdatahash" xmlns:w16sdtfl="http://schemas.microsoft.com/office/word/2024/wordml/sdtformatlock" xmlns:w16se="http://schemas.microsoft.com/office/word/2015/wordml/symex" xmlns:wpg="http://schemas.microsoft.com/office/word/2010/wordprocessingGroup" xmlns:wpi="http://schemas.microsoft.com/office/word/2010/wordprocessingInk" xmlns:wne="http://schemas.microsoft.com/office/word/2006/wordml" xmlns:wps="http://schemas.microsoft.com/office/word/2010/wordprocessingShape" mc:Ignorable="w14 w15 w16se w16cid w16 w16cex w16sdtdh w16sdtfl w16du wp14">
   <w:footnote w:type="separator" w:id="-1">
     <w:p>
       <w:pPr>
@@ -32980,7 +31796,7 @@
 </file>
 
 <file path=word/header1.xml><?xml version="1.0" encoding="utf-8"?>
-<w:hdr xmlns:wpc="http://schemas.microsoft.com/office/word/2010/wordprocessingCanvas" xmlns:cx="http://schemas.microsoft.com/office/drawing/2014/chartex" xmlns:cx1="http://schemas.microsoft.com/office/drawing/2015/9/8/chartex" xmlns:cx2="http://schemas.microsoft.com/office/drawing/2015/10/21/chartex" xmlns:cx3="http://schemas.microsoft.com/office/drawing/2016/5/9/chartex" xmlns:cx4="http://schemas.microsoft.com/office/drawing/2016/5/10/chartex" xmlns:cx5="http://schemas.microsoft.com/office/drawing/2016/5/11/chartex" xmlns:cx6="http://schemas.microsoft.com/office/drawing/2016/5/12/chartex" xmlns:cx7="http://schemas.microsoft.com/office/drawing/2016/5/13/chartex" xmlns:cx8="http://schemas.microsoft.com/office/drawing/2016/5/14/chartex" xmlns:mc="http://schemas.openxmlformats.org/markup-compatibility/2006" xmlns:aink="http://schemas.microsoft.com/office/drawing/2016/ink" xmlns:am3d="http://schemas.microsoft.com/office/drawing/2017/model3d" xmlns:o="urn:schemas-microsoft-com:office:office" xmlns:r="http://schemas.openxmlformats.org/officeDocument/2006/relationships" xmlns:m="http://schemas.openxmlformats.org/officeDocument/2006/math" xmlns:v="urn:schemas-microsoft-com:vml" xmlns:wp14="http://schemas.microsoft.com/office/word/2010/wordprocessingDrawing" xmlns:wp="http://schemas.openxmlformats.org/drawingml/2006/wordprocessingDrawing" xmlns:w10="urn:schemas-microsoft-com:office:word" xmlns:w="http://schemas.openxmlformats.org/wordprocessingml/2006/main" xmlns:w14="http://schemas.microsoft.com/office/word/2010/wordml" xmlns:w15="http://schemas.microsoft.com/office/word/2012/wordml" xmlns:w16cex="http://schemas.microsoft.com/office/word/2018/wordml/cex" xmlns:w16cid="http://schemas.microsoft.com/office/word/2016/wordml/cid" xmlns:w16="http://schemas.microsoft.com/office/word/2018/wordml" xmlns:w16se="http://schemas.microsoft.com/office/word/2015/wordml/symex" xmlns:wpg="http://schemas.microsoft.com/office/word/2010/wordprocessingGroup" xmlns:wpi="http://schemas.microsoft.com/office/word/2010/wordprocessingInk" xmlns:wne="http://schemas.microsoft.com/office/word/2006/wordml" xmlns:wps="http://schemas.microsoft.com/office/word/2010/wordprocessingShape" mc:Ignorable="w14 w15 w16se w16cid w16 w16cex wp14">
+<w:hdr xmlns:wpc="http://schemas.microsoft.com/office/word/2010/wordprocessingCanvas" xmlns:cx="http://schemas.microsoft.com/office/drawing/2014/chartex" xmlns:cx1="http://schemas.microsoft.com/office/drawing/2015/9/8/chartex" xmlns:cx2="http://schemas.microsoft.com/office/drawing/2015/10/21/chartex" xmlns:cx3="http://schemas.microsoft.com/office/drawing/2016/5/9/chartex" xmlns:cx4="http://schemas.microsoft.com/office/drawing/2016/5/10/chartex" xmlns:cx5="http://schemas.microsoft.com/office/drawing/2016/5/11/chartex" xmlns:cx6="http://schemas.microsoft.com/office/drawing/2016/5/12/chartex" xmlns:cx7="http://schemas.microsoft.com/office/drawing/2016/5/13/chartex" xmlns:cx8="http://schemas.microsoft.com/office/drawing/2016/5/14/chartex" xmlns:mc="http://schemas.openxmlformats.org/markup-compatibility/2006" xmlns:aink="http://schemas.microsoft.com/office/drawing/2016/ink" xmlns:am3d="http://schemas.microsoft.com/office/drawing/2017/model3d" xmlns:o="urn:schemas-microsoft-com:office:office" xmlns:oel="http://schemas.microsoft.com/office/2019/extlst" xmlns:r="http://schemas.openxmlformats.org/officeDocument/2006/relationships" xmlns:m="http://schemas.openxmlformats.org/officeDocument/2006/math" xmlns:v="urn:schemas-microsoft-com:vml" xmlns:wp14="http://schemas.microsoft.com/office/word/2010/wordprocessingDrawing" xmlns:wp="http://schemas.openxmlformats.org/drawingml/2006/wordprocessingDrawing" xmlns:w10="urn:schemas-microsoft-com:office:word" xmlns:w="http://schemas.openxmlformats.org/wordprocessingml/2006/main" xmlns:w14="http://schemas.microsoft.com/office/word/2010/wordml" xmlns:w15="http://schemas.microsoft.com/office/word/2012/wordml" xmlns:w16cex="http://schemas.microsoft.com/office/word/2018/wordml/cex" xmlns:w16cid="http://schemas.microsoft.com/office/word/2016/wordml/cid" xmlns:w16="http://schemas.microsoft.com/office/word/2018/wordml" xmlns:w16du="http://schemas.microsoft.com/office/word/2023/wordml/word16du" xmlns:w16sdtdh="http://schemas.microsoft.com/office/word/2020/wordml/sdtdatahash" xmlns:w16sdtfl="http://schemas.microsoft.com/office/word/2024/wordml/sdtformatlock" xmlns:w16se="http://schemas.microsoft.com/office/word/2015/wordml/symex" xmlns:wpg="http://schemas.microsoft.com/office/word/2010/wordprocessingGroup" xmlns:wpi="http://schemas.microsoft.com/office/word/2010/wordprocessingInk" xmlns:wne="http://schemas.microsoft.com/office/word/2006/wordml" xmlns:wps="http://schemas.microsoft.com/office/word/2010/wordprocessingShape" mc:Ignorable="w14 w15 w16se w16cid w16 w16cex w16sdtdh w16sdtfl w16du wp14">
   <w:p>
     <w:pPr>
       <w:pStyle w:val="Kopfzeile"/>
@@ -32990,7 +31806,7 @@
 </file>
 
 <file path=word/header2.xml><?xml version="1.0" encoding="utf-8"?>
-<w:hdr xmlns:wpc="http://schemas.microsoft.com/office/word/2010/wordprocessingCanvas" xmlns:cx="http://schemas.microsoft.com/office/drawing/2014/chartex" xmlns:cx1="http://schemas.microsoft.com/office/drawing/2015/9/8/chartex" xmlns:cx2="http://schemas.microsoft.com/office/drawing/2015/10/21/chartex" xmlns:cx3="http://schemas.microsoft.com/office/drawing/2016/5/9/chartex" xmlns:cx4="http://schemas.microsoft.com/office/drawing/2016/5/10/chartex" xmlns:cx5="http://schemas.microsoft.com/office/drawing/2016/5/11/chartex" xmlns:cx6="http://schemas.microsoft.com/office/drawing/2016/5/12/chartex" xmlns:cx7="http://schemas.microsoft.com/office/drawing/2016/5/13/chartex" xmlns:cx8="http://schemas.microsoft.com/office/drawing/2016/5/14/chartex" xmlns:mc="http://schemas.openxmlformats.org/markup-compatibility/2006" xmlns:aink="http://schemas.microsoft.com/office/drawing/2016/ink" xmlns:am3d="http://schemas.microsoft.com/office/drawing/2017/model3d" xmlns:o="urn:schemas-microsoft-com:office:office" xmlns:r="http://schemas.openxmlformats.org/officeDocument/2006/relationships" xmlns:m="http://schemas.openxmlformats.org/officeDocument/2006/math" xmlns:v="urn:schemas-microsoft-com:vml" xmlns:wp14="http://schemas.microsoft.com/office/word/2010/wordprocessingDrawing" xmlns:wp="http://schemas.openxmlformats.org/drawingml/2006/wordprocessingDrawing" xmlns:w10="urn:schemas-microsoft-com:office:word" xmlns:w="http://schemas.openxmlformats.org/wordprocessingml/2006/main" xmlns:w14="http://schemas.microsoft.com/office/word/2010/wordml" xmlns:w15="http://schemas.microsoft.com/office/word/2012/wordml" xmlns:w16cex="http://schemas.microsoft.com/office/word/2018/wordml/cex" xmlns:w16cid="http://schemas.microsoft.com/office/word/2016/wordml/cid" xmlns:w16="http://schemas.microsoft.com/office/word/2018/wordml" xmlns:w16se="http://schemas.microsoft.com/office/word/2015/wordml/symex" xmlns:wpg="http://schemas.microsoft.com/office/word/2010/wordprocessingGroup" xmlns:wpi="http://schemas.microsoft.com/office/word/2010/wordprocessingInk" xmlns:wne="http://schemas.microsoft.com/office/word/2006/wordml" xmlns:wps="http://schemas.microsoft.com/office/word/2010/wordprocessingShape" mc:Ignorable="w14 w15 w16se w16cid w16 w16cex wp14">
+<w:hdr xmlns:wpc="http://schemas.microsoft.com/office/word/2010/wordprocessingCanvas" xmlns:cx="http://schemas.microsoft.com/office/drawing/2014/chartex" xmlns:cx1="http://schemas.microsoft.com/office/drawing/2015/9/8/chartex" xmlns:cx2="http://schemas.microsoft.com/office/drawing/2015/10/21/chartex" xmlns:cx3="http://schemas.microsoft.com/office/drawing/2016/5/9/chartex" xmlns:cx4="http://schemas.microsoft.com/office/drawing/2016/5/10/chartex" xmlns:cx5="http://schemas.microsoft.com/office/drawing/2016/5/11/chartex" xmlns:cx6="http://schemas.microsoft.com/office/drawing/2016/5/12/chartex" xmlns:cx7="http://schemas.microsoft.com/office/drawing/2016/5/13/chartex" xmlns:cx8="http://schemas.microsoft.com/office/drawing/2016/5/14/chartex" xmlns:mc="http://schemas.openxmlformats.org/markup-compatibility/2006" xmlns:aink="http://schemas.microsoft.com/office/drawing/2016/ink" xmlns:am3d="http://schemas.microsoft.com/office/drawing/2017/model3d" xmlns:o="urn:schemas-microsoft-com:office:office" xmlns:oel="http://schemas.microsoft.com/office/2019/extlst" xmlns:r="http://schemas.openxmlformats.org/officeDocument/2006/relationships" xmlns:m="http://schemas.openxmlformats.org/officeDocument/2006/math" xmlns:v="urn:schemas-microsoft-com:vml" xmlns:wp14="http://schemas.microsoft.com/office/word/2010/wordprocessingDrawing" xmlns:wp="http://schemas.openxmlformats.org/drawingml/2006/wordprocessingDrawing" xmlns:w10="urn:schemas-microsoft-com:office:word" xmlns:w="http://schemas.openxmlformats.org/wordprocessingml/2006/main" xmlns:w14="http://schemas.microsoft.com/office/word/2010/wordml" xmlns:w15="http://schemas.microsoft.com/office/word/2012/wordml" xmlns:w16cex="http://schemas.microsoft.com/office/word/2018/wordml/cex" xmlns:w16cid="http://schemas.microsoft.com/office/word/2016/wordml/cid" xmlns:w16="http://schemas.microsoft.com/office/word/2018/wordml" xmlns:w16du="http://schemas.microsoft.com/office/word/2023/wordml/word16du" xmlns:w16sdtdh="http://schemas.microsoft.com/office/word/2020/wordml/sdtdatahash" xmlns:w16sdtfl="http://schemas.microsoft.com/office/word/2024/wordml/sdtformatlock" xmlns:w16se="http://schemas.microsoft.com/office/word/2015/wordml/symex" xmlns:wpg="http://schemas.microsoft.com/office/word/2010/wordprocessingGroup" xmlns:wpi="http://schemas.microsoft.com/office/word/2010/wordprocessingInk" xmlns:wne="http://schemas.microsoft.com/office/word/2006/wordml" xmlns:wps="http://schemas.microsoft.com/office/word/2010/wordprocessingShape" mc:Ignorable="w14 w15 w16se w16cid w16 w16cex w16sdtdh w16sdtfl w16du wp14">
   <w:p>
     <w:pPr>
       <w:pStyle w:val="Kopfzeile"/>
@@ -33000,7 +31816,7 @@
 </file>
 
 <file path=word/header3.xml><?xml version="1.0" encoding="utf-8"?>
-<w:hdr xmlns:wpc="http://schemas.microsoft.com/office/word/2010/wordprocessingCanvas" xmlns:cx="http://schemas.microsoft.com/office/drawing/2014/chartex" xmlns:cx1="http://schemas.microsoft.com/office/drawing/2015/9/8/chartex" xmlns:cx2="http://schemas.microsoft.com/office/drawing/2015/10/21/chartex" xmlns:cx3="http://schemas.microsoft.com/office/drawing/2016/5/9/chartex" xmlns:cx4="http://schemas.microsoft.com/office/drawing/2016/5/10/chartex" xmlns:cx5="http://schemas.microsoft.com/office/drawing/2016/5/11/chartex" xmlns:cx6="http://schemas.microsoft.com/office/drawing/2016/5/12/chartex" xmlns:cx7="http://schemas.microsoft.com/office/drawing/2016/5/13/chartex" xmlns:cx8="http://schemas.microsoft.com/office/drawing/2016/5/14/chartex" xmlns:mc="http://schemas.openxmlformats.org/markup-compatibility/2006" xmlns:aink="http://schemas.microsoft.com/office/drawing/2016/ink" xmlns:am3d="http://schemas.microsoft.com/office/drawing/2017/model3d" xmlns:o="urn:schemas-microsoft-com:office:office" xmlns:r="http://schemas.openxmlformats.org/officeDocument/2006/relationships" xmlns:m="http://schemas.openxmlformats.org/officeDocument/2006/math" xmlns:v="urn:schemas-microsoft-com:vml" xmlns:wp14="http://schemas.microsoft.com/office/word/2010/wordprocessingDrawing" xmlns:wp="http://schemas.openxmlformats.org/drawingml/2006/wordprocessingDrawing" xmlns:w10="urn:schemas-microsoft-com:office:word" xmlns:w="http://schemas.openxmlformats.org/wordprocessingml/2006/main" xmlns:w14="http://schemas.microsoft.com/office/word/2010/wordml" xmlns:w15="http://schemas.microsoft.com/office/word/2012/wordml" xmlns:w16cex="http://schemas.microsoft.com/office/word/2018/wordml/cex" xmlns:w16cid="http://schemas.microsoft.com/office/word/2016/wordml/cid" xmlns:w16="http://schemas.microsoft.com/office/word/2018/wordml" xmlns:w16se="http://schemas.microsoft.com/office/word/2015/wordml/symex" xmlns:wpg="http://schemas.microsoft.com/office/word/2010/wordprocessingGroup" xmlns:wpi="http://schemas.microsoft.com/office/word/2010/wordprocessingInk" xmlns:wne="http://schemas.microsoft.com/office/word/2006/wordml" xmlns:wps="http://schemas.microsoft.com/office/word/2010/wordprocessingShape" mc:Ignorable="w14 w15 w16se w16cid w16 w16cex wp14">
+<w:hdr xmlns:wpc="http://schemas.microsoft.com/office/word/2010/wordprocessingCanvas" xmlns:cx="http://schemas.microsoft.com/office/drawing/2014/chartex" xmlns:cx1="http://schemas.microsoft.com/office/drawing/2015/9/8/chartex" xmlns:cx2="http://schemas.microsoft.com/office/drawing/2015/10/21/chartex" xmlns:cx3="http://schemas.microsoft.com/office/drawing/2016/5/9/chartex" xmlns:cx4="http://schemas.microsoft.com/office/drawing/2016/5/10/chartex" xmlns:cx5="http://schemas.microsoft.com/office/drawing/2016/5/11/chartex" xmlns:cx6="http://schemas.microsoft.com/office/drawing/2016/5/12/chartex" xmlns:cx7="http://schemas.microsoft.com/office/drawing/2016/5/13/chartex" xmlns:cx8="http://schemas.microsoft.com/office/drawing/2016/5/14/chartex" xmlns:mc="http://schemas.openxmlformats.org/markup-compatibility/2006" xmlns:aink="http://schemas.microsoft.com/office/drawing/2016/ink" xmlns:am3d="http://schemas.microsoft.com/office/drawing/2017/model3d" xmlns:o="urn:schemas-microsoft-com:office:office" xmlns:oel="http://schemas.microsoft.com/office/2019/extlst" xmlns:r="http://schemas.openxmlformats.org/officeDocument/2006/relationships" xmlns:m="http://schemas.openxmlformats.org/officeDocument/2006/math" xmlns:v="urn:schemas-microsoft-com:vml" xmlns:wp14="http://schemas.microsoft.com/office/word/2010/wordprocessingDrawing" xmlns:wp="http://schemas.openxmlformats.org/drawingml/2006/wordprocessingDrawing" xmlns:w10="urn:schemas-microsoft-com:office:word" xmlns:w="http://schemas.openxmlformats.org/wordprocessingml/2006/main" xmlns:w14="http://schemas.microsoft.com/office/word/2010/wordml" xmlns:w15="http://schemas.microsoft.com/office/word/2012/wordml" xmlns:w16cex="http://schemas.microsoft.com/office/word/2018/wordml/cex" xmlns:w16cid="http://schemas.microsoft.com/office/word/2016/wordml/cid" xmlns:w16="http://schemas.microsoft.com/office/word/2018/wordml" xmlns:w16du="http://schemas.microsoft.com/office/word/2023/wordml/word16du" xmlns:w16sdtdh="http://schemas.microsoft.com/office/word/2020/wordml/sdtdatahash" xmlns:w16sdtfl="http://schemas.microsoft.com/office/word/2024/wordml/sdtformatlock" xmlns:w16se="http://schemas.microsoft.com/office/word/2015/wordml/symex" xmlns:wpg="http://schemas.microsoft.com/office/word/2010/wordprocessingGroup" xmlns:wpi="http://schemas.microsoft.com/office/word/2010/wordprocessingInk" xmlns:wne="http://schemas.microsoft.com/office/word/2006/wordml" xmlns:wps="http://schemas.microsoft.com/office/word/2010/wordprocessingShape" mc:Ignorable="w14 w15 w16se w16cid w16 w16cex w16sdtdh w16sdtfl w16du wp14">
   <w:p>
     <w:pPr>
       <w:pStyle w:val="Kopfzeile"/>
@@ -33010,7 +31826,7 @@
 </file>
 
 <file path=word/header4.xml><?xml version="1.0" encoding="utf-8"?>
-<w:hdr xmlns:wpc="http://schemas.microsoft.com/office/word/2010/wordprocessingCanvas" xmlns:cx="http://schemas.microsoft.com/office/drawing/2014/chartex" xmlns:cx1="http://schemas.microsoft.com/office/drawing/2015/9/8/chartex" xmlns:cx2="http://schemas.microsoft.com/office/drawing/2015/10/21/chartex" xmlns:cx3="http://schemas.microsoft.com/office/drawing/2016/5/9/chartex" xmlns:cx4="http://schemas.microsoft.com/office/drawing/2016/5/10/chartex" xmlns:cx5="http://schemas.microsoft.com/office/drawing/2016/5/11/chartex" xmlns:cx6="http://schemas.microsoft.com/office/drawing/2016/5/12/chartex" xmlns:cx7="http://schemas.microsoft.com/office/drawing/2016/5/13/chartex" xmlns:cx8="http://schemas.microsoft.com/office/drawing/2016/5/14/chartex" xmlns:mc="http://schemas.openxmlformats.org/markup-compatibility/2006" xmlns:aink="http://schemas.microsoft.com/office/drawing/2016/ink" xmlns:am3d="http://schemas.microsoft.com/office/drawing/2017/model3d" xmlns:o="urn:schemas-microsoft-com:office:office" xmlns:r="http://schemas.openxmlformats.org/officeDocument/2006/relationships" xmlns:m="http://schemas.openxmlformats.org/officeDocument/2006/math" xmlns:v="urn:schemas-microsoft-com:vml" xmlns:wp14="http://schemas.microsoft.com/office/word/2010/wordprocessingDrawing" xmlns:wp="http://schemas.openxmlformats.org/drawingml/2006/wordprocessingDrawing" xmlns:w10="urn:schemas-microsoft-com:office:word" xmlns:w="http://schemas.openxmlformats.org/wordprocessingml/2006/main" xmlns:w14="http://schemas.microsoft.com/office/word/2010/wordml" xmlns:w15="http://schemas.microsoft.com/office/word/2012/wordml" xmlns:w16cex="http://schemas.microsoft.com/office/word/2018/wordml/cex" xmlns:w16cid="http://schemas.microsoft.com/office/word/2016/wordml/cid" xmlns:w16="http://schemas.microsoft.com/office/word/2018/wordml" xmlns:w16se="http://schemas.microsoft.com/office/word/2015/wordml/symex" xmlns:wpg="http://schemas.microsoft.com/office/word/2010/wordprocessingGroup" xmlns:wpi="http://schemas.microsoft.com/office/word/2010/wordprocessingInk" xmlns:wne="http://schemas.microsoft.com/office/word/2006/wordml" xmlns:wps="http://schemas.microsoft.com/office/word/2010/wordprocessingShape" mc:Ignorable="w14 w15 w16se w16cid w16 w16cex wp14">
+<w:hdr xmlns:wpc="http://schemas.microsoft.com/office/word/2010/wordprocessingCanvas" xmlns:cx="http://schemas.microsoft.com/office/drawing/2014/chartex" xmlns:cx1="http://schemas.microsoft.com/office/drawing/2015/9/8/chartex" xmlns:cx2="http://schemas.microsoft.com/office/drawing/2015/10/21/chartex" xmlns:cx3="http://schemas.microsoft.com/office/drawing/2016/5/9/chartex" xmlns:cx4="http://schemas.microsoft.com/office/drawing/2016/5/10/chartex" xmlns:cx5="http://schemas.microsoft.com/office/drawing/2016/5/11/chartex" xmlns:cx6="http://schemas.microsoft.com/office/drawing/2016/5/12/chartex" xmlns:cx7="http://schemas.microsoft.com/office/drawing/2016/5/13/chartex" xmlns:cx8="http://schemas.microsoft.com/office/drawing/2016/5/14/chartex" xmlns:mc="http://schemas.openxmlformats.org/markup-compatibility/2006" xmlns:aink="http://schemas.microsoft.com/office/drawing/2016/ink" xmlns:am3d="http://schemas.microsoft.com/office/drawing/2017/model3d" xmlns:o="urn:schemas-microsoft-com:office:office" xmlns:oel="http://schemas.microsoft.com/office/2019/extlst" xmlns:r="http://schemas.openxmlformats.org/officeDocument/2006/relationships" xmlns:m="http://schemas.openxmlformats.org/officeDocument/2006/math" xmlns:v="urn:schemas-microsoft-com:vml" xmlns:wp14="http://schemas.microsoft.com/office/word/2010/wordprocessingDrawing" xmlns:wp="http://schemas.openxmlformats.org/drawingml/2006/wordprocessingDrawing" xmlns:w10="urn:schemas-microsoft-com:office:word" xmlns:w="http://schemas.openxmlformats.org/wordprocessingml/2006/main" xmlns:w14="http://schemas.microsoft.com/office/word/2010/wordml" xmlns:w15="http://schemas.microsoft.com/office/word/2012/wordml" xmlns:w16cex="http://schemas.microsoft.com/office/word/2018/wordml/cex" xmlns:w16cid="http://schemas.microsoft.com/office/word/2016/wordml/cid" xmlns:w16="http://schemas.microsoft.com/office/word/2018/wordml" xmlns:w16du="http://schemas.microsoft.com/office/word/2023/wordml/word16du" xmlns:w16sdtdh="http://schemas.microsoft.com/office/word/2020/wordml/sdtdatahash" xmlns:w16sdtfl="http://schemas.microsoft.com/office/word/2024/wordml/sdtformatlock" xmlns:w16se="http://schemas.microsoft.com/office/word/2015/wordml/symex" xmlns:wpg="http://schemas.microsoft.com/office/word/2010/wordprocessingGroup" xmlns:wpi="http://schemas.microsoft.com/office/word/2010/wordprocessingInk" xmlns:wne="http://schemas.microsoft.com/office/word/2006/wordml" xmlns:wps="http://schemas.microsoft.com/office/word/2010/wordprocessingShape" mc:Ignorable="w14 w15 w16se w16cid w16 w16cex w16sdtdh w16sdtfl w16du wp14">
   <w:p>
     <w:pPr>
       <w:pStyle w:val="Kopfzeile"/>
@@ -33037,7 +31853,7 @@
 </file>
 
 <file path=word/numbering.xml><?xml version="1.0" encoding="utf-8"?>
-<w:numbering xmlns:wpc="http://schemas.microsoft.com/office/word/2010/wordprocessingCanvas" xmlns:cx="http://schemas.microsoft.com/office/drawing/2014/chartex" xmlns:cx1="http://schemas.microsoft.com/office/drawing/2015/9/8/chartex" xmlns:cx2="http://schemas.microsoft.com/office/drawing/2015/10/21/chartex" xmlns:cx3="http://schemas.microsoft.com/office/drawing/2016/5/9/chartex" xmlns:cx4="http://schemas.microsoft.com/office/drawing/2016/5/10/chartex" xmlns:cx5="http://schemas.microsoft.com/office/drawing/2016/5/11/chartex" xmlns:cx6="http://schemas.microsoft.com/office/drawing/2016/5/12/chartex" xmlns:cx7="http://schemas.microsoft.com/office/drawing/2016/5/13/chartex" xmlns:cx8="http://schemas.microsoft.com/office/drawing/2016/5/14/chartex" xmlns:mc="http://schemas.openxmlformats.org/markup-compatibility/2006" xmlns:aink="http://schemas.microsoft.com/office/drawing/2016/ink" xmlns:am3d="http://schemas.microsoft.com/office/drawing/2017/model3d" xmlns:o="urn:schemas-microsoft-com:office:office" xmlns:r="http://schemas.openxmlformats.org/officeDocument/2006/relationships" xmlns:m="http://schemas.openxmlformats.org/officeDocument/2006/math" xmlns:v="urn:schemas-microsoft-com:vml" xmlns:wp14="http://schemas.microsoft.com/office/word/2010/wordprocessingDrawing" xmlns:wp="http://schemas.openxmlformats.org/drawingml/2006/wordprocessingDrawing" xmlns:w10="urn:schemas-microsoft-com:office:word" xmlns:w="http://schemas.openxmlformats.org/wordprocessingml/2006/main" xmlns:w14="http://schemas.microsoft.com/office/word/2010/wordml" xmlns:w15="http://schemas.microsoft.com/office/word/2012/wordml" xmlns:w16cex="http://schemas.microsoft.com/office/word/2018/wordml/cex" xmlns:w16cid="http://schemas.microsoft.com/office/word/2016/wordml/cid" xmlns:w16="http://schemas.microsoft.com/office/word/2018/wordml" xmlns:w16se="http://schemas.microsoft.com/office/word/2015/wordml/symex" xmlns:wpg="http://schemas.microsoft.com/office/word/2010/wordprocessingGroup" xmlns:wpi="http://schemas.microsoft.com/office/word/2010/wordprocessingInk" xmlns:wne="http://schemas.microsoft.com/office/word/2006/wordml" xmlns:wps="http://schemas.microsoft.com/office/word/2010/wordprocessingShape" mc:Ignorable="w14 w15 w16se w16cid w16 w16cex wp14">
+<w:numbering xmlns:wpc="http://schemas.microsoft.com/office/word/2010/wordprocessingCanvas" xmlns:cx="http://schemas.microsoft.com/office/drawing/2014/chartex" xmlns:cx1="http://schemas.microsoft.com/office/drawing/2015/9/8/chartex" xmlns:cx2="http://schemas.microsoft.com/office/drawing/2015/10/21/chartex" xmlns:cx3="http://schemas.microsoft.com/office/drawing/2016/5/9/chartex" xmlns:cx4="http://schemas.microsoft.com/office/drawing/2016/5/10/chartex" xmlns:cx5="http://schemas.microsoft.com/office/drawing/2016/5/11/chartex" xmlns:cx6="http://schemas.microsoft.com/office/drawing/2016/5/12/chartex" xmlns:cx7="http://schemas.microsoft.com/office/drawing/2016/5/13/chartex" xmlns:cx8="http://schemas.microsoft.com/office/drawing/2016/5/14/chartex" xmlns:mc="http://schemas.openxmlformats.org/markup-compatibility/2006" xmlns:aink="http://schemas.microsoft.com/office/drawing/2016/ink" xmlns:am3d="http://schemas.microsoft.com/office/drawing/2017/model3d" xmlns:o="urn:schemas-microsoft-com:office:office" xmlns:oel="http://schemas.microsoft.com/office/2019/extlst" xmlns:r="http://schemas.openxmlformats.org/officeDocument/2006/relationships" xmlns:m="http://schemas.openxmlformats.org/officeDocument/2006/math" xmlns:v="urn:schemas-microsoft-com:vml" xmlns:wp14="http://schemas.microsoft.com/office/word/2010/wordprocessingDrawing" xmlns:wp="http://schemas.openxmlformats.org/drawingml/2006/wordprocessingDrawing" xmlns:w10="urn:schemas-microsoft-com:office:word" xmlns:w="http://schemas.openxmlformats.org/wordprocessingml/2006/main" xmlns:w14="http://schemas.microsoft.com/office/word/2010/wordml" xmlns:w15="http://schemas.microsoft.com/office/word/2012/wordml" xmlns:w16cex="http://schemas.microsoft.com/office/word/2018/wordml/cex" xmlns:w16cid="http://schemas.microsoft.com/office/word/2016/wordml/cid" xmlns:w16="http://schemas.microsoft.com/office/word/2018/wordml" xmlns:w16du="http://schemas.microsoft.com/office/word/2023/wordml/word16du" xmlns:w16sdtdh="http://schemas.microsoft.com/office/word/2020/wordml/sdtdatahash" xmlns:w16sdtfl="http://schemas.microsoft.com/office/word/2024/wordml/sdtformatlock" xmlns:w16se="http://schemas.microsoft.com/office/word/2015/wordml/symex" xmlns:wpg="http://schemas.microsoft.com/office/word/2010/wordprocessingGroup" xmlns:wpi="http://schemas.microsoft.com/office/word/2010/wordprocessingInk" xmlns:wne="http://schemas.microsoft.com/office/word/2006/wordml" xmlns:wps="http://schemas.microsoft.com/office/word/2010/wordprocessingShape" mc:Ignorable="w14 w15 w16se w16cid w16 w16cex w16sdtdh w16sdtfl w16du wp14">
   <w:numPicBullet w:numPicBulletId="0">
     <w:pict>
       <v:shapetype id="_x0000_t75" coordsize="21600,21600" o:spt="75" o:preferrelative="t" path="m@4@5l@4@11@9@11@9@5xe" filled="f" stroked="f">
@@ -33059,14 +31875,14 @@
         <v:path o:extrusionok="f" gradientshapeok="t" o:connecttype="rect"/>
         <o:lock v:ext="edit" aspectratio="t"/>
       </v:shapetype>
-      <v:shape id="_x0000_i1133" type="#_x0000_t75" style="width:900pt;height:900pt" o:bullet="t">
+      <v:shape id="_x0000_i1025" type="#_x0000_t75" style="width:900pt;height:900pt" o:bullet="t">
         <v:imagedata r:id="rId1" o:title="1200px-Square-white"/>
       </v:shape>
     </w:pict>
   </w:numPicBullet>
   <w:numPicBullet w:numPicBulletId="1">
     <w:pict>
-      <v:shape id="_x0000_i1134" type="#_x0000_t75" style="width:12.75pt;height:12.75pt;flip:x;visibility:visible;mso-wrap-style:square" o:bullet="t">
+      <v:shape id="_x0000_i1026" type="#_x0000_t75" style="width:12.75pt;height:12.75pt;flip:x;visibility:visible;mso-wrap-style:square" o:bullet="t">
         <v:imagedata r:id="rId2" o:title=""/>
       </v:shape>
     </w:pict>
@@ -34393,55 +33209,47 @@
       </w:rPr>
     </w:lvl>
   </w:abstractNum>
-  <w:num w:numId="1">
+  <w:num w:numId="1" w16cid:durableId="105783647">
     <w:abstractNumId w:val="4"/>
   </w:num>
-  <w:num w:numId="2">
+  <w:num w:numId="2" w16cid:durableId="1302031238">
     <w:abstractNumId w:val="0"/>
   </w:num>
-  <w:num w:numId="3">
+  <w:num w:numId="3" w16cid:durableId="375355392">
     <w:abstractNumId w:val="7"/>
   </w:num>
-  <w:num w:numId="4">
+  <w:num w:numId="4" w16cid:durableId="204804160">
     <w:abstractNumId w:val="9"/>
   </w:num>
-  <w:num w:numId="5">
+  <w:num w:numId="5" w16cid:durableId="2061049218">
     <w:abstractNumId w:val="2"/>
   </w:num>
-  <w:num w:numId="6">
+  <w:num w:numId="6" w16cid:durableId="1594974104">
     <w:abstractNumId w:val="11"/>
   </w:num>
-  <w:num w:numId="7">
+  <w:num w:numId="7" w16cid:durableId="92090466">
     <w:abstractNumId w:val="1"/>
   </w:num>
-  <w:num w:numId="8">
+  <w:num w:numId="8" w16cid:durableId="1597471987">
     <w:abstractNumId w:val="5"/>
   </w:num>
-  <w:num w:numId="9">
+  <w:num w:numId="9" w16cid:durableId="483081623">
     <w:abstractNumId w:val="10"/>
   </w:num>
-  <w:num w:numId="10">
+  <w:num w:numId="10" w16cid:durableId="724792639">
     <w:abstractNumId w:val="6"/>
   </w:num>
-  <w:num w:numId="11">
+  <w:num w:numId="11" w16cid:durableId="1596404245">
     <w:abstractNumId w:val="3"/>
   </w:num>
-  <w:num w:numId="12">
+  <w:num w:numId="12" w16cid:durableId="2146847466">
     <w:abstractNumId w:val="8"/>
   </w:num>
 </w:numbering>
 </file>
 
-<file path=word/people.xml><?xml version="1.0" encoding="utf-8"?>
-<w15:people xmlns:wpc="http://schemas.microsoft.com/office/word/2010/wordprocessingCanvas" xmlns:cx="http://schemas.microsoft.com/office/drawing/2014/chartex" xmlns:cx1="http://schemas.microsoft.com/office/drawing/2015/9/8/chartex" xmlns:cx2="http://schemas.microsoft.com/office/drawing/2015/10/21/chartex" xmlns:cx3="http://schemas.microsoft.com/office/drawing/2016/5/9/chartex" xmlns:cx4="http://schemas.microsoft.com/office/drawing/2016/5/10/chartex" xmlns:cx5="http://schemas.microsoft.com/office/drawing/2016/5/11/chartex" xmlns:cx6="http://schemas.microsoft.com/office/drawing/2016/5/12/chartex" xmlns:cx7="http://schemas.microsoft.com/office/drawing/2016/5/13/chartex" xmlns:cx8="http://schemas.microsoft.com/office/drawing/2016/5/14/chartex" xmlns:mc="http://schemas.openxmlformats.org/markup-compatibility/2006" xmlns:aink="http://schemas.microsoft.com/office/drawing/2016/ink" xmlns:am3d="http://schemas.microsoft.com/office/drawing/2017/model3d" xmlns:o="urn:schemas-microsoft-com:office:office" xmlns:r="http://schemas.openxmlformats.org/officeDocument/2006/relationships" xmlns:m="http://schemas.openxmlformats.org/officeDocument/2006/math" xmlns:v="urn:schemas-microsoft-com:vml" xmlns:wp14="http://schemas.microsoft.com/office/word/2010/wordprocessingDrawing" xmlns:wp="http://schemas.openxmlformats.org/drawingml/2006/wordprocessingDrawing" xmlns:w10="urn:schemas-microsoft-com:office:word" xmlns:w="http://schemas.openxmlformats.org/wordprocessingml/2006/main" xmlns:w14="http://schemas.microsoft.com/office/word/2010/wordml" xmlns:w15="http://schemas.microsoft.com/office/word/2012/wordml" xmlns:w16cex="http://schemas.microsoft.com/office/word/2018/wordml/cex" xmlns:w16cid="http://schemas.microsoft.com/office/word/2016/wordml/cid" xmlns:w16="http://schemas.microsoft.com/office/word/2018/wordml" xmlns:w16se="http://schemas.microsoft.com/office/word/2015/wordml/symex" xmlns:wpg="http://schemas.microsoft.com/office/word/2010/wordprocessingGroup" xmlns:wpi="http://schemas.microsoft.com/office/word/2010/wordprocessingInk" xmlns:wne="http://schemas.microsoft.com/office/word/2006/wordml" xmlns:wps="http://schemas.microsoft.com/office/word/2010/wordprocessingShape" mc:Ignorable="w14 w15 w16se w16cid w16 w16cex wp14">
-  <w15:person w15:author="Mathias Müller">
-    <w15:presenceInfo w15:providerId="Windows Live" w15:userId="c3252762e56bcee5"/>
-  </w15:person>
-</w15:people>
-</file>
-
 <file path=word/styles.xml><?xml version="1.0" encoding="utf-8"?>
-<w:styles xmlns:mc="http://schemas.openxmlformats.org/markup-compatibility/2006" xmlns:r="http://schemas.openxmlformats.org/officeDocument/2006/relationships" xmlns:w="http://schemas.openxmlformats.org/wordprocessingml/2006/main" xmlns:w14="http://schemas.microsoft.com/office/word/2010/wordml" xmlns:w15="http://schemas.microsoft.com/office/word/2012/wordml" xmlns:w16cex="http://schemas.microsoft.com/office/word/2018/wordml/cex" xmlns:w16cid="http://schemas.microsoft.com/office/word/2016/wordml/cid" xmlns:w16="http://schemas.microsoft.com/office/word/2018/wordml" xmlns:w16se="http://schemas.microsoft.com/office/word/2015/wordml/symex" mc:Ignorable="w14 w15 w16se w16cid w16 w16cex">
+<w:styles xmlns:mc="http://schemas.openxmlformats.org/markup-compatibility/2006" xmlns:r="http://schemas.openxmlformats.org/officeDocument/2006/relationships" xmlns:w="http://schemas.openxmlformats.org/wordprocessingml/2006/main" xmlns:w14="http://schemas.microsoft.com/office/word/2010/wordml" xmlns:w15="http://schemas.microsoft.com/office/word/2012/wordml" xmlns:w16cex="http://schemas.microsoft.com/office/word/2018/wordml/cex" xmlns:w16cid="http://schemas.microsoft.com/office/word/2016/wordml/cid" xmlns:w16="http://schemas.microsoft.com/office/word/2018/wordml" xmlns:w16du="http://schemas.microsoft.com/office/word/2023/wordml/word16du" xmlns:w16sdtdh="http://schemas.microsoft.com/office/word/2020/wordml/sdtdatahash" xmlns:w16sdtfl="http://schemas.microsoft.com/office/word/2024/wordml/sdtformatlock" xmlns:w16se="http://schemas.microsoft.com/office/word/2015/wordml/symex" mc:Ignorable="w14 w15 w16se w16cid w16 w16cex w16sdtdh w16sdtfl w16du">
   <w:docDefaults>
     <w:rPrDefault>
       <w:rPr>
@@ -35246,6 +34054,16 @@
       <w:szCs w:val="20"/>
     </w:rPr>
   </w:style>
+  <w:style w:type="paragraph" w:styleId="berarbeitung">
+    <w:name w:val="Revision"/>
+    <w:hidden/>
+    <w:uiPriority w:val="99"/>
+    <w:semiHidden/>
+    <w:rsid w:val="00233227"/>
+    <w:pPr>
+      <w:spacing w:after="0" w:line="240" w:lineRule="auto"/>
+    </w:pPr>
+  </w:style>
 </w:styles>
 </file>
 

</xml_diff>